<commit_message>
Files created:   - src/lib/jobForecasting.ts — Core forecasting engine with 3 EAC methods (budget, CPI-performance, trend) + weighted   blend, margin forecasting with erosion and confidence   - src/app/api/reports/margin-forecast/route.ts — Cross-job margin forecast API with portfolio-level summary   - src/app/dashboard/reports/margin-forecast/page.tsx — Margin forecast report page with sortable table, expandable   detail rows, portfolio totals
  Files modified:
  - src/app/api/jobs/[id]/financial-summary/route.ts — Integrated forecasting engine, added forecast section to response
   with full CTC and margin detail
  - src/app/dashboard/jobs/[id]/page.tsx — Added Forecast Detail table to Financial tab showing all 3 methods
  side-by-side with ETC, EAC, VAC, projected margin, confidence, and method used
  - src/app/dashboard/reports/page.tsx — Added "Margin Forecast" to reports index under Job Costing category
</commit_message>
<xml_diff>
--- a/3-7-26 Books Made Easy changes.docx
+++ b/3-7-26 Books Made Easy changes.docx
@@ -118,39 +118,7 @@
         <w:spacing w:after="0"/>
       </w:pPr>
       <w:r>
-        <w:t xml:space="preserve">  │ WIP Calculation Engine     │ DONE               │ Just built — reports/</w:t>
-      </w:r>
-      <w:proofErr w:type="spellStart"/>
-      <w:r>
-        <w:t>wip</w:t>
-      </w:r>
-      <w:proofErr w:type="spellEnd"/>
-      <w:r>
-        <w:t>/</w:t>
-      </w:r>
-      <w:proofErr w:type="spellStart"/>
-      <w:r>
-        <w:t>route.ts</w:t>
-      </w:r>
-      <w:proofErr w:type="spellEnd"/>
-      <w:r>
-        <w:t xml:space="preserve"> + reports/</w:t>
-      </w:r>
-      <w:proofErr w:type="spellStart"/>
-      <w:r>
-        <w:t>wip</w:t>
-      </w:r>
-      <w:proofErr w:type="spellEnd"/>
-      <w:r>
-        <w:t>/</w:t>
-      </w:r>
-      <w:proofErr w:type="spellStart"/>
-      <w:r>
-        <w:t>page.tsx</w:t>
-      </w:r>
-      <w:proofErr w:type="spellEnd"/>
-      <w:r>
-        <w:t xml:space="preserve">      │</w:t>
+        <w:t xml:space="preserve">  │ WIP Calculation Engine     │ DONE               │ Just built — reports/wip/route.ts + reports/wip/page.tsx      │</w:t>
       </w:r>
     </w:p>
     <w:p>
@@ -274,39 +242,15 @@
         <w:spacing w:after="0"/>
       </w:pPr>
       <w:r>
-        <w:t xml:space="preserve">  │ Cost Codes (</w:t>
-      </w:r>
-      <w:proofErr w:type="gramStart"/>
-      <w:r>
-        <w:t xml:space="preserve">CSI)   </w:t>
-      </w:r>
-      <w:proofErr w:type="gramEnd"/>
-      <w:r>
-        <w:t xml:space="preserve">        │ EXISTS in          │ </w:t>
-      </w:r>
-      <w:proofErr w:type="spellStart"/>
-      <w:r>
-        <w:t>cost_codes</w:t>
-      </w:r>
-      <w:proofErr w:type="spellEnd"/>
-      <w:r>
-        <w:t xml:space="preserve"> table, CRUD API, UI page                           │</w:t>
-      </w:r>
-    </w:p>
-    <w:p>
-      <w:pPr>
-        <w:spacing w:after="0"/>
-      </w:pPr>
-      <w:r>
-        <w:t xml:space="preserve">  │                            │ </w:t>
-      </w:r>
-      <w:proofErr w:type="spellStart"/>
-      <w:r>
-        <w:t>SiteSense</w:t>
-      </w:r>
-      <w:proofErr w:type="spellEnd"/>
-      <w:r>
-        <w:t xml:space="preserve">          │                                                               │</w:t>
+        <w:t xml:space="preserve">  │ Cost Codes (CSI)           │ EXISTS in          │ cost_codes table, CRUD API, UI page                           │</w:t>
+      </w:r>
+    </w:p>
+    <w:p>
+      <w:pPr>
+        <w:spacing w:after="0"/>
+      </w:pPr>
+      <w:r>
+        <w:t xml:space="preserve">  │                            │ SiteSense          │                                                               │</w:t>
       </w:r>
     </w:p>
     <w:p>
@@ -364,31 +308,15 @@
         <w:spacing w:after="0"/>
       </w:pPr>
       <w:r>
-        <w:t xml:space="preserve">  │ Schedule of Values (</w:t>
-      </w:r>
-      <w:proofErr w:type="gramStart"/>
-      <w:r>
-        <w:t xml:space="preserve">SOV)   </w:t>
-      </w:r>
-      <w:proofErr w:type="gramEnd"/>
-      <w:r>
-        <w:t>│ EXISTS in          │ Full CRUD with line items, % complete, balance to finish      │</w:t>
-      </w:r>
-    </w:p>
-    <w:p>
-      <w:pPr>
-        <w:spacing w:after="0"/>
-      </w:pPr>
-      <w:r>
-        <w:t xml:space="preserve">  │                            │ </w:t>
-      </w:r>
-      <w:proofErr w:type="spellStart"/>
-      <w:r>
-        <w:t>SiteSense</w:t>
-      </w:r>
-      <w:proofErr w:type="spellEnd"/>
-      <w:r>
-        <w:t xml:space="preserve">          │                                                               │</w:t>
+        <w:t xml:space="preserve">  │ Schedule of Values (SOV)   │ EXISTS in          │ Full CRUD with line items, % complete, balance to finish      │</w:t>
+      </w:r>
+    </w:p>
+    <w:p>
+      <w:pPr>
+        <w:spacing w:after="0"/>
+      </w:pPr>
+      <w:r>
+        <w:t xml:space="preserve">  │                            │ SiteSense          │                                                               │</w:t>
       </w:r>
     </w:p>
     <w:p>
@@ -446,47 +374,15 @@
         <w:spacing w:after="0"/>
       </w:pPr>
       <w:r>
-        <w:t xml:space="preserve">  │ Retainage Tracking         │ SCHEMA ONLY in     │ </w:t>
-      </w:r>
-      <w:proofErr w:type="spellStart"/>
-      <w:r>
-        <w:t>sov_line_</w:t>
-      </w:r>
-      <w:proofErr w:type="gramStart"/>
-      <w:r>
-        <w:t>items.retainage</w:t>
-      </w:r>
-      <w:proofErr w:type="gramEnd"/>
-      <w:r>
-        <w:t>_percent</w:t>
-      </w:r>
-      <w:proofErr w:type="spellEnd"/>
-      <w:r>
-        <w:t xml:space="preserve"> + </w:t>
-      </w:r>
-      <w:proofErr w:type="spellStart"/>
-      <w:r>
-        <w:t>retainage_held</w:t>
-      </w:r>
-      <w:proofErr w:type="spellEnd"/>
-      <w:r>
-        <w:t xml:space="preserve"> fields      │</w:t>
-      </w:r>
-    </w:p>
-    <w:p>
-      <w:pPr>
-        <w:spacing w:after="0"/>
-      </w:pPr>
-      <w:r>
-        <w:t xml:space="preserve">  │                            │ </w:t>
-      </w:r>
-      <w:proofErr w:type="spellStart"/>
-      <w:r>
-        <w:t>SiteSense</w:t>
-      </w:r>
-      <w:proofErr w:type="spellEnd"/>
-      <w:r>
-        <w:t xml:space="preserve">          │ exist, but no API/UI                                          │</w:t>
+        <w:t xml:space="preserve">  │ Retainage Tracking         │ SCHEMA ONLY in     │ sov_line_items.retainage_percent + retainage_held fields      │</w:t>
+      </w:r>
+    </w:p>
+    <w:p>
+      <w:pPr>
+        <w:spacing w:after="0"/>
+      </w:pPr>
+      <w:r>
+        <w:t xml:space="preserve">  │                            │ SiteSense          │ exist, but no API/UI                                          │</w:t>
       </w:r>
     </w:p>
     <w:p>
@@ -544,31 +440,15 @@
         <w:spacing w:after="0"/>
       </w:pPr>
       <w:r>
-        <w:t xml:space="preserve">  │ Change Orders              │ SCHEMA ONLY in     │ </w:t>
-      </w:r>
-      <w:proofErr w:type="spellStart"/>
-      <w:r>
-        <w:t>change_orders</w:t>
-      </w:r>
-      <w:proofErr w:type="spellEnd"/>
-      <w:r>
-        <w:t xml:space="preserve"> table exists, no API routes or pages            │</w:t>
-      </w:r>
-    </w:p>
-    <w:p>
-      <w:pPr>
-        <w:spacing w:after="0"/>
-      </w:pPr>
-      <w:r>
-        <w:t xml:space="preserve">  │                            │ </w:t>
-      </w:r>
-      <w:proofErr w:type="spellStart"/>
-      <w:r>
-        <w:t>SiteSense</w:t>
-      </w:r>
-      <w:proofErr w:type="spellEnd"/>
-      <w:r>
-        <w:t xml:space="preserve">          │                                                               │</w:t>
+        <w:t xml:space="preserve">  │ Change Orders              │ SCHEMA ONLY in     │ change_orders table exists, no API routes or pages            │</w:t>
+      </w:r>
+    </w:p>
+    <w:p>
+      <w:pPr>
+        <w:spacing w:after="0"/>
+      </w:pPr>
+      <w:r>
+        <w:t xml:space="preserve">  │                            │ SiteSense          │                                                               │</w:t>
       </w:r>
     </w:p>
     <w:p>
@@ -626,23 +506,7 @@
         <w:spacing w:after="0"/>
       </w:pPr>
       <w:r>
-        <w:t xml:space="preserve">  │ Burn Rate / Spending       │ PARTIAL            │ </w:t>
-      </w:r>
-      <w:proofErr w:type="spellStart"/>
-      <w:r>
-        <w:t>forecasting.ts</w:t>
-      </w:r>
-      <w:proofErr w:type="spellEnd"/>
-      <w:r>
-        <w:t xml:space="preserve"> + </w:t>
-      </w:r>
-      <w:proofErr w:type="spellStart"/>
-      <w:r>
-        <w:t>analytics.ts</w:t>
-      </w:r>
-      <w:proofErr w:type="spellEnd"/>
-      <w:r>
-        <w:t xml:space="preserve"> in Books Your Way — daily       │</w:t>
+        <w:t xml:space="preserve">  │ Burn Rate / Spending       │ PARTIAL            │ forecasting.ts + analytics.ts in Books Your Way — daily       │</w:t>
       </w:r>
     </w:p>
     <w:p>
@@ -708,15 +572,7 @@
         <w:spacing w:after="0"/>
       </w:pPr>
       <w:r>
-        <w:t xml:space="preserve">  │ Risk Alerts                │ PARTIAL            │ </w:t>
-      </w:r>
-      <w:proofErr w:type="spellStart"/>
-      <w:r>
-        <w:t>PredictiveAlerts.tsx</w:t>
-      </w:r>
-      <w:proofErr w:type="spellEnd"/>
-      <w:r>
-        <w:t xml:space="preserve"> — budget warnings, spending spikes       │</w:t>
+        <w:t xml:space="preserve">  │ Risk Alerts                │ PARTIAL            │ PredictiveAlerts.tsx — budget warnings, spending spikes       │</w:t>
       </w:r>
     </w:p>
     <w:p>
@@ -774,15 +630,7 @@
         <w:spacing w:after="0"/>
       </w:pPr>
       <w:r>
-        <w:t xml:space="preserve">  │ Budgets                    │ EXISTS (</w:t>
-      </w:r>
-      <w:proofErr w:type="gramStart"/>
-      <w:r>
-        <w:t xml:space="preserve">basic)   </w:t>
-      </w:r>
-      <w:proofErr w:type="gramEnd"/>
-      <w:r>
-        <w:t xml:space="preserve">  │ Category-based in both apps, but not per cost code            │</w:t>
+        <w:t xml:space="preserve">  │ Budgets                    │ EXISTS (basic)     │ Category-based in both apps, but not per cost code            │</w:t>
       </w:r>
     </w:p>
     <w:p>
@@ -840,15 +688,7 @@
         <w:spacing w:after="0"/>
       </w:pPr>
       <w:r>
-        <w:t xml:space="preserve">  │ Retainage Engine (</w:t>
-      </w:r>
-      <w:proofErr w:type="gramStart"/>
-      <w:r>
-        <w:t xml:space="preserve">full)   </w:t>
-      </w:r>
-      <w:proofErr w:type="gramEnd"/>
-      <w:r>
-        <w:t xml:space="preserve"> │ NEEDS BUILD        │ Per-invoice retainage %, withheld/released, AR/AP aging       │</w:t>
+        <w:t xml:space="preserve">  │ Retainage Engine (full)    │ NEEDS BUILD        │ Per-invoice retainage %, withheld/released, AR/AP aging       │</w:t>
       </w:r>
     </w:p>
     <w:p>
@@ -973,15 +813,7 @@
         <w:spacing w:after="0"/>
       </w:pPr>
       <w:r>
-        <w:t xml:space="preserve">  │ Cost Code Variance </w:t>
-      </w:r>
-      <w:proofErr w:type="gramStart"/>
-      <w:r>
-        <w:t>Engine  │</w:t>
-      </w:r>
-      <w:proofErr w:type="gramEnd"/>
-      <w:r>
-        <w:t xml:space="preserve"> NEEDS BUILD        │ Budget vs actual vs variance per cost code, trend direction   │</w:t>
+        <w:t xml:space="preserve">  │ Cost Code Variance Engine  │ NEEDS BUILD        │ Budget vs actual vs variance per cost code, trend direction   │</w:t>
       </w:r>
     </w:p>
     <w:p>
@@ -1105,15 +937,7 @@
         <w:spacing w:after="0"/>
       </w:pPr>
       <w:r>
-        <w:t xml:space="preserve">  │ Project Financial </w:t>
-      </w:r>
-      <w:proofErr w:type="gramStart"/>
-      <w:r>
-        <w:t>Summary  │</w:t>
-      </w:r>
-      <w:proofErr w:type="gramEnd"/>
-      <w:r>
-        <w:t xml:space="preserve"> NEEDS BUILD        │ Consolidated financial view per project                       │</w:t>
+        <w:t xml:space="preserve">  │ Project Financial Summary  │ NEEDS BUILD        │ Consolidated financial view per project                       │</w:t>
       </w:r>
     </w:p>
     <w:p>
@@ -1237,15 +1061,7 @@
         <w:spacing w:after="0"/>
       </w:pPr>
       <w:r>
-        <w:t xml:space="preserve">  │ Margin Forecasting </w:t>
-      </w:r>
-      <w:proofErr w:type="gramStart"/>
-      <w:r>
-        <w:t>Engine  │</w:t>
-      </w:r>
-      <w:proofErr w:type="gramEnd"/>
-      <w:r>
-        <w:t xml:space="preserve"> NEEDS BUILD        │ Projected margin based on cost trends                         │</w:t>
+        <w:t xml:space="preserve">  │ Margin Forecasting Engine  │ NEEDS BUILD        │ Projected margin based on cost trends                         │</w:t>
       </w:r>
     </w:p>
     <w:p>
@@ -1311,36 +1127,20 @@
         <w:spacing w:after="0"/>
       </w:pPr>
       <w:r>
-        <w:t xml:space="preserve">  Follow your phased approach, but adjust </w:t>
-      </w:r>
-      <w:proofErr w:type="gramStart"/>
-      <w:r>
-        <w:t>for</w:t>
-      </w:r>
-      <w:proofErr w:type="gramEnd"/>
-      <w:r>
-        <w:t xml:space="preserve"> what exists:</w:t>
-      </w:r>
-    </w:p>
-    <w:p>
-      <w:pPr>
-        <w:spacing w:after="0"/>
-      </w:pPr>
-    </w:p>
-    <w:p>
-      <w:pPr>
-        <w:spacing w:after="0"/>
-      </w:pPr>
-      <w:r>
-        <w:t xml:space="preserve">  Phase 1 (Critical </w:t>
-      </w:r>
-      <w:proofErr w:type="gramStart"/>
-      <w:r>
-        <w:t>Foundation) —</w:t>
-      </w:r>
-      <w:proofErr w:type="gramEnd"/>
-      <w:r>
-        <w:t xml:space="preserve"> Build in Books Your Way:</w:t>
+        <w:t xml:space="preserve">  Follow your phased approach, but adjust for what exists:</w:t>
+      </w:r>
+    </w:p>
+    <w:p>
+      <w:pPr>
+        <w:spacing w:after="0"/>
+      </w:pPr>
+    </w:p>
+    <w:p>
+      <w:pPr>
+        <w:spacing w:after="0"/>
+      </w:pPr>
+      <w:r>
+        <w:t xml:space="preserve">  Phase 1 (Critical Foundation) — Build in Books Your Way:</w:t>
       </w:r>
     </w:p>
     <w:p>
@@ -1364,15 +1164,7 @@
         <w:spacing w:after="0"/>
       </w:pPr>
       <w:r>
-        <w:t xml:space="preserve">  2. Cost Code Variance Engine — Leverage </w:t>
-      </w:r>
-      <w:proofErr w:type="spellStart"/>
-      <w:r>
-        <w:t>SiteSense's</w:t>
-      </w:r>
-      <w:proofErr w:type="spellEnd"/>
-      <w:r>
-        <w:t xml:space="preserve"> existing CSI cost codes, add budget-vs-actual tracking with</w:t>
+        <w:t xml:space="preserve">  2. Cost Code Variance Engine — Leverage SiteSense's existing CSI cost codes, add budget-vs-actual tracking with</w:t>
       </w:r>
     </w:p>
     <w:p>
@@ -1409,39 +1201,15 @@
         <w:spacing w:after="0"/>
       </w:pPr>
       <w:r>
-        <w:t xml:space="preserve">  Phase 2 (Construction-</w:t>
-      </w:r>
-      <w:proofErr w:type="gramStart"/>
-      <w:r>
-        <w:t>Grade) —</w:t>
-      </w:r>
-      <w:proofErr w:type="gramEnd"/>
-      <w:r>
-        <w:t xml:space="preserve"> WIP is done, so focus on:</w:t>
-      </w:r>
-    </w:p>
-    <w:p>
-      <w:pPr>
-        <w:spacing w:after="0"/>
-      </w:pPr>
-      <w:r>
-        <w:t xml:space="preserve">  1. Retainage Engine — Build the </w:t>
-      </w:r>
-      <w:proofErr w:type="gramStart"/>
-      <w:r>
-        <w:t>full lifecycle</w:t>
-      </w:r>
-      <w:proofErr w:type="gramEnd"/>
-      <w:r>
-        <w:t xml:space="preserve"> (</w:t>
-      </w:r>
-      <w:proofErr w:type="spellStart"/>
-      <w:r>
-        <w:t>SiteSense</w:t>
-      </w:r>
-      <w:proofErr w:type="spellEnd"/>
-      <w:r>
-        <w:t xml:space="preserve"> already has the schema fields, need API + UI + aging reports</w:t>
+        <w:t xml:space="preserve">  Phase 2 (Construction-Grade) — WIP is done, so focus on:</w:t>
+      </w:r>
+    </w:p>
+    <w:p>
+      <w:pPr>
+        <w:spacing w:after="0"/>
+      </w:pPr>
+      <w:r>
+        <w:t xml:space="preserve">  1. Retainage Engine — Build the full lifecycle (SiteSense already has the schema fields, need API + UI + aging reports</w:t>
       </w:r>
     </w:p>
     <w:p>
@@ -1458,39 +1226,15 @@
       </w:pPr>
       <w:r>
         <w:lastRenderedPageBreak/>
-        <w:t xml:space="preserve">  2. Change Order Financial Impact — Build API routes for </w:t>
-      </w:r>
-      <w:proofErr w:type="spellStart"/>
-      <w:r>
-        <w:t>SiteSense's</w:t>
-      </w:r>
-      <w:proofErr w:type="spellEnd"/>
-      <w:r>
-        <w:t xml:space="preserve"> existing </w:t>
-      </w:r>
-      <w:proofErr w:type="spellStart"/>
-      <w:r>
-        <w:t>change_orders</w:t>
-      </w:r>
-      <w:proofErr w:type="spellEnd"/>
-      <w:r>
-        <w:t xml:space="preserve"> table, then model the</w:t>
-      </w:r>
-    </w:p>
-    <w:p>
-      <w:pPr>
-        <w:spacing w:after="0"/>
-      </w:pPr>
-      <w:r>
-        <w:t xml:space="preserve">  financial impact </w:t>
-      </w:r>
-      <w:proofErr w:type="gramStart"/>
-      <w:r>
-        <w:t>in</w:t>
-      </w:r>
-      <w:proofErr w:type="gramEnd"/>
-      <w:r>
-        <w:t xml:space="preserve"> Books Your Way</w:t>
+        <w:t xml:space="preserve">  2. Change Order Financial Impact — Build API routes for SiteSense's existing change_orders table, then model the</w:t>
+      </w:r>
+    </w:p>
+    <w:p>
+      <w:pPr>
+        <w:spacing w:after="0"/>
+      </w:pPr>
+      <w:r>
+        <w:t xml:space="preserve">  financial impact in Books Your Way</w:t>
       </w:r>
     </w:p>
     <w:p>
@@ -1519,31 +1263,15 @@
         <w:spacing w:after="0"/>
       </w:pPr>
       <w:r>
-        <w:t xml:space="preserve">  2. Burn Rate Modeling — Extend your existing </w:t>
-      </w:r>
-      <w:proofErr w:type="spellStart"/>
-      <w:r>
-        <w:t>forecasting.ts</w:t>
-      </w:r>
-      <w:proofErr w:type="spellEnd"/>
-      <w:r>
-        <w:t xml:space="preserve"> to per-project level</w:t>
-      </w:r>
-    </w:p>
-    <w:p>
-      <w:pPr>
-        <w:spacing w:after="0"/>
-      </w:pPr>
-      <w:r>
-        <w:t xml:space="preserve">  3. Risk Alerts — Extend existing </w:t>
-      </w:r>
-      <w:proofErr w:type="spellStart"/>
-      <w:r>
-        <w:t>PredictiveAlerts.tsx</w:t>
-      </w:r>
-      <w:proofErr w:type="spellEnd"/>
-      <w:r>
-        <w:t xml:space="preserve"> with construction-specific triggers (retainage thresholds, CO</w:t>
+        <w:t xml:space="preserve">  2. Burn Rate Modeling — Extend your existing forecasting.ts to per-project level</w:t>
+      </w:r>
+    </w:p>
+    <w:p>
+      <w:pPr>
+        <w:spacing w:after="0"/>
+      </w:pPr>
+      <w:r>
+        <w:t xml:space="preserve">  3. Risk Alerts — Extend existing PredictiveAlerts.tsx with construction-specific triggers (retainage thresholds, CO</w:t>
       </w:r>
     </w:p>
     <w:p>
@@ -1577,31 +1305,15 @@
         <w:spacing w:after="0"/>
       </w:pPr>
       <w:r>
-        <w:t xml:space="preserve">  Since </w:t>
-      </w:r>
-      <w:proofErr w:type="spellStart"/>
-      <w:r>
-        <w:t>SiteSense</w:t>
-      </w:r>
-      <w:proofErr w:type="spellEnd"/>
-      <w:r>
-        <w:t xml:space="preserve"> already has cost codes, SOV, change orders, and retainage schema — the smart play is to build the</w:t>
-      </w:r>
-    </w:p>
-    <w:p>
-      <w:pPr>
-        <w:spacing w:after="0"/>
-      </w:pPr>
-      <w:r>
-        <w:t xml:space="preserve">  financial calculation engines in Books Your Way while keeping the operational data in </w:t>
-      </w:r>
-      <w:proofErr w:type="spellStart"/>
-      <w:r>
-        <w:t>SiteSense</w:t>
-      </w:r>
-      <w:proofErr w:type="spellEnd"/>
-      <w:r>
-        <w:t>. The sync layer</w:t>
+        <w:t xml:space="preserve">  Since SiteSense already has cost codes, SOV, change orders, and retainage schema — the smart play is to build the</w:t>
+      </w:r>
+    </w:p>
+    <w:p>
+      <w:pPr>
+        <w:spacing w:after="0"/>
+      </w:pPr>
+      <w:r>
+        <w:t xml:space="preserve">  financial calculation engines in Books Your Way while keeping the operational data in SiteSense. The sync layer</w:t>
       </w:r>
     </w:p>
     <w:p>
@@ -1671,48 +1383,20 @@
         <w:t>, added d</w:t>
       </w:r>
       <w:r>
-        <w:t xml:space="preserve">isplays: risk alerts, summary cards, billing position panel, cost breakdown, profitability </w:t>
-      </w:r>
-      <w:proofErr w:type="spellStart"/>
-      <w:proofErr w:type="gramStart"/>
-      <w:r>
-        <w:t>analysis,burn</w:t>
-      </w:r>
-      <w:proofErr w:type="spellEnd"/>
-      <w:proofErr w:type="gramEnd"/>
-      <w:r>
-        <w:t xml:space="preserve"> </w:t>
-      </w:r>
-      <w:proofErr w:type="spellStart"/>
-      <w:proofErr w:type="gramStart"/>
-      <w:r>
-        <w:t>rate,completion</w:t>
-      </w:r>
-      <w:proofErr w:type="spellEnd"/>
-      <w:proofErr w:type="gramEnd"/>
-      <w:r>
-        <w:t xml:space="preserve"> progress bars</w:t>
-      </w:r>
-    </w:p>
-    <w:p>
-      <w:pPr>
-        <w:spacing w:after="0"/>
-      </w:pPr>
-    </w:p>
-    <w:p>
-      <w:pPr>
-        <w:spacing w:after="0"/>
-      </w:pPr>
-      <w:r>
-        <w:t xml:space="preserve">That's a pre-existing WSL2 file permission issue </w:t>
-      </w:r>
-      <w:proofErr w:type="gramStart"/>
-      <w:r>
-        <w:t>with .next</w:t>
-      </w:r>
-      <w:proofErr w:type="gramEnd"/>
-      <w:r>
-        <w:t xml:space="preserve"> cache, not related to our code. The important part is</w:t>
+        <w:t>isplays: risk alerts, summary cards, billing position panel, cost breakdown, profitability analysis,burn rate,completion progress bars</w:t>
+      </w:r>
+    </w:p>
+    <w:p>
+      <w:pPr>
+        <w:spacing w:after="0"/>
+      </w:pPr>
+    </w:p>
+    <w:p>
+      <w:pPr>
+        <w:spacing w:after="0"/>
+      </w:pPr>
+      <w:r>
+        <w:t>That's a pre-existing WSL2 file permission issue with .next cache, not related to our code. The important part is</w:t>
       </w:r>
     </w:p>
     <w:p>
@@ -1757,68 +1441,28 @@
         <w:spacing w:after="0"/>
       </w:pPr>
       <w:r>
-        <w:t xml:space="preserve">  Database Migration (</w:t>
-      </w:r>
-      <w:proofErr w:type="spellStart"/>
-      <w:r>
-        <w:t>turso</w:t>
-      </w:r>
-      <w:proofErr w:type="spellEnd"/>
-      <w:r>
-        <w:t>/migrations/004_cost_codes.sql)</w:t>
-      </w:r>
-    </w:p>
-    <w:p>
-      <w:pPr>
-        <w:spacing w:after="0"/>
-      </w:pPr>
-    </w:p>
-    <w:p>
-      <w:pPr>
-        <w:spacing w:after="0"/>
-      </w:pPr>
-      <w:r>
-        <w:t xml:space="preserve">  - </w:t>
-      </w:r>
-      <w:proofErr w:type="spellStart"/>
-      <w:r>
-        <w:t>cost_codes</w:t>
-      </w:r>
-      <w:proofErr w:type="spellEnd"/>
-      <w:r>
-        <w:t xml:space="preserve"> table — CSI </w:t>
-      </w:r>
-      <w:proofErr w:type="spellStart"/>
-      <w:r>
-        <w:t>MasterFormat</w:t>
-      </w:r>
-      <w:proofErr w:type="spellEnd"/>
-      <w:r>
-        <w:t xml:space="preserve"> compatible, supports default divisions + custom user codes</w:t>
-      </w:r>
-    </w:p>
-    <w:p>
-      <w:pPr>
-        <w:spacing w:after="0"/>
-      </w:pPr>
-      <w:r>
-        <w:t xml:space="preserve">  - </w:t>
-      </w:r>
-      <w:proofErr w:type="spellStart"/>
-      <w:r>
-        <w:t>cost_code_budgets</w:t>
-      </w:r>
-      <w:proofErr w:type="spellEnd"/>
-      <w:r>
-        <w:t xml:space="preserve"> table — per-job, per-cost-code budget assignments (unique constraint on </w:t>
-      </w:r>
-      <w:proofErr w:type="spellStart"/>
-      <w:r>
-        <w:t>job+code</w:t>
-      </w:r>
-      <w:proofErr w:type="spellEnd"/>
-      <w:r>
-        <w:t>)</w:t>
+        <w:t xml:space="preserve">  Database Migration (turso/migrations/004_cost_codes.sql)</w:t>
+      </w:r>
+    </w:p>
+    <w:p>
+      <w:pPr>
+        <w:spacing w:after="0"/>
+      </w:pPr>
+    </w:p>
+    <w:p>
+      <w:pPr>
+        <w:spacing w:after="0"/>
+      </w:pPr>
+      <w:r>
+        <w:t xml:space="preserve">  - cost_codes table — CSI MasterFormat compatible, supports default divisions + custom user codes</w:t>
+      </w:r>
+    </w:p>
+    <w:p>
+      <w:pPr>
+        <w:spacing w:after="0"/>
+      </w:pPr>
+      <w:r>
+        <w:t xml:space="preserve">  - cost_code_budgets table — per-job, per-cost-code budget assignments (unique constraint on job+code)</w:t>
       </w:r>
     </w:p>
     <w:p>
@@ -1827,23 +1471,7 @@
       </w:pPr>
       <w:r>
         <w:lastRenderedPageBreak/>
-        <w:t xml:space="preserve">  - Added </w:t>
-      </w:r>
-      <w:proofErr w:type="spellStart"/>
-      <w:r>
-        <w:t>cost_code_id</w:t>
-      </w:r>
-      <w:proofErr w:type="spellEnd"/>
-      <w:r>
-        <w:t xml:space="preserve"> column to bills, </w:t>
-      </w:r>
-      <w:proofErr w:type="spellStart"/>
-      <w:r>
-        <w:t>bill_items</w:t>
-      </w:r>
-      <w:proofErr w:type="spellEnd"/>
-      <w:r>
-        <w:t>, and expenses so costs can be tagged with cost codes</w:t>
+        <w:t xml:space="preserve">  - Added cost_code_id column to bills, bill_items, and expenses so costs can be tagged with cost codes</w:t>
       </w:r>
     </w:p>
     <w:p>
@@ -1869,23 +1497,7 @@
         <w:spacing w:after="0"/>
       </w:pPr>
       <w:r>
-        <w:t xml:space="preserve">  1. /</w:t>
-      </w:r>
-      <w:proofErr w:type="spellStart"/>
-      <w:r>
-        <w:t>api</w:t>
-      </w:r>
-      <w:proofErr w:type="spellEnd"/>
-      <w:r>
-        <w:t xml:space="preserve">/cost-codes (CRUD + seed) — Full cost code management with 23 CSI </w:t>
-      </w:r>
-      <w:proofErr w:type="spellStart"/>
-      <w:r>
-        <w:t>MasterFormat</w:t>
-      </w:r>
-      <w:proofErr w:type="spellEnd"/>
-      <w:r>
-        <w:t xml:space="preserve"> divisions built in. Supports</w:t>
+        <w:t xml:space="preserve">  1. /api/cost-codes (CRUD + seed) — Full cost code management with 23 CSI MasterFormat divisions built in. Supports</w:t>
       </w:r>
     </w:p>
     <w:p>
@@ -1901,31 +1513,7 @@
         <w:spacing w:after="0"/>
       </w:pPr>
       <w:r>
-        <w:t xml:space="preserve">  2. /</w:t>
-      </w:r>
-      <w:proofErr w:type="spellStart"/>
-      <w:r>
-        <w:t>api</w:t>
-      </w:r>
-      <w:proofErr w:type="spellEnd"/>
-      <w:r>
-        <w:t>/cost-codes/budgets (</w:t>
-      </w:r>
-      <w:proofErr w:type="gramStart"/>
-      <w:r>
-        <w:t>CRUD) —</w:t>
-      </w:r>
-      <w:proofErr w:type="gramEnd"/>
-      <w:r>
-        <w:t xml:space="preserve"> Assign and manage budgets per cost code per job. Supports </w:t>
-      </w:r>
-      <w:proofErr w:type="spellStart"/>
-      <w:r>
-        <w:t>upsert</w:t>
-      </w:r>
-      <w:proofErr w:type="spellEnd"/>
-      <w:r>
-        <w:t xml:space="preserve"> (update if</w:t>
+        <w:t xml:space="preserve">  2. /api/cost-codes/budgets (CRUD) — Assign and manage budgets per cost code per job. Supports upsert (update if</w:t>
       </w:r>
     </w:p>
     <w:p>
@@ -1941,15 +1529,7 @@
         <w:spacing w:after="0"/>
       </w:pPr>
       <w:r>
-        <w:t xml:space="preserve">  3. /</w:t>
-      </w:r>
-      <w:proofErr w:type="spellStart"/>
-      <w:r>
-        <w:t>api</w:t>
-      </w:r>
-      <w:proofErr w:type="spellEnd"/>
-      <w:r>
-        <w:t>/reports/cost-code-variance — The variance engine:</w:t>
+        <w:t xml:space="preserve">  3. /api/reports/cost-code-variance — The variance engine:</w:t>
       </w:r>
     </w:p>
     <w:p>
@@ -1981,15 +1561,7 @@
         <w:spacing w:after="0"/>
       </w:pPr>
       <w:r>
-        <w:t xml:space="preserve">    - Trend: under (&lt;50%), </w:t>
-      </w:r>
-      <w:proofErr w:type="spellStart"/>
-      <w:r>
-        <w:t>on_track</w:t>
-      </w:r>
-      <w:proofErr w:type="spellEnd"/>
-      <w:r>
-        <w:t xml:space="preserve"> (50-90%), over (90%+), critical (exceeded)</w:t>
+        <w:t xml:space="preserve">    - Trend: under (&lt;50%), on_track (50-90%), over (90%+), critical (exceeded)</w:t>
       </w:r>
     </w:p>
     <w:p>
@@ -2018,15 +1590,7 @@
         <w:spacing w:after="0"/>
       </w:pPr>
       <w:r>
-        <w:t xml:space="preserve">  Report Page (/dashboard/reports/</w:t>
-      </w:r>
-      <w:proofErr w:type="gramStart"/>
-      <w:r>
-        <w:t>cost</w:t>
-      </w:r>
-      <w:proofErr w:type="gramEnd"/>
-      <w:r>
-        <w:t>-code-variance)</w:t>
+        <w:t xml:space="preserve">  Report Page (/dashboard/reports/cost-code-variance)</w:t>
       </w:r>
     </w:p>
     <w:p>
@@ -2110,15 +1674,7 @@
         <w:spacing w:after="0"/>
       </w:pPr>
       <w:r>
-        <w:t xml:space="preserve">  This is ready for your </w:t>
-      </w:r>
-      <w:proofErr w:type="gramStart"/>
-      <w:r>
-        <w:t>commit</w:t>
-      </w:r>
-      <w:proofErr w:type="gramEnd"/>
-      <w:r>
-        <w:t>. Want me to move on to Phase 1.3: Cost-to-Complete Logic next?</w:t>
+        <w:t xml:space="preserve">  This is ready for your commit. Want me to move on to Phase 1.3: Cost-to-Complete Logic next?</w:t>
       </w:r>
     </w:p>
     <w:p>
@@ -2167,55 +1723,51 @@
         <w:spacing w:after="0"/>
       </w:pPr>
       <w:r>
-        <w:t xml:space="preserve">● Builds confirmed clean. Ready for your </w:t>
-      </w:r>
-      <w:proofErr w:type="gramStart"/>
-      <w:r>
-        <w:t>commit</w:t>
-      </w:r>
-      <w:proofErr w:type="gramEnd"/>
+        <w:t>● Builds confirmed clean. Ready for your commit on the Cost Code Variance Engine.</w:t>
+      </w:r>
+    </w:p>
+    <w:p>
+      <w:pPr>
+        <w:spacing w:after="0"/>
+      </w:pPr>
+    </w:p>
+    <w:p>
+      <w:pPr>
+        <w:spacing w:after="0"/>
+      </w:pPr>
+      <w:r>
+        <w:t xml:space="preserve">  Shall I proceed with Phase 1.3: Cost-to-Complete Logic and Phase 1.4: Margin Forecasting Engine? Since they're closely   related and both feed into the existing Project Financial Summary, I can build them together efficiently.</w:t>
+      </w:r>
+    </w:p>
+    <w:p>
+      <w:pPr>
+        <w:spacing w:after="0"/>
+      </w:pPr>
+    </w:p>
+    <w:p>
+      <w:pPr>
+        <w:spacing w:after="0"/>
+      </w:pPr>
+      <w:r>
+        <w:t>Mainf4715b8:</w:t>
+      </w:r>
+      <w:r>
+        <w:t>Phase 1.2:</w:t>
+      </w:r>
+      <w:r>
+        <w:t xml:space="preserve"> C</w:t>
+      </w:r>
+      <w:r>
+        <w:t>ost Code Variance Engine</w:t>
+      </w:r>
+      <w:r>
+        <w:t>,</w:t>
+      </w:r>
       <w:r>
         <w:t xml:space="preserve"> </w:t>
       </w:r>
-      <w:proofErr w:type="gramStart"/>
-      <w:r>
-        <w:t>on</w:t>
-      </w:r>
-      <w:proofErr w:type="gramEnd"/>
-      <w:r>
-        <w:t xml:space="preserve"> the Cost Code Variance Engine.</w:t>
-      </w:r>
-    </w:p>
-    <w:p>
-      <w:pPr>
-        <w:spacing w:after="0"/>
-      </w:pPr>
-    </w:p>
-    <w:p>
-      <w:pPr>
-        <w:spacing w:after="0"/>
-      </w:pPr>
-      <w:r>
-        <w:t xml:space="preserve">  Shall I proceed with Phase 1.3: Cost-to-Complete Logic and Phase 1.4: Margin Forecasting Engine? Since they're closely   related and both feed into the existing Project Financial Summary, I can build them together efficiently.</w:t>
-      </w:r>
-    </w:p>
-    <w:p>
-      <w:pPr>
-        <w:spacing w:after="0"/>
-      </w:pPr>
-    </w:p>
-    <w:p>
-      <w:pPr>
-        <w:spacing w:after="0"/>
-      </w:pPr>
-      <w:r>
-        <w:t>Phase 1.2:</w:t>
-      </w:r>
-      <w:r>
-        <w:t xml:space="preserve"> C</w:t>
-      </w:r>
-      <w:r>
-        <w:t>ost Code Variance Engine</w:t>
+      <w:r>
+        <w:t>Full cost code management</w:t>
       </w:r>
       <w:r>
         <w:t>,</w:t>
@@ -2224,7 +1776,7 @@
         <w:t xml:space="preserve"> </w:t>
       </w:r>
       <w:r>
-        <w:t>Full cost code management</w:t>
+        <w:t>Assign and manage budgets per cost code per job</w:t>
       </w:r>
       <w:r>
         <w:t>,</w:t>
@@ -2233,16 +1785,33 @@
         <w:t xml:space="preserve"> </w:t>
       </w:r>
       <w:r>
-        <w:t>Assign and manage budgets per cost code per job</w:t>
-      </w:r>
-      <w:r>
-        <w:t>,</w:t>
-      </w:r>
-      <w:r>
-        <w:t xml:space="preserve"> </w:t>
-      </w:r>
-      <w:r>
         <w:t>Job filter dropdown</w:t>
+      </w:r>
+    </w:p>
+    <w:p>
+      <w:pPr>
+        <w:spacing w:after="0"/>
+      </w:pPr>
+    </w:p>
+    <w:p>
+      <w:pPr>
+        <w:spacing w:after="0"/>
+      </w:pPr>
+      <w:r>
+        <w:t>update the Financial tab on the job detail page to show the full forecast detail</w:t>
+      </w:r>
+    </w:p>
+    <w:p>
+      <w:pPr>
+        <w:spacing w:after="0"/>
+      </w:pPr>
+    </w:p>
+    <w:p>
+      <w:pPr>
+        <w:spacing w:after="0"/>
+      </w:pPr>
+      <w:r>
+        <w:t>update the Financial tab on the job detail page to show the full forecast detail</w:t>
       </w:r>
     </w:p>
     <w:sectPr>

</xml_diff>

<commit_message>
Sidebar Dropdowns – Complete, 4.1 Database Schema (turso/migrations/006_multi_entity.sql), 4.2 API Routes, 4.3 User Roles, 4.4 Entity Switcher UI,   4.5 Management Pages, 4.6 Infrastructure, 6 collapsible categories with chevron animation - Auto-expands category matching current route   - Dashboard pinned at top, Entities + Settings pinned at bottom
</commit_message>
<xml_diff>
--- a/3-7-26 Books Made Easy changes.docx
+++ b/3-7-26 Books Made Easy changes.docx
@@ -118,39 +118,7 @@
         <w:spacing w:after="0"/>
       </w:pPr>
       <w:r>
-        <w:t xml:space="preserve">  │ WIP Calculation Engine     │ DONE               │ Just built — reports/</w:t>
-      </w:r>
-      <w:proofErr w:type="spellStart"/>
-      <w:r>
-        <w:t>wip</w:t>
-      </w:r>
-      <w:proofErr w:type="spellEnd"/>
-      <w:r>
-        <w:t>/</w:t>
-      </w:r>
-      <w:proofErr w:type="spellStart"/>
-      <w:r>
-        <w:t>route.ts</w:t>
-      </w:r>
-      <w:proofErr w:type="spellEnd"/>
-      <w:r>
-        <w:t xml:space="preserve"> + reports/</w:t>
-      </w:r>
-      <w:proofErr w:type="spellStart"/>
-      <w:r>
-        <w:t>wip</w:t>
-      </w:r>
-      <w:proofErr w:type="spellEnd"/>
-      <w:r>
-        <w:t>/</w:t>
-      </w:r>
-      <w:proofErr w:type="spellStart"/>
-      <w:r>
-        <w:t>page.tsx</w:t>
-      </w:r>
-      <w:proofErr w:type="spellEnd"/>
-      <w:r>
-        <w:t xml:space="preserve">      │</w:t>
+        <w:t xml:space="preserve">  │ WIP Calculation Engine     │ DONE               │ Just built — reports/wip/route.ts + reports/wip/page.tsx      │</w:t>
       </w:r>
     </w:p>
     <w:p>
@@ -274,31 +242,15 @@
         <w:spacing w:after="0"/>
       </w:pPr>
       <w:r>
-        <w:t xml:space="preserve">  │ Cost Codes (CSI)           │ EXISTS in          │ </w:t>
-      </w:r>
-      <w:proofErr w:type="spellStart"/>
-      <w:r>
-        <w:t>cost_codes</w:t>
-      </w:r>
-      <w:proofErr w:type="spellEnd"/>
-      <w:r>
-        <w:t xml:space="preserve"> table, CRUD API, UI page                           │</w:t>
-      </w:r>
-    </w:p>
-    <w:p>
-      <w:pPr>
-        <w:spacing w:after="0"/>
-      </w:pPr>
-      <w:r>
-        <w:t xml:space="preserve">  │                            │ </w:t>
-      </w:r>
-      <w:proofErr w:type="spellStart"/>
-      <w:r>
-        <w:t>SiteSense</w:t>
-      </w:r>
-      <w:proofErr w:type="spellEnd"/>
-      <w:r>
-        <w:t xml:space="preserve">          │                                                               │</w:t>
+        <w:t xml:space="preserve">  │ Cost Codes (CSI)           │ EXISTS in          │ cost_codes table, CRUD API, UI page                           │</w:t>
+      </w:r>
+    </w:p>
+    <w:p>
+      <w:pPr>
+        <w:spacing w:after="0"/>
+      </w:pPr>
+      <w:r>
+        <w:t xml:space="preserve">  │                            │ SiteSense          │                                                               │</w:t>
       </w:r>
     </w:p>
     <w:p>
@@ -364,15 +316,7 @@
         <w:spacing w:after="0"/>
       </w:pPr>
       <w:r>
-        <w:t xml:space="preserve">  │                            │ </w:t>
-      </w:r>
-      <w:proofErr w:type="spellStart"/>
-      <w:r>
-        <w:t>SiteSense</w:t>
-      </w:r>
-      <w:proofErr w:type="spellEnd"/>
-      <w:r>
-        <w:t xml:space="preserve">          │                                                               │</w:t>
+        <w:t xml:space="preserve">  │                            │ SiteSense          │                                                               │</w:t>
       </w:r>
     </w:p>
     <w:p>
@@ -430,39 +374,15 @@
         <w:spacing w:after="0"/>
       </w:pPr>
       <w:r>
-        <w:t xml:space="preserve">  │ Retainage Tracking         │ SCHEMA ONLY in     │ </w:t>
-      </w:r>
-      <w:proofErr w:type="spellStart"/>
-      <w:r>
-        <w:t>sov_line_items.retainage_percent</w:t>
-      </w:r>
-      <w:proofErr w:type="spellEnd"/>
-      <w:r>
-        <w:t xml:space="preserve"> + </w:t>
-      </w:r>
-      <w:proofErr w:type="spellStart"/>
-      <w:r>
-        <w:t>retainage_held</w:t>
-      </w:r>
-      <w:proofErr w:type="spellEnd"/>
-      <w:r>
-        <w:t xml:space="preserve"> fields      │</w:t>
-      </w:r>
-    </w:p>
-    <w:p>
-      <w:pPr>
-        <w:spacing w:after="0"/>
-      </w:pPr>
-      <w:r>
-        <w:t xml:space="preserve">  │                            │ </w:t>
-      </w:r>
-      <w:proofErr w:type="spellStart"/>
-      <w:r>
-        <w:t>SiteSense</w:t>
-      </w:r>
-      <w:proofErr w:type="spellEnd"/>
-      <w:r>
-        <w:t xml:space="preserve">          │ exist, but no API/UI                                          │</w:t>
+        <w:t xml:space="preserve">  │ Retainage Tracking         │ SCHEMA ONLY in     │ sov_line_items.retainage_percent + retainage_held fields      │</w:t>
+      </w:r>
+    </w:p>
+    <w:p>
+      <w:pPr>
+        <w:spacing w:after="0"/>
+      </w:pPr>
+      <w:r>
+        <w:t xml:space="preserve">  │                            │ SiteSense          │ exist, but no API/UI                                          │</w:t>
       </w:r>
     </w:p>
     <w:p>
@@ -520,31 +440,15 @@
         <w:spacing w:after="0"/>
       </w:pPr>
       <w:r>
-        <w:t xml:space="preserve">  │ Change Orders              │ SCHEMA ONLY in     │ </w:t>
-      </w:r>
-      <w:proofErr w:type="spellStart"/>
-      <w:r>
-        <w:t>change_orders</w:t>
-      </w:r>
-      <w:proofErr w:type="spellEnd"/>
-      <w:r>
-        <w:t xml:space="preserve"> table exists, no API routes or pages            │</w:t>
-      </w:r>
-    </w:p>
-    <w:p>
-      <w:pPr>
-        <w:spacing w:after="0"/>
-      </w:pPr>
-      <w:r>
-        <w:t xml:space="preserve">  │                            │ </w:t>
-      </w:r>
-      <w:proofErr w:type="spellStart"/>
-      <w:r>
-        <w:t>SiteSense</w:t>
-      </w:r>
-      <w:proofErr w:type="spellEnd"/>
-      <w:r>
-        <w:t xml:space="preserve">          │                                                               │</w:t>
+        <w:t xml:space="preserve">  │ Change Orders              │ SCHEMA ONLY in     │ change_orders table exists, no API routes or pages            │</w:t>
+      </w:r>
+    </w:p>
+    <w:p>
+      <w:pPr>
+        <w:spacing w:after="0"/>
+      </w:pPr>
+      <w:r>
+        <w:t xml:space="preserve">  │                            │ SiteSense          │                                                               │</w:t>
       </w:r>
     </w:p>
     <w:p>
@@ -602,23 +506,7 @@
         <w:spacing w:after="0"/>
       </w:pPr>
       <w:r>
-        <w:t xml:space="preserve">  │ Burn Rate / Spending       │ PARTIAL            │ </w:t>
-      </w:r>
-      <w:proofErr w:type="spellStart"/>
-      <w:r>
-        <w:t>forecasting.ts</w:t>
-      </w:r>
-      <w:proofErr w:type="spellEnd"/>
-      <w:r>
-        <w:t xml:space="preserve"> + </w:t>
-      </w:r>
-      <w:proofErr w:type="spellStart"/>
-      <w:r>
-        <w:t>analytics.ts</w:t>
-      </w:r>
-      <w:proofErr w:type="spellEnd"/>
-      <w:r>
-        <w:t xml:space="preserve"> in Books Your Way — daily       │</w:t>
+        <w:t xml:space="preserve">  │ Burn Rate / Spending       │ PARTIAL            │ forecasting.ts + analytics.ts in Books Your Way — daily       │</w:t>
       </w:r>
     </w:p>
     <w:p>
@@ -684,15 +572,7 @@
         <w:spacing w:after="0"/>
       </w:pPr>
       <w:r>
-        <w:t xml:space="preserve">  │ Risk Alerts                │ PARTIAL            │ </w:t>
-      </w:r>
-      <w:proofErr w:type="spellStart"/>
-      <w:r>
-        <w:t>PredictiveAlerts.tsx</w:t>
-      </w:r>
-      <w:proofErr w:type="spellEnd"/>
-      <w:r>
-        <w:t xml:space="preserve"> — budget warnings, spending spikes       │</w:t>
+        <w:t xml:space="preserve">  │ Risk Alerts                │ PARTIAL            │ PredictiveAlerts.tsx — budget warnings, spending spikes       │</w:t>
       </w:r>
     </w:p>
     <w:p>
@@ -1284,15 +1164,7 @@
         <w:spacing w:after="0"/>
       </w:pPr>
       <w:r>
-        <w:t xml:space="preserve">  2. Cost Code Variance Engine — Leverage </w:t>
-      </w:r>
-      <w:proofErr w:type="spellStart"/>
-      <w:r>
-        <w:t>SiteSense's</w:t>
-      </w:r>
-      <w:proofErr w:type="spellEnd"/>
-      <w:r>
-        <w:t xml:space="preserve"> existing CSI cost codes, add budget-vs-actual tracking with</w:t>
+        <w:t xml:space="preserve">  2. Cost Code Variance Engine — Leverage SiteSense's existing CSI cost codes, add budget-vs-actual tracking with</w:t>
       </w:r>
     </w:p>
     <w:p>
@@ -1337,15 +1209,7 @@
         <w:spacing w:after="0"/>
       </w:pPr>
       <w:r>
-        <w:t xml:space="preserve">  1. Retainage Engine — Build the full lifecycle (</w:t>
-      </w:r>
-      <w:proofErr w:type="spellStart"/>
-      <w:r>
-        <w:t>SiteSense</w:t>
-      </w:r>
-      <w:proofErr w:type="spellEnd"/>
-      <w:r>
-        <w:t xml:space="preserve"> already has the schema fields, need API + UI + aging reports</w:t>
+        <w:t xml:space="preserve">  1. Retainage Engine — Build the full lifecycle (SiteSense already has the schema fields, need API + UI + aging reports</w:t>
       </w:r>
     </w:p>
     <w:p>
@@ -1362,23 +1226,7 @@
       </w:pPr>
       <w:r>
         <w:lastRenderedPageBreak/>
-        <w:t xml:space="preserve">  2. Change Order Financial Impact — Build API routes for </w:t>
-      </w:r>
-      <w:proofErr w:type="spellStart"/>
-      <w:r>
-        <w:t>SiteSense's</w:t>
-      </w:r>
-      <w:proofErr w:type="spellEnd"/>
-      <w:r>
-        <w:t xml:space="preserve"> existing </w:t>
-      </w:r>
-      <w:proofErr w:type="spellStart"/>
-      <w:r>
-        <w:t>change_orders</w:t>
-      </w:r>
-      <w:proofErr w:type="spellEnd"/>
-      <w:r>
-        <w:t xml:space="preserve"> table, then model the</w:t>
+        <w:t xml:space="preserve">  2. Change Order Financial Impact — Build API routes for SiteSense's existing change_orders table, then model the</w:t>
       </w:r>
     </w:p>
     <w:p>
@@ -1415,31 +1263,15 @@
         <w:spacing w:after="0"/>
       </w:pPr>
       <w:r>
-        <w:t xml:space="preserve">  2. Burn Rate Modeling — Extend your existing </w:t>
-      </w:r>
-      <w:proofErr w:type="spellStart"/>
-      <w:r>
-        <w:t>forecasting.ts</w:t>
-      </w:r>
-      <w:proofErr w:type="spellEnd"/>
-      <w:r>
-        <w:t xml:space="preserve"> to per-project level</w:t>
-      </w:r>
-    </w:p>
-    <w:p>
-      <w:pPr>
-        <w:spacing w:after="0"/>
-      </w:pPr>
-      <w:r>
-        <w:t xml:space="preserve">  3. Risk Alerts — Extend existing </w:t>
-      </w:r>
-      <w:proofErr w:type="spellStart"/>
-      <w:r>
-        <w:t>PredictiveAlerts.tsx</w:t>
-      </w:r>
-      <w:proofErr w:type="spellEnd"/>
-      <w:r>
-        <w:t xml:space="preserve"> with construction-specific triggers (retainage thresholds, CO</w:t>
+        <w:t xml:space="preserve">  2. Burn Rate Modeling — Extend your existing forecasting.ts to per-project level</w:t>
+      </w:r>
+    </w:p>
+    <w:p>
+      <w:pPr>
+        <w:spacing w:after="0"/>
+      </w:pPr>
+      <w:r>
+        <w:t xml:space="preserve">  3. Risk Alerts — Extend existing PredictiveAlerts.tsx with construction-specific triggers (retainage thresholds, CO</w:t>
       </w:r>
     </w:p>
     <w:p>
@@ -1473,31 +1305,15 @@
         <w:spacing w:after="0"/>
       </w:pPr>
       <w:r>
-        <w:t xml:space="preserve">  Since </w:t>
-      </w:r>
-      <w:proofErr w:type="spellStart"/>
-      <w:r>
-        <w:t>SiteSense</w:t>
-      </w:r>
-      <w:proofErr w:type="spellEnd"/>
-      <w:r>
-        <w:t xml:space="preserve"> already has cost codes, SOV, change orders, and retainage schema — the smart play is to build the</w:t>
-      </w:r>
-    </w:p>
-    <w:p>
-      <w:pPr>
-        <w:spacing w:after="0"/>
-      </w:pPr>
-      <w:r>
-        <w:t xml:space="preserve">  financial calculation engines in Books Your Way while keeping the operational data in </w:t>
-      </w:r>
-      <w:proofErr w:type="spellStart"/>
-      <w:r>
-        <w:t>SiteSense</w:t>
-      </w:r>
-      <w:proofErr w:type="spellEnd"/>
-      <w:r>
-        <w:t>. The sync layer</w:t>
+        <w:t xml:space="preserve">  Since SiteSense already has cost codes, SOV, change orders, and retainage schema — the smart play is to build the</w:t>
+      </w:r>
+    </w:p>
+    <w:p>
+      <w:pPr>
+        <w:spacing w:after="0"/>
+      </w:pPr>
+      <w:r>
+        <w:t xml:space="preserve">  financial calculation engines in Books Your Way while keeping the operational data in SiteSense. The sync layer</w:t>
       </w:r>
     </w:p>
     <w:p>
@@ -1567,23 +1383,7 @@
         <w:t>, added d</w:t>
       </w:r>
       <w:r>
-        <w:t xml:space="preserve">isplays: risk alerts, summary cards, billing position panel, cost breakdown, profitability </w:t>
-      </w:r>
-      <w:proofErr w:type="spellStart"/>
-      <w:r>
-        <w:t>analysis,burn</w:t>
-      </w:r>
-      <w:proofErr w:type="spellEnd"/>
-      <w:r>
-        <w:t xml:space="preserve"> </w:t>
-      </w:r>
-      <w:proofErr w:type="spellStart"/>
-      <w:r>
-        <w:t>rate,completion</w:t>
-      </w:r>
-      <w:proofErr w:type="spellEnd"/>
-      <w:r>
-        <w:t xml:space="preserve"> progress bars</w:t>
+        <w:t>isplays: risk alerts, summary cards, billing position panel, cost breakdown, profitability analysis,burn rate,completion progress bars</w:t>
       </w:r>
     </w:p>
     <w:p>
@@ -1641,68 +1441,28 @@
         <w:spacing w:after="0"/>
       </w:pPr>
       <w:r>
-        <w:t xml:space="preserve">  Database Migration (</w:t>
-      </w:r>
-      <w:proofErr w:type="spellStart"/>
-      <w:r>
-        <w:t>turso</w:t>
-      </w:r>
-      <w:proofErr w:type="spellEnd"/>
-      <w:r>
-        <w:t>/migrations/004_cost_codes.sql)</w:t>
-      </w:r>
-    </w:p>
-    <w:p>
-      <w:pPr>
-        <w:spacing w:after="0"/>
-      </w:pPr>
-    </w:p>
-    <w:p>
-      <w:pPr>
-        <w:spacing w:after="0"/>
-      </w:pPr>
-      <w:r>
-        <w:t xml:space="preserve">  - </w:t>
-      </w:r>
-      <w:proofErr w:type="spellStart"/>
-      <w:r>
-        <w:t>cost_codes</w:t>
-      </w:r>
-      <w:proofErr w:type="spellEnd"/>
-      <w:r>
-        <w:t xml:space="preserve"> table — CSI </w:t>
-      </w:r>
-      <w:proofErr w:type="spellStart"/>
-      <w:r>
-        <w:t>MasterFormat</w:t>
-      </w:r>
-      <w:proofErr w:type="spellEnd"/>
-      <w:r>
-        <w:t xml:space="preserve"> compatible, supports default divisions + custom user codes</w:t>
-      </w:r>
-    </w:p>
-    <w:p>
-      <w:pPr>
-        <w:spacing w:after="0"/>
-      </w:pPr>
-      <w:r>
-        <w:t xml:space="preserve">  - </w:t>
-      </w:r>
-      <w:proofErr w:type="spellStart"/>
-      <w:r>
-        <w:t>cost_code_budgets</w:t>
-      </w:r>
-      <w:proofErr w:type="spellEnd"/>
-      <w:r>
-        <w:t xml:space="preserve"> table — per-job, per-cost-code budget assignments (unique constraint on </w:t>
-      </w:r>
-      <w:proofErr w:type="spellStart"/>
-      <w:r>
-        <w:t>job+code</w:t>
-      </w:r>
-      <w:proofErr w:type="spellEnd"/>
-      <w:r>
-        <w:t>)</w:t>
+        <w:t xml:space="preserve">  Database Migration (turso/migrations/004_cost_codes.sql)</w:t>
+      </w:r>
+    </w:p>
+    <w:p>
+      <w:pPr>
+        <w:spacing w:after="0"/>
+      </w:pPr>
+    </w:p>
+    <w:p>
+      <w:pPr>
+        <w:spacing w:after="0"/>
+      </w:pPr>
+      <w:r>
+        <w:t xml:space="preserve">  - cost_codes table — CSI MasterFormat compatible, supports default divisions + custom user codes</w:t>
+      </w:r>
+    </w:p>
+    <w:p>
+      <w:pPr>
+        <w:spacing w:after="0"/>
+      </w:pPr>
+      <w:r>
+        <w:t xml:space="preserve">  - cost_code_budgets table — per-job, per-cost-code budget assignments (unique constraint on job+code)</w:t>
       </w:r>
     </w:p>
     <w:p>
@@ -1711,23 +1471,7 @@
       </w:pPr>
       <w:r>
         <w:lastRenderedPageBreak/>
-        <w:t xml:space="preserve">  - Added </w:t>
-      </w:r>
-      <w:proofErr w:type="spellStart"/>
-      <w:r>
-        <w:t>cost_code_id</w:t>
-      </w:r>
-      <w:proofErr w:type="spellEnd"/>
-      <w:r>
-        <w:t xml:space="preserve"> column to bills, </w:t>
-      </w:r>
-      <w:proofErr w:type="spellStart"/>
-      <w:r>
-        <w:t>bill_items</w:t>
-      </w:r>
-      <w:proofErr w:type="spellEnd"/>
-      <w:r>
-        <w:t>, and expenses so costs can be tagged with cost codes</w:t>
+        <w:t xml:space="preserve">  - Added cost_code_id column to bills, bill_items, and expenses so costs can be tagged with cost codes</w:t>
       </w:r>
     </w:p>
     <w:p>
@@ -1753,23 +1497,7 @@
         <w:spacing w:after="0"/>
       </w:pPr>
       <w:r>
-        <w:t xml:space="preserve">  1. /</w:t>
-      </w:r>
-      <w:proofErr w:type="spellStart"/>
-      <w:r>
-        <w:t>api</w:t>
-      </w:r>
-      <w:proofErr w:type="spellEnd"/>
-      <w:r>
-        <w:t xml:space="preserve">/cost-codes (CRUD + seed) — Full cost code management with 23 CSI </w:t>
-      </w:r>
-      <w:proofErr w:type="spellStart"/>
-      <w:r>
-        <w:t>MasterFormat</w:t>
-      </w:r>
-      <w:proofErr w:type="spellEnd"/>
-      <w:r>
-        <w:t xml:space="preserve"> divisions built in. Supports</w:t>
+        <w:t xml:space="preserve">  1. /api/cost-codes (CRUD + seed) — Full cost code management with 23 CSI MasterFormat divisions built in. Supports</w:t>
       </w:r>
     </w:p>
     <w:p>
@@ -1785,23 +1513,7 @@
         <w:spacing w:after="0"/>
       </w:pPr>
       <w:r>
-        <w:t xml:space="preserve">  2. /</w:t>
-      </w:r>
-      <w:proofErr w:type="spellStart"/>
-      <w:r>
-        <w:t>api</w:t>
-      </w:r>
-      <w:proofErr w:type="spellEnd"/>
-      <w:r>
-        <w:t xml:space="preserve">/cost-codes/budgets (CRUD) — Assign and manage budgets per cost code per job. Supports </w:t>
-      </w:r>
-      <w:proofErr w:type="spellStart"/>
-      <w:r>
-        <w:t>upsert</w:t>
-      </w:r>
-      <w:proofErr w:type="spellEnd"/>
-      <w:r>
-        <w:t xml:space="preserve"> (update if</w:t>
+        <w:t xml:space="preserve">  2. /api/cost-codes/budgets (CRUD) — Assign and manage budgets per cost code per job. Supports upsert (update if</w:t>
       </w:r>
     </w:p>
     <w:p>
@@ -1817,15 +1529,7 @@
         <w:spacing w:after="0"/>
       </w:pPr>
       <w:r>
-        <w:t xml:space="preserve">  3. /</w:t>
-      </w:r>
-      <w:proofErr w:type="spellStart"/>
-      <w:r>
-        <w:t>api</w:t>
-      </w:r>
-      <w:proofErr w:type="spellEnd"/>
-      <w:r>
-        <w:t>/reports/cost-code-variance — The variance engine:</w:t>
+        <w:t xml:space="preserve">  3. /api/reports/cost-code-variance — The variance engine:</w:t>
       </w:r>
     </w:p>
     <w:p>
@@ -1857,15 +1561,7 @@
         <w:spacing w:after="0"/>
       </w:pPr>
       <w:r>
-        <w:t xml:space="preserve">    - Trend: under (&lt;50%), </w:t>
-      </w:r>
-      <w:proofErr w:type="spellStart"/>
-      <w:r>
-        <w:t>on_track</w:t>
-      </w:r>
-      <w:proofErr w:type="spellEnd"/>
-      <w:r>
-        <w:t xml:space="preserve"> (50-90%), over (90%+), critical (exceeded)</w:t>
+        <w:t xml:space="preserve">    - Trend: under (&lt;50%), on_track (50-90%), over (90%+), critical (exceeded)</w:t>
       </w:r>
     </w:p>
     <w:p>
@@ -2142,23 +1838,7 @@
         <w:spacing w:after="0"/>
       </w:pPr>
       <w:r>
-        <w:t xml:space="preserve">  - </w:t>
-      </w:r>
-      <w:proofErr w:type="spellStart"/>
-      <w:r>
-        <w:t>src</w:t>
-      </w:r>
-      <w:proofErr w:type="spellEnd"/>
-      <w:r>
-        <w:t>/lib/</w:t>
-      </w:r>
-      <w:proofErr w:type="spellStart"/>
-      <w:r>
-        <w:t>jobForecasting.ts</w:t>
-      </w:r>
-      <w:proofErr w:type="spellEnd"/>
-      <w:r>
-        <w:t xml:space="preserve"> — Core forecasting engine with 3 EAC methods (budget, CPI-performance, trend) + weighted</w:t>
+        <w:t xml:space="preserve">  - src/lib/jobForecasting.ts — Core forecasting engine with 3 EAC methods (budget, CPI-performance, trend) + weighted</w:t>
       </w:r>
     </w:p>
     <w:p>
@@ -2174,55 +1854,15 @@
         <w:spacing w:after="0"/>
       </w:pPr>
       <w:r>
-        <w:t xml:space="preserve">  - </w:t>
-      </w:r>
-      <w:proofErr w:type="spellStart"/>
-      <w:r>
-        <w:t>src</w:t>
-      </w:r>
-      <w:proofErr w:type="spellEnd"/>
-      <w:r>
-        <w:t>/app/</w:t>
-      </w:r>
-      <w:proofErr w:type="spellStart"/>
-      <w:r>
-        <w:t>api</w:t>
-      </w:r>
-      <w:proofErr w:type="spellEnd"/>
-      <w:r>
-        <w:t>/reports/margin-forecast/</w:t>
-      </w:r>
-      <w:proofErr w:type="spellStart"/>
-      <w:r>
-        <w:t>route.ts</w:t>
-      </w:r>
-      <w:proofErr w:type="spellEnd"/>
-      <w:r>
-        <w:t xml:space="preserve"> — Cross-job margin forecast API with portfolio-level summary</w:t>
-      </w:r>
-    </w:p>
-    <w:p>
-      <w:pPr>
-        <w:spacing w:after="0"/>
-      </w:pPr>
-      <w:r>
-        <w:t xml:space="preserve">  - </w:t>
-      </w:r>
-      <w:proofErr w:type="spellStart"/>
-      <w:r>
-        <w:t>src</w:t>
-      </w:r>
-      <w:proofErr w:type="spellEnd"/>
-      <w:r>
-        <w:t>/app/dashboard/reports/margin-forecast/</w:t>
-      </w:r>
-      <w:proofErr w:type="spellStart"/>
-      <w:r>
-        <w:t>page.tsx</w:t>
-      </w:r>
-      <w:proofErr w:type="spellEnd"/>
-      <w:r>
-        <w:t xml:space="preserve"> — Margin forecast report page with sortable table, expandable</w:t>
+        <w:t xml:space="preserve">  - src/app/api/reports/margin-forecast/route.ts — Cross-job margin forecast API with portfolio-level summary</w:t>
+      </w:r>
+    </w:p>
+    <w:p>
+      <w:pPr>
+        <w:spacing w:after="0"/>
+      </w:pPr>
+      <w:r>
+        <w:t xml:space="preserve">  - src/app/dashboard/reports/margin-forecast/page.tsx — Margin forecast report page with sortable table, expandable</w:t>
       </w:r>
     </w:p>
     <w:p>
@@ -2251,31 +1891,7 @@
         <w:spacing w:after="0"/>
       </w:pPr>
       <w:r>
-        <w:t xml:space="preserve">  - </w:t>
-      </w:r>
-      <w:proofErr w:type="spellStart"/>
-      <w:r>
-        <w:t>src</w:t>
-      </w:r>
-      <w:proofErr w:type="spellEnd"/>
-      <w:r>
-        <w:t>/app/</w:t>
-      </w:r>
-      <w:proofErr w:type="spellStart"/>
-      <w:r>
-        <w:t>api</w:t>
-      </w:r>
-      <w:proofErr w:type="spellEnd"/>
-      <w:r>
-        <w:t>/jobs/[id]/financial-summary/</w:t>
-      </w:r>
-      <w:proofErr w:type="spellStart"/>
-      <w:r>
-        <w:t>route.ts</w:t>
-      </w:r>
-      <w:proofErr w:type="spellEnd"/>
-      <w:r>
-        <w:t xml:space="preserve"> — Integrated forecasting engine, added forecast section to response</w:t>
+        <w:t xml:space="preserve">  - src/app/api/jobs/[id]/financial-summary/route.ts — Integrated forecasting engine, added forecast section to response</w:t>
       </w:r>
     </w:p>
     <w:p>
@@ -2291,23 +1907,7 @@
         <w:spacing w:after="0"/>
       </w:pPr>
       <w:r>
-        <w:t xml:space="preserve">  - </w:t>
-      </w:r>
-      <w:proofErr w:type="spellStart"/>
-      <w:r>
-        <w:t>src</w:t>
-      </w:r>
-      <w:proofErr w:type="spellEnd"/>
-      <w:r>
-        <w:t>/app/dashboard/jobs/[id]/</w:t>
-      </w:r>
-      <w:proofErr w:type="spellStart"/>
-      <w:r>
-        <w:t>page.tsx</w:t>
-      </w:r>
-      <w:proofErr w:type="spellEnd"/>
-      <w:r>
-        <w:t xml:space="preserve"> — Added Forecast Detail table to Financial tab showing all 3 methods</w:t>
+        <w:t xml:space="preserve">  - src/app/dashboard/jobs/[id]/page.tsx — Added Forecast Detail table to Financial tab showing all 3 methods</w:t>
       </w:r>
     </w:p>
     <w:p>
@@ -2323,23 +1923,7 @@
         <w:spacing w:after="0"/>
       </w:pPr>
       <w:r>
-        <w:t xml:space="preserve">  - </w:t>
-      </w:r>
-      <w:proofErr w:type="spellStart"/>
-      <w:r>
-        <w:t>src</w:t>
-      </w:r>
-      <w:proofErr w:type="spellEnd"/>
-      <w:r>
-        <w:t>/app/dashboard/reports/</w:t>
-      </w:r>
-      <w:proofErr w:type="spellStart"/>
-      <w:r>
-        <w:t>page.tsx</w:t>
-      </w:r>
-      <w:proofErr w:type="spellEnd"/>
-      <w:r>
-        <w:t xml:space="preserve"> — Added "Margin Forecast" to reports index under Job Costing category</w:t>
+        <w:t xml:space="preserve">  - src/app/dashboard/reports/page.tsx — Added "Margin Forecast" to reports index under Job Costing category</w:t>
       </w:r>
     </w:p>
     <w:p>
@@ -2406,15 +1990,7 @@
       </w:pPr>
       <w:r>
         <w:lastRenderedPageBreak/>
-        <w:t xml:space="preserve">All 61 pages compiled successfully and generated. The only error is the pre-existing WSL2 EPERM </w:t>
-      </w:r>
-      <w:proofErr w:type="spellStart"/>
-      <w:r>
-        <w:t>copyfile</w:t>
-      </w:r>
-      <w:proofErr w:type="spellEnd"/>
-      <w:r>
-        <w:t xml:space="preserve"> issue — not</w:t>
+        <w:t>All 61 pages compiled successfully and generated. The only error is the pre-existing WSL2 EPERM copyfile issue — not</w:t>
       </w:r>
     </w:p>
     <w:p>
@@ -2456,15 +2032,7 @@
         <w:spacing w:after="0"/>
       </w:pPr>
       <w:r>
-        <w:t xml:space="preserve">   All 61 pages compiled successfully and generated. The only error is the pre-existing WSL2 EPERM </w:t>
-      </w:r>
-      <w:proofErr w:type="spellStart"/>
-      <w:r>
-        <w:t>copyfile</w:t>
-      </w:r>
-      <w:proofErr w:type="spellEnd"/>
-      <w:r>
-        <w:t xml:space="preserve"> issue — not</w:t>
+        <w:t xml:space="preserve">   All 61 pages compiled successfully and generated. The only error is the pre-existing WSL2 EPERM copyfile issue — not</w:t>
       </w:r>
     </w:p>
     <w:p>
@@ -2514,560 +2082,1935 @@
         <w:spacing w:after="0"/>
       </w:pPr>
       <w:r>
-        <w:t xml:space="preserve">  Migration: </w:t>
-      </w:r>
-      <w:proofErr w:type="spellStart"/>
-      <w:r>
-        <w:t>turso</w:t>
-      </w:r>
-      <w:proofErr w:type="spellEnd"/>
-      <w:r>
-        <w:t>/migrations/005_retainage_change_orders.sql</w:t>
-      </w:r>
-    </w:p>
-    <w:p>
-      <w:pPr>
-        <w:spacing w:after="0"/>
-      </w:pPr>
-      <w:r>
-        <w:t xml:space="preserve">  - Added </w:t>
-      </w:r>
-      <w:proofErr w:type="spellStart"/>
-      <w:r>
-        <w:t>retainage_percent</w:t>
-      </w:r>
-      <w:proofErr w:type="spellEnd"/>
+        <w:t xml:space="preserve">  Migration: turso/migrations/005_retainage_change_orders.sql</w:t>
+      </w:r>
+    </w:p>
+    <w:p>
+      <w:pPr>
+        <w:spacing w:after="0"/>
+      </w:pPr>
+      <w:r>
+        <w:t xml:space="preserve">  - Added retainage_percent, retainage_amount, retainage_released to invoices and bills</w:t>
+      </w:r>
+    </w:p>
+    <w:p>
+      <w:pPr>
+        <w:spacing w:after="0"/>
+      </w:pPr>
+      <w:r>
+        <w:t xml:space="preserve">  - Added retainage_percent (default 10%) to jobs</w:t>
+      </w:r>
+    </w:p>
+    <w:p>
+      <w:pPr>
+        <w:spacing w:after="0"/>
+      </w:pPr>
+    </w:p>
+    <w:p>
+      <w:pPr>
+        <w:spacing w:after="0"/>
+      </w:pPr>
+      <w:r>
+        <w:t xml:space="preserve">  API: src/app/api/reports/retainage/route.ts</w:t>
+      </w:r>
+    </w:p>
+    <w:p>
+      <w:pPr>
+        <w:spacing w:after="0"/>
+      </w:pPr>
+      <w:r>
+        <w:t xml:space="preserve">  - Retainage receivable aging (what customers owe you)</w:t>
+      </w:r>
+    </w:p>
+    <w:p>
+      <w:pPr>
+        <w:spacing w:after="0"/>
+      </w:pPr>
+      <w:r>
+        <w:t xml:space="preserve">  - Retainage payable aging (what you owe subs)</w:t>
+      </w:r>
+    </w:p>
+    <w:p>
+      <w:pPr>
+        <w:spacing w:after="0"/>
+      </w:pPr>
+      <w:r>
+        <w:t xml:space="preserve">  - Aging buckets: current, 31-60, 61-90, 91-120, 120+ days</w:t>
+      </w:r>
+    </w:p>
+    <w:p>
+      <w:pPr>
+        <w:spacing w:after="0"/>
+      </w:pPr>
+      <w:r>
+        <w:t xml:space="preserve">  - Grouped by job (receivable) or vendor (payable)</w:t>
+      </w:r>
+    </w:p>
+    <w:p>
+      <w:pPr>
+        <w:spacing w:after="0"/>
+      </w:pPr>
+    </w:p>
+    <w:p>
+      <w:pPr>
+        <w:spacing w:after="0"/>
+      </w:pPr>
+      <w:r>
+        <w:t xml:space="preserve">  UI: src/app/dashboard/reports/retainage/page.tsx</w:t>
+      </w:r>
+    </w:p>
+    <w:p>
+      <w:pPr>
+        <w:spacing w:after="0"/>
+      </w:pPr>
+      <w:r>
+        <w:t xml:space="preserve">  - Toggle between receivable and payable views</w:t>
+      </w:r>
+    </w:p>
+    <w:p>
+      <w:pPr>
+        <w:spacing w:after="0"/>
+      </w:pPr>
+      <w:r>
+        <w:t xml:space="preserve">  - Summary cards (held, released, outstanding, over 90 days)</w:t>
+      </w:r>
+    </w:p>
+    <w:p>
+      <w:pPr>
+        <w:spacing w:after="0"/>
+      </w:pPr>
+      <w:r>
+        <w:t xml:space="preserve">  - Visual aging breakdown with progress bars</w:t>
+      </w:r>
+    </w:p>
+    <w:p>
+      <w:pPr>
+        <w:spacing w:after="0"/>
+      </w:pPr>
+      <w:r>
+        <w:t xml:space="preserve">  - By-job and by-vendor summaries</w:t>
+      </w:r>
+    </w:p>
+    <w:p>
+      <w:pPr>
+        <w:spacing w:after="0"/>
+      </w:pPr>
+      <w:r>
+        <w:t xml:space="preserve">  - Detail table with all retainage line items</w:t>
+      </w:r>
+    </w:p>
+    <w:p>
+      <w:pPr>
+        <w:spacing w:after="0"/>
+      </w:pPr>
+    </w:p>
+    <w:p>
+      <w:pPr>
+        <w:spacing w:after="0"/>
+      </w:pPr>
+      <w:r>
+        <w:t xml:space="preserve">  Invoice/Bill APIs updated to accept and calculate retainage on creation</w:t>
+      </w:r>
+    </w:p>
+    <w:p>
+      <w:pPr>
+        <w:spacing w:after="0"/>
+      </w:pPr>
+    </w:p>
+    <w:p>
+      <w:pPr>
+        <w:spacing w:after="0"/>
+      </w:pPr>
+      <w:r>
+        <w:t xml:space="preserve">  2.2 Change Order Financial Impact</w:t>
+      </w:r>
+    </w:p>
+    <w:p>
+      <w:pPr>
+        <w:spacing w:after="0"/>
+      </w:pPr>
+    </w:p>
+    <w:p>
+      <w:pPr>
+        <w:spacing w:after="0"/>
+      </w:pPr>
+      <w:r>
+        <w:t xml:space="preserve">  Migration: change_orders table with status workflow (draft → pending → approved/rejected)</w:t>
+      </w:r>
+    </w:p>
+    <w:p>
+      <w:pPr>
+        <w:spacing w:after="0"/>
+      </w:pPr>
+    </w:p>
+    <w:p>
+      <w:pPr>
+        <w:spacing w:after="0"/>
+      </w:pPr>
+      <w:r>
+        <w:t xml:space="preserve">  API: src/app/api/change-orders/route.ts</w:t>
+      </w:r>
+    </w:p>
+    <w:p>
+      <w:pPr>
+        <w:spacing w:after="0"/>
+      </w:pPr>
+      <w:r>
+        <w:t xml:space="preserve">  - Full CRUD with financial impact tracking (revenue, cost, margin, schedule)</w:t>
+      </w:r>
+    </w:p>
+    <w:p>
+      <w:pPr>
+        <w:spacing w:after="0"/>
+      </w:pPr>
+      <w:r>
+        <w:t xml:space="preserve">  - Summary with approved impact, pending exposure, schedule impact</w:t>
+      </w:r>
+    </w:p>
+    <w:p>
+      <w:pPr>
+        <w:spacing w:after="0"/>
+      </w:pPr>
+    </w:p>
+    <w:p>
+      <w:pPr>
+        <w:spacing w:after="0"/>
+      </w:pPr>
+      <w:r>
+        <w:t xml:space="preserve">  UI: src/app/dashboard/jobs/[id]/change-orders/page.tsx</w:t>
+      </w:r>
+    </w:p>
+    <w:p>
+      <w:pPr>
+        <w:spacing w:after="0"/>
+      </w:pPr>
+      <w:r>
+        <w:t xml:space="preserve">  - Create/edit/delete change orders per job</w:t>
+      </w:r>
+    </w:p>
+    <w:p>
+      <w:pPr>
+        <w:spacing w:after="0"/>
+      </w:pPr>
+      <w:r>
+        <w:t xml:space="preserve">  - Status workflow with approve/reject actions</w:t>
+      </w:r>
+    </w:p>
+    <w:p>
+      <w:pPr>
+        <w:spacing w:after="0"/>
+      </w:pPr>
+      <w:r>
+        <w:t xml:space="preserve">  - Financial impact summary (revised contract, margin, pending exposure, schedule)</w:t>
+      </w:r>
+    </w:p>
+    <w:p>
+      <w:pPr>
+        <w:spacing w:after="0"/>
+      </w:pPr>
+      <w:r>
+        <w:t xml:space="preserve">  - Real-time margin impact preview in form</w:t>
+      </w:r>
+    </w:p>
+    <w:p>
+      <w:pPr>
+        <w:spacing w:after="0"/>
+      </w:pPr>
+    </w:p>
+    <w:p>
+      <w:pPr>
+        <w:spacing w:after="0"/>
+      </w:pPr>
+      <w:r>
+        <w:t xml:space="preserve">  Financial Summary API updated:</w:t>
+      </w:r>
+    </w:p>
+    <w:p>
+      <w:pPr>
+        <w:spacing w:after="0"/>
+      </w:pPr>
+      <w:r>
+        <w:t xml:space="preserve">  - Contract value now = Original + Approved COs (revised contract value)</w:t>
+      </w:r>
+    </w:p>
+    <w:p>
+      <w:pPr>
+        <w:spacing w:after="0"/>
+      </w:pPr>
+      <w:r>
+        <w:t xml:space="preserve">  - Estimated cost now includes approved CO cost impact</w:t>
+      </w:r>
+    </w:p>
+    <w:p>
+      <w:pPr>
+        <w:spacing w:after="0"/>
+      </w:pPr>
+      <w:r>
+        <w:t xml:space="preserve">  - New change_orders section in response</w:t>
+      </w:r>
+    </w:p>
+    <w:p>
+      <w:pPr>
+        <w:spacing w:after="0"/>
+      </w:pPr>
+      <w:r>
+        <w:t xml:space="preserve">  - New retainage section (receivable + payable + net position)</w:t>
+      </w:r>
+    </w:p>
+    <w:p>
+      <w:pPr>
+        <w:spacing w:after="0"/>
+      </w:pPr>
+      <w:r>
+        <w:t xml:space="preserve">  - Risk alerts for retainage accumulation and pending CO exposure</w:t>
+      </w:r>
+    </w:p>
+    <w:p>
+      <w:pPr>
+        <w:spacing w:after="0"/>
+      </w:pPr>
+    </w:p>
+    <w:p>
+      <w:pPr>
+        <w:spacing w:after="0"/>
+      </w:pPr>
+      <w:r>
+        <w:t xml:space="preserve">  2.3 Over/Under Billing Enhancement</w:t>
+      </w:r>
+    </w:p>
+    <w:p>
+      <w:pPr>
+        <w:spacing w:after="0"/>
+      </w:pPr>
+    </w:p>
+    <w:p>
+      <w:pPr>
+        <w:spacing w:after="0"/>
+      </w:pPr>
+      <w:r>
+        <w:t xml:space="preserve">  WIP Report API updated:</w:t>
+      </w:r>
+    </w:p>
+    <w:p>
+      <w:pPr>
+        <w:spacing w:after="0"/>
+      </w:pPr>
+      <w:r>
+        <w:t xml:space="preserve">  - Now uses revised contract values (incorporating change orders)</w:t>
+      </w:r>
+    </w:p>
+    <w:p>
+      <w:pPr>
+        <w:spacing w:after="0"/>
+      </w:pPr>
+      <w:r>
+        <w:t xml:space="preserve">  - Added billing_trend field per job (improving/stable/worsening)</w:t>
+      </w:r>
+    </w:p>
+    <w:p>
+      <w:pPr>
+        <w:spacing w:after="0"/>
+      </w:pPr>
+      <w:r>
+        <w:t xml:space="preserve">  - Added retainage receivable/payable per job</w:t>
+      </w:r>
+    </w:p>
+    <w:p>
+      <w:pPr>
+        <w:spacing w:after="0"/>
+      </w:pPr>
+      <w:r>
+        <w:t xml:space="preserve">  - Added change order counts per job</w:t>
+      </w:r>
+    </w:p>
+    <w:p>
+      <w:pPr>
+        <w:spacing w:after="0"/>
+      </w:pPr>
+      <w:r>
+        <w:t xml:space="preserve">  - Enhanced summary with jobs_overbilled, jobs_underbilled, jobs_worsening counts</w:t>
+      </w:r>
+    </w:p>
+    <w:p>
+      <w:pPr>
+        <w:spacing w:after="0"/>
+      </w:pPr>
+      <w:r>
+        <w:t xml:space="preserve">  - Added total_retainage_receivable and total_retainage_payable to summary</w:t>
+      </w:r>
+    </w:p>
+    <w:p>
+      <w:pPr>
+        <w:spacing w:after="0"/>
+      </w:pPr>
+    </w:p>
+    <w:p>
+      <w:pPr>
+        <w:spacing w:after="0"/>
+      </w:pPr>
+      <w:r>
+        <w:t xml:space="preserve">  Reports index updated with Retainage Aging report under Job Costing category.</w:t>
+      </w:r>
+    </w:p>
+    <w:p>
+      <w:pPr>
+        <w:spacing w:after="0"/>
+      </w:pPr>
+    </w:p>
+    <w:p>
+      <w:pPr>
+        <w:spacing w:after="0"/>
+      </w:pPr>
+      <w:r>
+        <w:t xml:space="preserve">  Job detail page updated with Change Orders button and retainage/CO sections in Financial tab.</w:t>
+      </w:r>
+    </w:p>
+    <w:p>
+      <w:pPr>
+        <w:spacing w:after="0"/>
+      </w:pPr>
+      <w:r>
+        <w:lastRenderedPageBreak/>
+        <w:t>All 62 pages compiled and generated successfully. Only the pre-existing WSL2 EPERM copyfile issue at the very end.</w:t>
+      </w:r>
+    </w:p>
+    <w:p>
+      <w:pPr>
+        <w:spacing w:after="0"/>
+      </w:pPr>
+    </w:p>
+    <w:p>
+      <w:pPr>
+        <w:spacing w:after="0"/>
+      </w:pPr>
+      <w:r>
+        <w:t xml:space="preserve">  Phase 3: Advanced Analytics &amp; Forecasting — Complete                                                                  </w:t>
+      </w:r>
+    </w:p>
+    <w:p>
+      <w:pPr>
+        <w:spacing w:after="0"/>
+      </w:pPr>
+      <w:r>
+        <w:t xml:space="preserve">  Here's what was built:                                                                                                </w:t>
+      </w:r>
+    </w:p>
+    <w:p>
+      <w:pPr>
+        <w:spacing w:after="0"/>
+      </w:pPr>
+      <w:r>
+        <w:t xml:space="preserve">  3.1 Cash Flow Forecast by Project</w:t>
+      </w:r>
+    </w:p>
+    <w:p>
+      <w:pPr>
+        <w:spacing w:after="0"/>
+      </w:pPr>
+    </w:p>
+    <w:p>
+      <w:pPr>
+        <w:spacing w:after="0"/>
+      </w:pPr>
+      <w:r>
+        <w:t xml:space="preserve">  API: src/app/api/reports/cash-flow-forecast/route.ts</w:t>
+      </w:r>
+    </w:p>
+    <w:p>
+      <w:pPr>
+        <w:spacing w:after="0"/>
+      </w:pPr>
+      <w:r>
+        <w:t xml:space="preserve">  - Weekly cash flow projections (configurable: 4-26 weeks)</w:t>
+      </w:r>
+    </w:p>
+    <w:p>
+      <w:pPr>
+        <w:spacing w:after="0"/>
+      </w:pPr>
+      <w:r>
+        <w:t xml:space="preserve">  - Inflows: Outstanding invoice due dates placed into weekly buckets; overdue items in current week</w:t>
+      </w:r>
+    </w:p>
+    <w:p>
+      <w:pPr>
+        <w:spacing w:after="0"/>
+      </w:pPr>
+      <w:r>
+        <w:t xml:space="preserve">  - Outflows: Outstanding bills by due date + projected burn rate for uncommitted job costs</w:t>
+      </w:r>
+    </w:p>
+    <w:p>
+      <w:pPr>
+        <w:spacing w:after="0"/>
+      </w:pPr>
+      <w:r>
+        <w:t xml:space="preserve">  - Retainage timing: Pending retainage releases estimated in final quarter of forecast period</w:t>
+      </w:r>
+    </w:p>
+    <w:p>
+      <w:pPr>
+        <w:spacing w:after="0"/>
+      </w:pPr>
+      <w:r>
+        <w:t xml:space="preserve">  - Burn rate projection: Uncommitted remaining costs spread across estimated remaining project duration</w:t>
+      </w:r>
+    </w:p>
+    <w:p>
+      <w:pPr>
+        <w:spacing w:after="0"/>
+      </w:pPr>
+      <w:r>
+        <w:t xml:space="preserve">  - Per-job or company-wide aggregation</w:t>
+      </w:r>
+    </w:p>
+    <w:p>
+      <w:pPr>
+        <w:spacing w:after="0"/>
+      </w:pPr>
+      <w:r>
+        <w:t xml:space="preserve">  - Summary: total inflows/outflows, net cash flow, lowest cumulative point, cash flow health rating</w:t>
+      </w:r>
+    </w:p>
+    <w:p>
+      <w:pPr>
+        <w:spacing w:after="0"/>
+      </w:pPr>
+    </w:p>
+    <w:p>
+      <w:pPr>
+        <w:spacing w:after="0"/>
+      </w:pPr>
+      <w:r>
+        <w:t xml:space="preserve">  UI: src/app/dashboard/reports/cash-flow-forecast/page.tsx</w:t>
+      </w:r>
+    </w:p>
+    <w:p>
+      <w:pPr>
+        <w:spacing w:after="0"/>
+      </w:pPr>
+      <w:r>
+        <w:t xml:space="preserve">  - Job filter + configurable forecast period (4/8/12/16/26 weeks)</w:t>
+      </w:r>
+    </w:p>
+    <w:p>
+      <w:pPr>
+        <w:spacing w:after="0"/>
+      </w:pPr>
+      <w:r>
+        <w:t xml:space="preserve">  - Summary cards (inflows, outflows, net, lowest point, health)</w:t>
+      </w:r>
+    </w:p>
+    <w:p>
+      <w:pPr>
+        <w:spacing w:after="0"/>
+      </w:pPr>
+      <w:r>
+        <w:t xml:space="preserve">  - Visual bar chart with green (inflows) and red (outflows) bars per week</w:t>
+      </w:r>
+    </w:p>
+    <w:p>
+      <w:pPr>
+        <w:spacing w:after="0"/>
+      </w:pPr>
+      <w:r>
+        <w:t xml:space="preserve">  - Cumulative cash position shown below bars with color-coded values</w:t>
+      </w:r>
+    </w:p>
+    <w:p>
+      <w:pPr>
+        <w:spacing w:after="0"/>
+      </w:pPr>
+      <w:r>
+        <w:t xml:space="preserve">  - Rows highlighted red when cumulative goes negative</w:t>
+      </w:r>
+    </w:p>
+    <w:p>
+      <w:pPr>
+        <w:spacing w:after="0"/>
+      </w:pPr>
+      <w:r>
+        <w:t xml:space="preserve">  - Detail table with weekly breakdown and portfolio totals</w:t>
+      </w:r>
+    </w:p>
+    <w:p>
+      <w:pPr>
+        <w:spacing w:after="0"/>
+      </w:pPr>
+      <w:r>
+        <w:t xml:space="preserve">  - Methodology explanation</w:t>
+      </w:r>
+    </w:p>
+    <w:p>
+      <w:pPr>
+        <w:spacing w:after="0"/>
+      </w:pPr>
+    </w:p>
+    <w:p>
+      <w:pPr>
+        <w:spacing w:after="0"/>
+      </w:pPr>
+      <w:r>
+        <w:t xml:space="preserve">  3.2 Burn Rate Modeling (Enhancement)</w:t>
+      </w:r>
+    </w:p>
+    <w:p>
+      <w:pPr>
+        <w:spacing w:after="0"/>
+      </w:pPr>
+    </w:p>
+    <w:p>
+      <w:pPr>
+        <w:spacing w:after="0"/>
+      </w:pPr>
+      <w:r>
+        <w:t xml:space="preserve">  Already built per-job in the financial summary API (Phase 1.3-1.4):</w:t>
+      </w:r>
+    </w:p>
+    <w:p>
+      <w:pPr>
+        <w:spacing w:after="0"/>
+      </w:pPr>
+      <w:r>
+        <w:t xml:space="preserve">  - Daily/weekly/monthly burn rate per job</w:t>
+      </w:r>
+    </w:p>
+    <w:p>
+      <w:pPr>
+        <w:spacing w:after="0"/>
+      </w:pPr>
+      <w:r>
+        <w:t xml:space="preserve">  - Burn rate trend detection (accelerating/steady/decelerating)</w:t>
+      </w:r>
+    </w:p>
+    <w:p>
+      <w:pPr>
+        <w:spacing w:after="0"/>
+      </w:pPr>
+      <w:r>
+        <w:t xml:space="preserve">  - Projected completion date based on burn rate</w:t>
+      </w:r>
+    </w:p>
+    <w:p>
+      <w:pPr>
+        <w:spacing w:after="0"/>
+      </w:pPr>
+      <w:r>
+        <w:t xml:space="preserve">  - Integrated into the cash flow forecast as the uncommitted cost projection engine</w:t>
+      </w:r>
+    </w:p>
+    <w:p>
+      <w:pPr>
+        <w:spacing w:after="0"/>
+      </w:pPr>
+    </w:p>
+    <w:p>
+      <w:pPr>
+        <w:spacing w:after="0"/>
+      </w:pPr>
+      <w:r>
+        <w:t xml:space="preserve">  3.3 Construction Risk Alerts</w:t>
+      </w:r>
+    </w:p>
+    <w:p>
+      <w:pPr>
+        <w:spacing w:after="0"/>
+      </w:pPr>
+    </w:p>
+    <w:p>
+      <w:pPr>
+        <w:spacing w:after="0"/>
+      </w:pPr>
+      <w:r>
+        <w:t xml:space="preserve">  API: src/app/api/alerts/construction/route.ts</w:t>
+      </w:r>
+    </w:p>
+    <w:p>
+      <w:pPr>
+        <w:spacing w:after="0"/>
+      </w:pPr>
+      <w:r>
+        <w:t xml:space="preserve">  - Scans all active jobs and generates alerts across 9 categories:</w:t>
+      </w:r>
+    </w:p>
+    <w:p>
+      <w:pPr>
+        <w:spacing w:after="0"/>
+      </w:pPr>
+      <w:r>
+        <w:t xml:space="preserve">    a. Cost Overrun — actual &gt; budget, or 90%+ budget used at low completion</w:t>
+      </w:r>
+    </w:p>
+    <w:p>
+      <w:pPr>
+        <w:spacing w:after="0"/>
+      </w:pPr>
+      <w:r>
+        <w:t xml:space="preserve">    b. Retainage Accumulation — retainage receivable &gt; 8% of contract</w:t>
+      </w:r>
+    </w:p>
+    <w:p>
+      <w:pPr>
+        <w:spacing w:after="0"/>
+      </w:pPr>
+      <w:r>
+        <w:t xml:space="preserve">    c. Change Order Exposure — pending COs &gt; 10% of contract</w:t>
+      </w:r>
+    </w:p>
+    <w:p>
+      <w:pPr>
+        <w:spacing w:after="0"/>
+      </w:pPr>
+      <w:r>
+        <w:t xml:space="preserve">    d. Underbilling — underbilled &gt; 15% of contract (cash flow risk)</w:t>
+      </w:r>
+    </w:p>
+    <w:p>
+      <w:pPr>
+        <w:spacing w:after="0"/>
+      </w:pPr>
+      <w:r>
+        <w:t xml:space="preserve">    e. Overbilling Liability — overbilled &gt; 25% of contract</w:t>
+      </w:r>
+    </w:p>
+    <w:p>
+      <w:pPr>
+        <w:spacing w:after="0"/>
+      </w:pPr>
+      <w:r>
+        <w:t xml:space="preserve">    f. Margin Erosion — projected margin eroding &gt; 5% from estimate</w:t>
+      </w:r>
+    </w:p>
+    <w:p>
+      <w:pPr>
+        <w:spacing w:after="0"/>
+      </w:pPr>
+      <w:r>
+        <w:t xml:space="preserve">    g. CTC Exceeds Budget — cost-to-complete projects over budget</w:t>
+      </w:r>
+    </w:p>
+    <w:p>
+      <w:pPr>
+        <w:spacing w:after="0"/>
+      </w:pPr>
+      <w:r>
+        <w:t xml:space="preserve">    h. Schedule Risk — burn rate projects past planned end date</w:t>
+      </w:r>
+    </w:p>
+    <w:p>
+      <w:pPr>
+        <w:spacing w:after="0"/>
+      </w:pPr>
+      <w:r>
+        <w:t xml:space="preserve">    i. Collection Risk — outstanding AR &gt; 50% of billings</w:t>
+      </w:r>
+    </w:p>
+    <w:p>
+      <w:pPr>
+        <w:spacing w:after="0"/>
+      </w:pPr>
+      <w:r>
+        <w:t xml:space="preserve">  - Three severity levels: critical, warning, info</w:t>
+      </w:r>
+    </w:p>
+    <w:p>
+      <w:pPr>
+        <w:spacing w:after="0"/>
+      </w:pPr>
+      <w:r>
+        <w:t xml:space="preserve">  - Summary with counts and affected jobs</w:t>
+      </w:r>
+    </w:p>
+    <w:p>
+      <w:pPr>
+        <w:spacing w:after="0"/>
+      </w:pPr>
+    </w:p>
+    <w:p>
+      <w:pPr>
+        <w:spacing w:after="0"/>
+      </w:pPr>
+      <w:r>
+        <w:t xml:space="preserve">  Component: src/components/ConstructionAlerts.tsx</w:t>
+      </w:r>
+    </w:p>
+    <w:p>
+      <w:pPr>
+        <w:spacing w:after="0"/>
+      </w:pPr>
+      <w:r>
+        <w:t xml:space="preserve">  - Dismissable alert cards with severity-colored left borders</w:t>
+      </w:r>
+    </w:p>
+    <w:p>
+      <w:pPr>
+        <w:spacing w:after="0"/>
+      </w:pPr>
+      <w:r>
+        <w:t xml:space="preserve">  - Type-specific icons per alert category</w:t>
+      </w:r>
+    </w:p>
+    <w:p>
+      <w:pPr>
+        <w:spacing w:after="0"/>
+      </w:pPr>
+      <w:r>
+        <w:t xml:space="preserve">  - Job links for quick drill-down</w:t>
+      </w:r>
+    </w:p>
+    <w:p>
+      <w:pPr>
+        <w:spacing w:after="0"/>
+      </w:pPr>
+      <w:r>
+        <w:t xml:space="preserve">  - "Show all" toggle when &gt; 5 alerts</w:t>
+      </w:r>
+    </w:p>
+    <w:p>
+      <w:pPr>
+        <w:spacing w:after="0"/>
+      </w:pPr>
+      <w:r>
+        <w:t xml:space="preserve">  - All-clear state when no alerts</w:t>
+      </w:r>
+    </w:p>
+    <w:p>
+      <w:pPr>
+        <w:spacing w:after="0"/>
+      </w:pPr>
+      <w:r>
+        <w:t xml:space="preserve">  - Summary badges showing critical/warning/info counts</w:t>
+      </w:r>
+    </w:p>
+    <w:p>
+      <w:pPr>
+        <w:spacing w:after="0"/>
+      </w:pPr>
+    </w:p>
+    <w:p>
+      <w:pPr>
+        <w:spacing w:after="0"/>
+      </w:pPr>
+      <w:r>
+        <w:t xml:space="preserve">  Dashboard integration: Added ConstructionAlerts component to the main dashboard page between the stats grid and recent</w:t>
+      </w:r>
+    </w:p>
+    <w:p>
+      <w:pPr>
+        <w:spacing w:after="0"/>
+      </w:pPr>
+      <w:r>
+        <w:t xml:space="preserve">   activity section.</w:t>
+      </w:r>
+    </w:p>
+    <w:p>
+      <w:pPr>
+        <w:spacing w:after="0"/>
+      </w:pPr>
+    </w:p>
+    <w:p>
+      <w:pPr>
+        <w:spacing w:after="0"/>
+      </w:pPr>
+      <w:r>
+        <w:t xml:space="preserve">  Reports index updated with Cash Flow Forecast under Job Costing.</w:t>
+      </w:r>
+    </w:p>
+    <w:p>
+      <w:pPr>
+        <w:spacing w:after="0"/>
+      </w:pPr>
+    </w:p>
+    <w:p>
+      <w:pPr>
+        <w:spacing w:after="0"/>
+      </w:pPr>
+    </w:p>
+    <w:p>
+      <w:pPr>
+        <w:spacing w:after="0"/>
+      </w:pPr>
+    </w:p>
+    <w:p>
+      <w:pPr>
+        <w:spacing w:after="0"/>
+      </w:pPr>
+    </w:p>
+    <w:p>
+      <w:pPr>
+        <w:spacing w:after="0"/>
+      </w:pPr>
+    </w:p>
+    <w:p>
+      <w:pPr>
+        <w:spacing w:after="0"/>
+      </w:pPr>
+    </w:p>
+    <w:p>
+      <w:pPr>
+        <w:spacing w:after="0"/>
+      </w:pPr>
+      <w:r>
+        <w:lastRenderedPageBreak/>
+        <w:t>Build compiles successfully with 65 pages generated (up from 62). The EPERM is the pre-existing WSL2 issue.</w:t>
+      </w:r>
+    </w:p>
+    <w:p>
+      <w:pPr>
+        <w:spacing w:after="0"/>
+      </w:pPr>
+    </w:p>
+    <w:p>
+      <w:pPr>
+        <w:spacing w:after="0"/>
+      </w:pPr>
+      <w:r>
+        <w:t xml:space="preserve">  New pages added: 3 new (entities management, intercompany transactions, consolidated report).                         </w:t>
+      </w:r>
+    </w:p>
+    <w:p>
+      <w:pPr>
+        <w:spacing w:after="0"/>
+      </w:pPr>
+      <w:r>
+        <w:t xml:space="preserve">  Here's a summary of everything completed:                                                                             </w:t>
+      </w:r>
+    </w:p>
+    <w:p>
+      <w:pPr>
+        <w:spacing w:after="0"/>
+      </w:pPr>
+      <w:r>
+        <w:t xml:space="preserve">  ---</w:t>
+      </w:r>
+    </w:p>
+    <w:p>
+      <w:pPr>
+        <w:spacing w:after="0"/>
+      </w:pPr>
+      <w:r>
+        <w:t xml:space="preserve">  Sidebar Dropdowns - Complete</w:t>
+      </w:r>
+    </w:p>
+    <w:p>
+      <w:pPr>
+        <w:spacing w:after="0"/>
+      </w:pPr>
+    </w:p>
+    <w:p>
+      <w:pPr>
+        <w:spacing w:after="0"/>
+      </w:pPr>
+      <w:r>
+        <w:t xml:space="preserve">  The sidebar now has collapsible category dropdowns:</w:t>
+      </w:r>
+    </w:p>
+    <w:p>
+      <w:pPr>
+        <w:spacing w:after="0"/>
+      </w:pPr>
+      <w:r>
+        <w:t xml:space="preserve">  - Dashboard (always visible top)</w:t>
+      </w:r>
+    </w:p>
+    <w:p>
+      <w:pPr>
+        <w:spacing w:after="0"/>
+      </w:pPr>
+      <w:r>
+        <w:t xml:space="preserve">  - Sales &amp; Revenue (4 items) - collapsible</w:t>
+      </w:r>
+    </w:p>
+    <w:p>
+      <w:pPr>
+        <w:spacing w:after="0"/>
+      </w:pPr>
+      <w:r>
+        <w:t xml:space="preserve">  - Purchasing &amp; Costs (4 items) - collapsible</w:t>
+      </w:r>
+    </w:p>
+    <w:p>
+      <w:pPr>
+        <w:spacing w:after="0"/>
+      </w:pPr>
+      <w:r>
+        <w:t xml:space="preserve">  - Job Costing (6 items) - collapsible</w:t>
+      </w:r>
+    </w:p>
+    <w:p>
+      <w:pPr>
+        <w:spacing w:after="0"/>
+      </w:pPr>
+      <w:r>
+        <w:t xml:space="preserve">  - Accounting (5 items) - collapsible</w:t>
+      </w:r>
+    </w:p>
+    <w:p>
+      <w:pPr>
+        <w:spacing w:after="0"/>
+      </w:pPr>
+      <w:r>
+        <w:t xml:space="preserve">  - Reports &amp; Tools (7 items) - collapsible</w:t>
+      </w:r>
+    </w:p>
+    <w:p>
+      <w:pPr>
+        <w:spacing w:after="0"/>
+      </w:pPr>
+      <w:r>
+        <w:t xml:space="preserve">  - Entities + Settings (always visible bottom)</w:t>
+      </w:r>
+    </w:p>
+    <w:p>
+      <w:pPr>
+        <w:spacing w:after="0"/>
+      </w:pPr>
+    </w:p>
+    <w:p>
+      <w:pPr>
+        <w:spacing w:after="0"/>
+      </w:pPr>
+      <w:r>
+        <w:t xml:space="preserve">  Categories auto-expand when the current route matches a child item.</w:t>
+      </w:r>
+    </w:p>
+    <w:p>
+      <w:pPr>
+        <w:spacing w:after="0"/>
+      </w:pPr>
+    </w:p>
+    <w:p>
+      <w:pPr>
+        <w:spacing w:after="0"/>
+      </w:pPr>
+      <w:r>
+        <w:t xml:space="preserve">  Phase 4: Multi-Entity &amp; Multi-Location - Complete</w:t>
+      </w:r>
+    </w:p>
+    <w:p>
+      <w:pPr>
+        <w:spacing w:after="0"/>
+      </w:pPr>
+    </w:p>
+    <w:p>
+      <w:pPr>
+        <w:spacing w:after="0"/>
+      </w:pPr>
+      <w:r>
+        <w:t xml:space="preserve">  4.1 Database Schema (turso/migrations/006_multi_entity.sql)</w:t>
+      </w:r>
+    </w:p>
+    <w:p>
+      <w:pPr>
+        <w:spacing w:after="0"/>
+      </w:pPr>
+    </w:p>
+    <w:p>
+      <w:pPr>
+        <w:spacing w:after="0"/>
+      </w:pPr>
+      <w:r>
+        <w:t xml:space="preserve">  - organizations - top-level grouping</w:t>
+      </w:r>
+    </w:p>
+    <w:p>
+      <w:pPr>
+        <w:spacing w:after="0"/>
+      </w:pPr>
+      <w:r>
+        <w:t xml:space="preserve">  - entities - companies/divisions/branches/departments</w:t>
+      </w:r>
+    </w:p>
+    <w:p>
+      <w:pPr>
+        <w:spacing w:after="0"/>
+      </w:pPr>
+      <w:r>
+        <w:t xml:space="preserve">  - locations - physical locations per entity (office, warehouse, jobsite, etc.)</w:t>
+      </w:r>
+    </w:p>
+    <w:p>
+      <w:pPr>
+        <w:spacing w:after="0"/>
+      </w:pPr>
+      <w:r>
+        <w:t xml:space="preserve">  - user_entity_roles - RBAC per entity (owner/admin/manager/accountant/viewer)</w:t>
+      </w:r>
+    </w:p>
+    <w:p>
+      <w:pPr>
+        <w:spacing w:after="0"/>
+      </w:pPr>
+      <w:r>
+        <w:t xml:space="preserve">  - intercompany_transactions - transfers between entities</w:t>
+      </w:r>
+    </w:p>
+    <w:p>
+      <w:pPr>
+        <w:spacing w:after="0"/>
+      </w:pPr>
+      <w:r>
+        <w:t xml:space="preserve">  - Added entity_id column to 11 existing tables (jobs, invoices, bills, expenses, accounts, customers, vendors,</w:t>
+      </w:r>
+    </w:p>
+    <w:p>
+      <w:pPr>
+        <w:spacing w:after="0"/>
+      </w:pPr>
+      <w:r>
+        <w:t xml:space="preserve">  payments, bank_accounts, journal_entries)</w:t>
+      </w:r>
+    </w:p>
+    <w:p>
+      <w:pPr>
+        <w:spacing w:after="0"/>
+      </w:pPr>
+    </w:p>
+    <w:p>
+      <w:pPr>
+        <w:spacing w:after="0"/>
+      </w:pPr>
+      <w:r>
+        <w:t xml:space="preserve">  4.2 API Routes</w:t>
+      </w:r>
+    </w:p>
+    <w:p>
+      <w:pPr>
+        <w:spacing w:after="0"/>
+      </w:pPr>
+    </w:p>
+    <w:p>
+      <w:pPr>
+        <w:spacing w:after="0"/>
+      </w:pPr>
+      <w:r>
+        <w:t xml:space="preserve">  - /api/organizations - CRUD with auto-entity + owner role creation</w:t>
+      </w:r>
+    </w:p>
+    <w:p>
+      <w:pPr>
+        <w:spacing w:after="0"/>
+      </w:pPr>
+      <w:r>
+        <w:lastRenderedPageBreak/>
+        <w:t xml:space="preserve">  - /api/entities - CRUD with permission checks, prevents deleting last entity</w:t>
+      </w:r>
+    </w:p>
+    <w:p>
+      <w:pPr>
+        <w:spacing w:after="0"/>
+      </w:pPr>
+      <w:r>
+        <w:t xml:space="preserve">  - /api/locations - CRUD for physical locations</w:t>
+      </w:r>
+    </w:p>
+    <w:p>
+      <w:pPr>
+        <w:spacing w:after="0"/>
+      </w:pPr>
+      <w:r>
+        <w:t xml:space="preserve">  - /api/intercompany - Create/approve/post/void inter-company transactions</w:t>
+      </w:r>
+    </w:p>
+    <w:p>
+      <w:pPr>
+        <w:spacing w:after="0"/>
+      </w:pPr>
+      <w:r>
+        <w:t xml:space="preserve">  - /api/reports/consolidated - Cross-entity P&amp;L comparison</w:t>
+      </w:r>
+    </w:p>
+    <w:p>
+      <w:pPr>
+        <w:spacing w:after="0"/>
+      </w:pPr>
+    </w:p>
+    <w:p>
+      <w:pPr>
+        <w:spacing w:after="0"/>
+      </w:pPr>
+      <w:r>
+        <w:t xml:space="preserve">  4.3 User Roles</w:t>
+      </w:r>
+    </w:p>
+    <w:p>
+      <w:pPr>
+        <w:spacing w:after="0"/>
+      </w:pPr>
+    </w:p>
+    <w:p>
+      <w:pPr>
+        <w:spacing w:after="0"/>
+      </w:pPr>
+      <w:r>
+        <w:t xml:space="preserve">  - Role hierarchy: owner &gt; admin &gt; manager &gt; accountant &gt; viewer</w:t>
+      </w:r>
+    </w:p>
+    <w:p>
+      <w:pPr>
+        <w:spacing w:after="0"/>
+      </w:pPr>
+      <w:r>
+        <w:t xml:space="preserve">  - Permission checks on all entity/org mutations</w:t>
+      </w:r>
+    </w:p>
+    <w:p>
+      <w:pPr>
+        <w:spacing w:after="0"/>
+      </w:pPr>
+      <w:r>
+        <w:t xml:space="preserve">  - Org-level roles grant access to all entities</w:t>
+      </w:r>
+    </w:p>
+    <w:p>
+      <w:pPr>
+        <w:spacing w:after="0"/>
+      </w:pPr>
+    </w:p>
+    <w:p>
+      <w:pPr>
+        <w:spacing w:after="0"/>
+      </w:pPr>
+      <w:r>
+        <w:t xml:space="preserve">  4.4 Entity Switcher UI</w:t>
+      </w:r>
+    </w:p>
+    <w:p>
+      <w:pPr>
+        <w:spacing w:after="0"/>
+      </w:pPr>
+    </w:p>
+    <w:p>
+      <w:pPr>
+        <w:spacing w:after="0"/>
+      </w:pPr>
+      <w:r>
+        <w:t xml:space="preserve">  - EntityContext provider with useEntity() hook</w:t>
+      </w:r>
+    </w:p>
+    <w:p>
+      <w:pPr>
+        <w:spacing w:after="0"/>
+      </w:pPr>
+      <w:r>
+        <w:t xml:space="preserve">  - EntitySwitcher component in sidebar (below logo)</w:t>
+      </w:r>
+    </w:p>
+    <w:p>
+      <w:pPr>
+        <w:spacing w:after="0"/>
+      </w:pPr>
+      <w:r>
+        <w:t xml:space="preserve">  - Persists selection in localStorage</w:t>
+      </w:r>
+    </w:p>
+    <w:p>
+      <w:pPr>
+        <w:spacing w:after="0"/>
+      </w:pPr>
+      <w:r>
+        <w:t xml:space="preserve">  - "All Entities (Consolidated)" view option</w:t>
+      </w:r>
+    </w:p>
+    <w:p>
+      <w:pPr>
+        <w:spacing w:after="0"/>
+      </w:pPr>
+    </w:p>
+    <w:p>
+      <w:pPr>
+        <w:spacing w:after="0"/>
+      </w:pPr>
+      <w:r>
+        <w:t xml:space="preserve">  4.5 Management Pages</w:t>
+      </w:r>
+    </w:p>
+    <w:p>
+      <w:pPr>
+        <w:spacing w:after="0"/>
+      </w:pPr>
+    </w:p>
+    <w:p>
+      <w:pPr>
+        <w:spacing w:after="0"/>
+      </w:pPr>
+      <w:r>
+        <w:t xml:space="preserve">  - /dashboard/settings/entities - Full entity management (CRUD, locations, user roles)</w:t>
+      </w:r>
+    </w:p>
+    <w:p>
+      <w:pPr>
+        <w:spacing w:after="0"/>
+      </w:pPr>
+      <w:r>
+        <w:t xml:space="preserve">  - /dashboard/settings/entities/intercompany - Inter-company transaction management</w:t>
+      </w:r>
+    </w:p>
+    <w:p>
+      <w:pPr>
+        <w:spacing w:after="0"/>
+      </w:pPr>
+      <w:r>
+        <w:t xml:space="preserve">  - /dashboard/reports/consolidated - Cross-entity financial comparison with revenue distribution bars</w:t>
+      </w:r>
+    </w:p>
+    <w:p>
+      <w:pPr>
+        <w:spacing w:after="0"/>
+      </w:pPr>
+    </w:p>
+    <w:p>
+      <w:pPr>
+        <w:spacing w:after="0"/>
+      </w:pPr>
+      <w:r>
+        <w:t xml:space="preserve">  4.6 Infrastructure</w:t>
+      </w:r>
+    </w:p>
+    <w:p>
+      <w:pPr>
+        <w:spacing w:after="0"/>
+      </w:pPr>
+    </w:p>
+    <w:p>
+      <w:pPr>
+        <w:spacing w:after="0"/>
+      </w:pPr>
+      <w:r>
+        <w:t xml:space="preserve">  - Updated tursoAdmin.ts relation map for new tables</w:t>
+      </w:r>
+    </w:p>
+    <w:p>
+      <w:pPr>
+        <w:spacing w:after="0"/>
+      </w:pPr>
+      <w:r>
+        <w:t xml:space="preserve">  - Added EntityProvider to app Providers</w:t>
+      </w:r>
+    </w:p>
+    <w:p>
+      <w:pPr>
+        <w:spacing w:after="0"/>
+      </w:pPr>
+      <w:r>
+        <w:t xml:space="preserve">  - Added Consolidated Report to reports listing page</w:t>
+      </w:r>
+    </w:p>
+    <w:p>
+      <w:pPr>
+        <w:spacing w:after="0"/>
+      </w:pPr>
+    </w:p>
+    <w:p>
+      <w:pPr>
+        <w:spacing w:after="0"/>
+      </w:pPr>
+      <w:r>
+        <w:rPr>
+          <w:rFonts w:ascii="Segoe UI Symbol" w:hAnsi="Segoe UI Symbol" w:cs="Segoe UI Symbol"/>
+        </w:rPr>
+        <w:t>✻</w:t>
+      </w:r>
+      <w:r>
+        <w:t xml:space="preserve"> Baked for 21m 49s</w:t>
+      </w:r>
+    </w:p>
+    <w:p>
+      <w:pPr>
+        <w:spacing w:after="0"/>
+      </w:pPr>
+    </w:p>
+    <w:p>
+      <w:pPr>
+        <w:spacing w:after="0"/>
+      </w:pPr>
+      <w:r>
+        <w:t xml:space="preserve">● Agent "Create entity management APIs" completed                                                                       </w:t>
+      </w:r>
+    </w:p>
+    <w:p>
+      <w:pPr>
+        <w:spacing w:after="0"/>
+      </w:pPr>
+      <w:r>
+        <w:lastRenderedPageBreak/>
+        <w:t xml:space="preserve">● Agent "Create entity switcher and settings UI" completed                                                              </w:t>
+      </w:r>
+    </w:p>
+    <w:p>
+      <w:pPr>
+        <w:spacing w:after="0"/>
+      </w:pPr>
+      <w:r>
+        <w:t>● Both agents completed successfully. All files are created, TypeScript compiles clean, and the build generates 65</w:t>
+      </w:r>
+    </w:p>
+    <w:p>
+      <w:pPr>
+        <w:spacing w:after="0"/>
+      </w:pPr>
+      <w:r>
+        <w:t xml:space="preserve">  pages. Phase 4 is complete.</w:t>
+      </w:r>
+    </w:p>
+    <w:p>
+      <w:pPr>
+        <w:spacing w:after="0"/>
+      </w:pPr>
+      <w:r>
+        <w:t xml:space="preserve">                                                                                                                          Let me do one final verification to make sure everything is solid.</w:t>
+      </w:r>
+    </w:p>
+    <w:p>
+      <w:pPr>
+        <w:spacing w:after="0"/>
+      </w:pPr>
+      <w:r>
+        <w:t xml:space="preserve">                                                                                                                        ● Bash(npx tsc --noEmit --pretty 2&gt;&amp;1 | head -10)</w:t>
+      </w:r>
+    </w:p>
+    <w:p>
+      <w:pPr>
+        <w:spacing w:after="0"/>
+      </w:pPr>
+      <w:r>
+        <w:t xml:space="preserve">  </w:t>
+      </w:r>
+      <w:r>
+        <w:rPr>
+          <w:rFonts w:ascii="Cambria Math" w:hAnsi="Cambria Math" w:cs="Cambria Math"/>
+        </w:rPr>
+        <w:t>⎿</w:t>
+      </w:r>
+      <w:r>
+        <w:t xml:space="preserve"> </w:t>
+      </w:r>
+      <w:r>
+        <w:rPr>
+          <w:rFonts w:ascii="Aptos" w:hAnsi="Aptos" w:cs="Aptos"/>
+        </w:rPr>
+        <w:t> </w:t>
+      </w:r>
+      <w:r>
+        <w:t>(No output)</w:t>
+      </w:r>
+    </w:p>
+    <w:p>
+      <w:pPr>
+        <w:spacing w:after="0"/>
+      </w:pPr>
+      <w:r>
+        <w:t xml:space="preserve">  </w:t>
+      </w:r>
+      <w:r>
+        <w:rPr>
+          <w:rFonts w:ascii="Cambria Math" w:hAnsi="Cambria Math" w:cs="Cambria Math"/>
+        </w:rPr>
+        <w:t>⎿</w:t>
+      </w:r>
+      <w:r>
+        <w:t xml:space="preserve"> </w:t>
+      </w:r>
+      <w:r>
+        <w:rPr>
+          <w:rFonts w:ascii="Aptos" w:hAnsi="Aptos" w:cs="Aptos"/>
+        </w:rPr>
+        <w:t> </w:t>
+      </w:r>
+      <w:r>
+        <w:t>(timeout 2m)</w:t>
+      </w:r>
+    </w:p>
+    <w:p>
+      <w:pPr>
+        <w:spacing w:after="0"/>
+      </w:pPr>
+    </w:p>
+    <w:p>
+      <w:pPr>
+        <w:spacing w:after="0"/>
+      </w:pPr>
+      <w:r>
+        <w:t>● Everything is clean. Here's the full summary of what was delivered:</w:t>
+      </w:r>
+    </w:p>
+    <w:p>
+      <w:pPr>
+        <w:spacing w:after="0"/>
+      </w:pPr>
+    </w:p>
+    <w:p>
+      <w:pPr>
+        <w:spacing w:after="0"/>
+      </w:pPr>
+      <w:r>
+        <w:t xml:space="preserve">  ---                                                                                                                     Sidebar Category Dropdowns - Done</w:t>
+      </w:r>
+    </w:p>
+    <w:p>
+      <w:pPr>
+        <w:spacing w:after="0"/>
+      </w:pPr>
+      <w:r>
+        <w:t xml:space="preserve">                                                                                                                          - 6 collapsible categories with chevron animation</w:t>
+      </w:r>
+    </w:p>
+    <w:p>
+      <w:pPr>
+        <w:spacing w:after="0"/>
+      </w:pPr>
+      <w:r>
+        <w:t xml:space="preserve">  - Auto-expands category matching current route</w:t>
+      </w:r>
+    </w:p>
+    <w:p>
+      <w:pPr>
+        <w:spacing w:after="0"/>
+      </w:pPr>
+      <w:r>
+        <w:t xml:space="preserve">  - Dashboard pinned at top, Entities + Settings pinned at bottom</w:t>
+      </w:r>
+    </w:p>
+    <w:p>
+      <w:pPr>
+        <w:spacing w:after="0"/>
+      </w:pPr>
+    </w:p>
+    <w:p>
+      <w:pPr>
+        <w:spacing w:after="0"/>
+      </w:pPr>
+      <w:r>
+        <w:t xml:space="preserve">  Phase 4: Multi-Entity &amp; Multi-Location - Done</w:t>
+      </w:r>
+    </w:p>
+    <w:p>
+      <w:pPr>
+        <w:spacing w:after="0"/>
+      </w:pPr>
+    </w:p>
+    <w:p>
+      <w:pPr>
+        <w:spacing w:after="0"/>
+      </w:pPr>
+      <w:r>
+        <w:t xml:space="preserve">  ┌────────────────</w:t>
+      </w:r>
+      <w:r>
+        <w:rPr>
+          <w:rFonts w:ascii="MS Gothic" w:eastAsia="MS Gothic" w:hAnsi="MS Gothic" w:cs="MS Gothic" w:hint="eastAsia"/>
+        </w:rPr>
+        <w:t>┬</w:t>
+      </w:r>
+      <w:r>
+        <w:rPr>
+          <w:rFonts w:ascii="Aptos" w:hAnsi="Aptos" w:cs="Aptos"/>
+        </w:rPr>
+        <w:t>─────────────────────────────────────────────────────────────────────────────────────────┐</w:t>
+      </w:r>
+    </w:p>
+    <w:p>
+      <w:pPr>
+        <w:spacing w:after="0"/>
+      </w:pPr>
+      <w:r>
+        <w:t xml:space="preserve">  │   Component    │                                          Files                                          │</w:t>
+      </w:r>
+    </w:p>
+    <w:p>
+      <w:pPr>
+        <w:spacing w:after="0"/>
+      </w:pPr>
+      <w:r>
+        <w:t xml:space="preserve">  </w:t>
+      </w:r>
+      <w:r>
+        <w:rPr>
+          <w:rFonts w:ascii="MS Gothic" w:eastAsia="MS Gothic" w:hAnsi="MS Gothic" w:cs="MS Gothic" w:hint="eastAsia"/>
+        </w:rPr>
+        <w:t>├</w:t>
+      </w:r>
+      <w:r>
+        <w:rPr>
+          <w:rFonts w:ascii="Aptos" w:hAnsi="Aptos" w:cs="Aptos"/>
+        </w:rPr>
+        <w:t>────────────────</w:t>
+      </w:r>
+      <w:r>
+        <w:rPr>
+          <w:rFonts w:ascii="MS Gothic" w:eastAsia="MS Gothic" w:hAnsi="MS Gothic" w:cs="MS Gothic" w:hint="eastAsia"/>
+        </w:rPr>
+        <w:t>┼</w:t>
+      </w:r>
+      <w:r>
+        <w:rPr>
+          <w:rFonts w:ascii="Aptos" w:hAnsi="Aptos" w:cs="Aptos"/>
+        </w:rPr>
+        <w:t>─────────────────────────────────────────────────────────────────────────────────────────</w:t>
+      </w:r>
+      <w:r>
+        <w:rPr>
+          <w:rFonts w:ascii="MS Gothic" w:eastAsia="MS Gothic" w:hAnsi="MS Gothic" w:cs="MS Gothic" w:hint="eastAsia"/>
+        </w:rPr>
+        <w:t>┤</w:t>
+      </w:r>
+    </w:p>
+    <w:p>
+      <w:pPr>
+        <w:spacing w:after="0"/>
+      </w:pPr>
+      <w:r>
+        <w:t xml:space="preserve">  │ Migration      │ turso/migrations/006_multi_entity.sql — 5 new tables + entity_id on 11 existing tables  │</w:t>
+      </w:r>
+    </w:p>
+    <w:p>
+      <w:pPr>
+        <w:spacing w:after="0"/>
+      </w:pPr>
+      <w:r>
+        <w:t xml:space="preserve">  </w:t>
+      </w:r>
+      <w:r>
+        <w:rPr>
+          <w:rFonts w:ascii="MS Gothic" w:eastAsia="MS Gothic" w:hAnsi="MS Gothic" w:cs="MS Gothic" w:hint="eastAsia"/>
+        </w:rPr>
+        <w:t>├</w:t>
+      </w:r>
+      <w:r>
+        <w:rPr>
+          <w:rFonts w:ascii="Aptos" w:hAnsi="Aptos" w:cs="Aptos"/>
+        </w:rPr>
+        <w:t>────────────────</w:t>
+      </w:r>
+      <w:r>
+        <w:rPr>
+          <w:rFonts w:ascii="MS Gothic" w:eastAsia="MS Gothic" w:hAnsi="MS Gothic" w:cs="MS Gothic" w:hint="eastAsia"/>
+        </w:rPr>
+        <w:t>┼</w:t>
+      </w:r>
+      <w:r>
+        <w:rPr>
+          <w:rFonts w:ascii="Aptos" w:hAnsi="Aptos" w:cs="Aptos"/>
+        </w:rPr>
+        <w:t>─────────────────────────────────────────────────────────────────────────────────────────</w:t>
+      </w:r>
+      <w:r>
+        <w:rPr>
+          <w:rFonts w:ascii="MS Gothic" w:eastAsia="MS Gothic" w:hAnsi="MS Gothic" w:cs="MS Gothic" w:hint="eastAsia"/>
+        </w:rPr>
+        <w:t>┤</w:t>
+      </w:r>
+    </w:p>
+    <w:p>
+      <w:pPr>
+        <w:spacing w:after="0"/>
+      </w:pPr>
+      <w:r>
+        <w:t xml:space="preserve">  │ API Routes     │ organizations, entities, locations, intercompany, reports/consolidated                  │</w:t>
+      </w:r>
+    </w:p>
+    <w:p>
+      <w:pPr>
+        <w:spacing w:after="0"/>
+      </w:pPr>
+      <w:r>
+        <w:t xml:space="preserve">  </w:t>
+      </w:r>
+      <w:r>
+        <w:rPr>
+          <w:rFonts w:ascii="MS Gothic" w:eastAsia="MS Gothic" w:hAnsi="MS Gothic" w:cs="MS Gothic" w:hint="eastAsia"/>
+        </w:rPr>
+        <w:t>├</w:t>
+      </w:r>
+      <w:r>
+        <w:rPr>
+          <w:rFonts w:ascii="Aptos" w:hAnsi="Aptos" w:cs="Aptos"/>
+        </w:rPr>
+        <w:t>────────────────</w:t>
+      </w:r>
+      <w:r>
+        <w:rPr>
+          <w:rFonts w:ascii="MS Gothic" w:eastAsia="MS Gothic" w:hAnsi="MS Gothic" w:cs="MS Gothic" w:hint="eastAsia"/>
+        </w:rPr>
+        <w:t>┼</w:t>
+      </w:r>
+      <w:r>
+        <w:rPr>
+          <w:rFonts w:ascii="Aptos" w:hAnsi="Aptos" w:cs="Aptos"/>
+        </w:rPr>
+        <w:t>─────────────────────────────────────────────────────────────────────────────────────────</w:t>
+      </w:r>
+      <w:r>
+        <w:rPr>
+          <w:rFonts w:ascii="MS Gothic" w:eastAsia="MS Gothic" w:hAnsi="MS Gothic" w:cs="MS Gothic" w:hint="eastAsia"/>
+        </w:rPr>
+        <w:t>┤</w:t>
+      </w:r>
+    </w:p>
+    <w:p>
+      <w:pPr>
+        <w:spacing w:after="0"/>
+      </w:pPr>
+      <w:r>
+        <w:t xml:space="preserve">  │ Context        │ EntityContext.tsx — provider + useEntity() hook with localStorage persistence           │</w:t>
+      </w:r>
+    </w:p>
+    <w:p>
+      <w:pPr>
+        <w:spacing w:after="0"/>
+      </w:pPr>
+      <w:r>
+        <w:t xml:space="preserve">  </w:t>
+      </w:r>
+      <w:r>
+        <w:rPr>
+          <w:rFonts w:ascii="MS Gothic" w:eastAsia="MS Gothic" w:hAnsi="MS Gothic" w:cs="MS Gothic" w:hint="eastAsia"/>
+        </w:rPr>
+        <w:t>├</w:t>
+      </w:r>
+      <w:r>
+        <w:rPr>
+          <w:rFonts w:ascii="Aptos" w:hAnsi="Aptos" w:cs="Aptos"/>
+        </w:rPr>
+        <w:t>────────────────</w:t>
+      </w:r>
+      <w:r>
+        <w:rPr>
+          <w:rFonts w:ascii="MS Gothic" w:eastAsia="MS Gothic" w:hAnsi="MS Gothic" w:cs="MS Gothic" w:hint="eastAsia"/>
+        </w:rPr>
+        <w:t>┼</w:t>
+      </w:r>
+      <w:r>
+        <w:rPr>
+          <w:rFonts w:ascii="Aptos" w:hAnsi="Aptos" w:cs="Aptos"/>
+        </w:rPr>
+        <w:t>─────────────────────────────────────────────────────────────────────────────────────────</w:t>
+      </w:r>
+      <w:r>
+        <w:rPr>
+          <w:rFonts w:ascii="MS Gothic" w:eastAsia="MS Gothic" w:hAnsi="MS Gothic" w:cs="MS Gothic" w:hint="eastAsia"/>
+        </w:rPr>
+        <w:t>┤</w:t>
+      </w:r>
+    </w:p>
+    <w:p>
+      <w:pPr>
+        <w:spacing w:after="0"/>
+      </w:pPr>
+      <w:r>
+        <w:t xml:space="preserve">  │ Sidebar        │ EntitySwitcher.tsx — dropdown below logo, "All Entities" consolidated view              │</w:t>
+      </w:r>
+    </w:p>
+    <w:p>
+      <w:pPr>
+        <w:spacing w:after="0"/>
+      </w:pPr>
+      <w:r>
+        <w:t xml:space="preserve">  </w:t>
+      </w:r>
+      <w:r>
+        <w:rPr>
+          <w:rFonts w:ascii="MS Gothic" w:eastAsia="MS Gothic" w:hAnsi="MS Gothic" w:cs="MS Gothic" w:hint="eastAsia"/>
+        </w:rPr>
+        <w:t>├</w:t>
+      </w:r>
+      <w:r>
+        <w:rPr>
+          <w:rFonts w:ascii="Aptos" w:hAnsi="Aptos" w:cs="Aptos"/>
+        </w:rPr>
+        <w:t>────────────────</w:t>
+      </w:r>
+      <w:r>
+        <w:rPr>
+          <w:rFonts w:ascii="MS Gothic" w:eastAsia="MS Gothic" w:hAnsi="MS Gothic" w:cs="MS Gothic" w:hint="eastAsia"/>
+        </w:rPr>
+        <w:t>┼</w:t>
+      </w:r>
+      <w:r>
+        <w:rPr>
+          <w:rFonts w:ascii="Aptos" w:hAnsi="Aptos" w:cs="Aptos"/>
+        </w:rPr>
+        <w:t>─────────────────────────────────────────────────────────────────────────────────────────</w:t>
+      </w:r>
+      <w:r>
+        <w:rPr>
+          <w:rFonts w:ascii="MS Gothic" w:eastAsia="MS Gothic" w:hAnsi="MS Gothic" w:cs="MS Gothic" w:hint="eastAsia"/>
+        </w:rPr>
+        <w:t>┤</w:t>
+      </w:r>
+    </w:p>
+    <w:p>
+      <w:pPr>
+        <w:spacing w:after="0"/>
+      </w:pPr>
+      <w:r>
+        <w:t xml:space="preserve">  │ Pages          │ Entity management, intercompany transactions, consolidated cross-entity report          │</w:t>
+      </w:r>
+    </w:p>
+    <w:p>
+      <w:pPr>
+        <w:spacing w:after="0"/>
+      </w:pPr>
+      <w:r>
+        <w:t xml:space="preserve">  </w:t>
+      </w:r>
+      <w:r>
+        <w:rPr>
+          <w:rFonts w:ascii="MS Gothic" w:eastAsia="MS Gothic" w:hAnsi="MS Gothic" w:cs="MS Gothic" w:hint="eastAsia"/>
+        </w:rPr>
+        <w:t>├</w:t>
+      </w:r>
+      <w:r>
+        <w:rPr>
+          <w:rFonts w:ascii="Aptos" w:hAnsi="Aptos" w:cs="Aptos"/>
+        </w:rPr>
+        <w:t>────────────────</w:t>
+      </w:r>
+      <w:r>
+        <w:rPr>
+          <w:rFonts w:ascii="MS Gothic" w:eastAsia="MS Gothic" w:hAnsi="MS Gothic" w:cs="MS Gothic" w:hint="eastAsia"/>
+        </w:rPr>
+        <w:t>┼</w:t>
+      </w:r>
+      <w:r>
+        <w:rPr>
+          <w:rFonts w:ascii="Aptos" w:hAnsi="Aptos" w:cs="Aptos"/>
+        </w:rPr>
+        <w:t>─────────────────────────────────────────────────────────────────────────────────────────</w:t>
+      </w:r>
+      <w:r>
+        <w:rPr>
+          <w:rFonts w:ascii="MS Gothic" w:eastAsia="MS Gothic" w:hAnsi="MS Gothic" w:cs="MS Gothic" w:hint="eastAsia"/>
+        </w:rPr>
+        <w:t>┤</w:t>
+      </w:r>
+    </w:p>
+    <w:p>
+      <w:pPr>
+        <w:spacing w:after="0"/>
+      </w:pPr>
+      <w:r>
+        <w:t xml:space="preserve">  │ Infrastructure │ Updated tursoAdmin.ts relation map, Providers.tsx, DashboardLayout.tsx, reports listing │</w:t>
+      </w:r>
+    </w:p>
+    <w:p>
+      <w:pPr>
+        <w:spacing w:after="0"/>
+      </w:pPr>
+      <w:r>
+        <w:t xml:space="preserve">  └────────────────</w:t>
+      </w:r>
+      <w:r>
+        <w:rPr>
+          <w:rFonts w:ascii="MS Gothic" w:eastAsia="MS Gothic" w:hAnsi="MS Gothic" w:cs="MS Gothic" w:hint="eastAsia"/>
+        </w:rPr>
+        <w:t>┴</w:t>
+      </w:r>
+      <w:r>
+        <w:rPr>
+          <w:rFonts w:ascii="Aptos" w:hAnsi="Aptos" w:cs="Aptos"/>
+        </w:rPr>
+        <w:t>─────────────────────────────────────────────────────────────────────────────────────────┘</w:t>
+      </w:r>
+    </w:p>
+    <w:p>
+      <w:pPr>
+        <w:spacing w:after="0"/>
+      </w:pPr>
+    </w:p>
+    <w:p>
+      <w:pPr>
+        <w:spacing w:after="0"/>
+      </w:pPr>
+      <w:r>
+        <w:lastRenderedPageBreak/>
+        <w:t xml:space="preserve">  Build: 65 pages, 0 TypeScript errors. Migration 006_multi_entity.sql needs to be run against the database when ready.</w:t>
+      </w:r>
+    </w:p>
+    <w:p>
+      <w:pPr>
+        <w:spacing w:after="0"/>
+      </w:pPr>
+    </w:p>
+    <w:p>
+      <w:pPr>
+        <w:spacing w:after="0"/>
+      </w:pPr>
+    </w:p>
+    <w:p>
+      <w:pPr>
+        <w:spacing w:after="0"/>
+      </w:pPr>
+      <w:r>
+        <w:t xml:space="preserve">Sidebar Dropdowns </w:t>
+      </w:r>
+      <w:r>
+        <w:t>–</w:t>
+      </w:r>
+      <w:r>
+        <w:t xml:space="preserve"> Complete</w:t>
+      </w:r>
       <w:r>
         <w:t xml:space="preserve">, </w:t>
       </w:r>
-      <w:proofErr w:type="spellStart"/>
-      <w:r>
-        <w:t>retainage_amount</w:t>
-      </w:r>
-      <w:proofErr w:type="spellEnd"/>
+      <w:r>
+        <w:t>4.1 Database Schema (turso/migrations/006_multi_entity.sql)</w:t>
+      </w:r>
       <w:r>
         <w:t xml:space="preserve">, </w:t>
       </w:r>
-      <w:proofErr w:type="spellStart"/>
-      <w:r>
-        <w:t>retainage_released</w:t>
-      </w:r>
-      <w:proofErr w:type="spellEnd"/>
-      <w:r>
-        <w:t xml:space="preserve"> to invoices and bills</w:t>
-      </w:r>
-    </w:p>
-    <w:p>
-      <w:pPr>
-        <w:spacing w:after="0"/>
-      </w:pPr>
-      <w:r>
-        <w:t xml:space="preserve">  - Added </w:t>
-      </w:r>
-      <w:proofErr w:type="spellStart"/>
-      <w:r>
-        <w:t>retainage_percent</w:t>
-      </w:r>
-      <w:proofErr w:type="spellEnd"/>
-      <w:r>
-        <w:t xml:space="preserve"> (default 10%) to jobs</w:t>
-      </w:r>
-    </w:p>
-    <w:p>
-      <w:pPr>
-        <w:spacing w:after="0"/>
-      </w:pPr>
-    </w:p>
-    <w:p>
-      <w:pPr>
-        <w:spacing w:after="0"/>
-      </w:pPr>
-      <w:r>
-        <w:t xml:space="preserve">  API: </w:t>
-      </w:r>
-      <w:proofErr w:type="spellStart"/>
-      <w:r>
-        <w:t>src</w:t>
-      </w:r>
-      <w:proofErr w:type="spellEnd"/>
-      <w:r>
-        <w:t>/app/</w:t>
-      </w:r>
-      <w:proofErr w:type="spellStart"/>
-      <w:r>
-        <w:t>api</w:t>
-      </w:r>
-      <w:proofErr w:type="spellEnd"/>
-      <w:r>
-        <w:t>/reports/retainage/</w:t>
-      </w:r>
-      <w:proofErr w:type="spellStart"/>
-      <w:r>
-        <w:t>route.ts</w:t>
-      </w:r>
-      <w:proofErr w:type="spellEnd"/>
-    </w:p>
-    <w:p>
-      <w:pPr>
-        <w:spacing w:after="0"/>
-      </w:pPr>
-      <w:r>
-        <w:t xml:space="preserve">  - Retainage receivable aging (what customers owe you)</w:t>
-      </w:r>
-    </w:p>
-    <w:p>
-      <w:pPr>
-        <w:spacing w:after="0"/>
-      </w:pPr>
-      <w:r>
-        <w:t xml:space="preserve">  - Retainage payable aging (what you owe subs)</w:t>
-      </w:r>
-    </w:p>
-    <w:p>
-      <w:pPr>
-        <w:spacing w:after="0"/>
-      </w:pPr>
-      <w:r>
-        <w:t xml:space="preserve">  - Aging buckets: current, 31-60, 61-90, 91-120, 120+ days</w:t>
-      </w:r>
-    </w:p>
-    <w:p>
-      <w:pPr>
-        <w:spacing w:after="0"/>
-      </w:pPr>
-      <w:r>
-        <w:t xml:space="preserve">  - Grouped by job (receivable) or vendor (payable)</w:t>
-      </w:r>
-    </w:p>
-    <w:p>
-      <w:pPr>
-        <w:spacing w:after="0"/>
-      </w:pPr>
-    </w:p>
-    <w:p>
-      <w:pPr>
-        <w:spacing w:after="0"/>
-      </w:pPr>
-      <w:r>
-        <w:t xml:space="preserve">  UI: </w:t>
-      </w:r>
-      <w:proofErr w:type="spellStart"/>
-      <w:r>
-        <w:t>src</w:t>
-      </w:r>
-      <w:proofErr w:type="spellEnd"/>
-      <w:r>
-        <w:t>/app/dashboard/reports/retainage/</w:t>
-      </w:r>
-      <w:proofErr w:type="spellStart"/>
-      <w:r>
-        <w:t>page.tsx</w:t>
-      </w:r>
-      <w:proofErr w:type="spellEnd"/>
-    </w:p>
-    <w:p>
-      <w:pPr>
-        <w:spacing w:after="0"/>
-      </w:pPr>
-      <w:r>
-        <w:t xml:space="preserve">  - Toggle between receivable and payable views</w:t>
-      </w:r>
-    </w:p>
-    <w:p>
-      <w:pPr>
-        <w:spacing w:after="0"/>
-      </w:pPr>
-      <w:r>
-        <w:t xml:space="preserve">  - Summary cards (held, released, outstanding, over 90 days)</w:t>
-      </w:r>
-    </w:p>
-    <w:p>
-      <w:pPr>
-        <w:spacing w:after="0"/>
-      </w:pPr>
-      <w:r>
-        <w:t xml:space="preserve">  - Visual aging breakdown with progress bars</w:t>
-      </w:r>
-    </w:p>
-    <w:p>
-      <w:pPr>
-        <w:spacing w:after="0"/>
-      </w:pPr>
-      <w:r>
-        <w:t xml:space="preserve">  - By-job and by-vendor summaries</w:t>
-      </w:r>
-    </w:p>
-    <w:p>
-      <w:pPr>
-        <w:spacing w:after="0"/>
-      </w:pPr>
-      <w:r>
-        <w:t xml:space="preserve">  - Detail table with all retainage line items</w:t>
-      </w:r>
-    </w:p>
-    <w:p>
-      <w:pPr>
-        <w:spacing w:after="0"/>
-      </w:pPr>
-    </w:p>
-    <w:p>
-      <w:pPr>
-        <w:spacing w:after="0"/>
-      </w:pPr>
-      <w:r>
-        <w:t xml:space="preserve">  Invoice/Bill APIs updated to accept and calculate retainage on creation</w:t>
-      </w:r>
-    </w:p>
-    <w:p>
-      <w:pPr>
-        <w:spacing w:after="0"/>
-      </w:pPr>
-    </w:p>
-    <w:p>
-      <w:pPr>
-        <w:spacing w:after="0"/>
-      </w:pPr>
-      <w:r>
-        <w:t xml:space="preserve">  2.2 Change Order Financial Impact</w:t>
-      </w:r>
-    </w:p>
-    <w:p>
-      <w:pPr>
-        <w:spacing w:after="0"/>
-      </w:pPr>
-    </w:p>
-    <w:p>
-      <w:pPr>
-        <w:spacing w:after="0"/>
-      </w:pPr>
-      <w:r>
-        <w:t xml:space="preserve">  Migration: </w:t>
-      </w:r>
-      <w:proofErr w:type="spellStart"/>
-      <w:r>
-        <w:t>change_orders</w:t>
-      </w:r>
-      <w:proofErr w:type="spellEnd"/>
-      <w:r>
-        <w:t xml:space="preserve"> table with status workflow (draft → pending → approved/rejected)</w:t>
-      </w:r>
-    </w:p>
-    <w:p>
-      <w:pPr>
-        <w:spacing w:after="0"/>
-      </w:pPr>
-    </w:p>
-    <w:p>
-      <w:pPr>
-        <w:spacing w:after="0"/>
-      </w:pPr>
-      <w:r>
-        <w:t xml:space="preserve">  API: </w:t>
-      </w:r>
-      <w:proofErr w:type="spellStart"/>
-      <w:r>
-        <w:t>src</w:t>
-      </w:r>
-      <w:proofErr w:type="spellEnd"/>
-      <w:r>
-        <w:t>/app/</w:t>
-      </w:r>
-      <w:proofErr w:type="spellStart"/>
-      <w:r>
-        <w:t>api</w:t>
-      </w:r>
-      <w:proofErr w:type="spellEnd"/>
-      <w:r>
-        <w:t>/change-orders/</w:t>
-      </w:r>
-      <w:proofErr w:type="spellStart"/>
-      <w:r>
-        <w:t>route.ts</w:t>
-      </w:r>
-      <w:proofErr w:type="spellEnd"/>
-    </w:p>
-    <w:p>
-      <w:pPr>
-        <w:spacing w:after="0"/>
-      </w:pPr>
-      <w:r>
-        <w:t xml:space="preserve">  - Full CRUD with financial impact tracking (revenue, cost, margin, schedule)</w:t>
-      </w:r>
-    </w:p>
-    <w:p>
-      <w:pPr>
-        <w:spacing w:after="0"/>
-      </w:pPr>
-      <w:r>
-        <w:t xml:space="preserve">  - Summary with approved impact, pending exposure, schedule impact</w:t>
-      </w:r>
-    </w:p>
-    <w:p>
-      <w:pPr>
-        <w:spacing w:after="0"/>
-      </w:pPr>
-    </w:p>
-    <w:p>
-      <w:pPr>
-        <w:spacing w:after="0"/>
-      </w:pPr>
-      <w:r>
-        <w:t xml:space="preserve">  UI: </w:t>
-      </w:r>
-      <w:proofErr w:type="spellStart"/>
-      <w:r>
-        <w:t>src</w:t>
-      </w:r>
-      <w:proofErr w:type="spellEnd"/>
-      <w:r>
-        <w:t>/app/dashboard/jobs/[id]/change-orders/</w:t>
-      </w:r>
-      <w:proofErr w:type="spellStart"/>
-      <w:r>
-        <w:t>page.tsx</w:t>
-      </w:r>
-      <w:proofErr w:type="spellEnd"/>
-    </w:p>
-    <w:p>
-      <w:pPr>
-        <w:spacing w:after="0"/>
-      </w:pPr>
-      <w:r>
-        <w:t xml:space="preserve">  - Create/edit/delete change orders per job</w:t>
-      </w:r>
-    </w:p>
-    <w:p>
-      <w:pPr>
-        <w:spacing w:after="0"/>
-      </w:pPr>
-      <w:r>
-        <w:t xml:space="preserve">  - Status workflow with approve/reject actions</w:t>
-      </w:r>
-    </w:p>
-    <w:p>
-      <w:pPr>
-        <w:spacing w:after="0"/>
-      </w:pPr>
-      <w:r>
-        <w:t xml:space="preserve">  - Financial impact summary (revised contract, margin, pending exposure, schedule)</w:t>
-      </w:r>
-    </w:p>
-    <w:p>
-      <w:pPr>
-        <w:spacing w:after="0"/>
-      </w:pPr>
-      <w:r>
-        <w:t xml:space="preserve">  - Real-time margin impact preview in form</w:t>
-      </w:r>
-    </w:p>
-    <w:p>
-      <w:pPr>
-        <w:spacing w:after="0"/>
-      </w:pPr>
-    </w:p>
-    <w:p>
-      <w:pPr>
-        <w:spacing w:after="0"/>
-      </w:pPr>
-      <w:r>
-        <w:t xml:space="preserve">  Financial Summary API updated:</w:t>
-      </w:r>
-    </w:p>
-    <w:p>
-      <w:pPr>
-        <w:spacing w:after="0"/>
-      </w:pPr>
-      <w:r>
-        <w:t xml:space="preserve">  - Contract value now = Original + Approved COs (revised contract value)</w:t>
-      </w:r>
-    </w:p>
-    <w:p>
-      <w:pPr>
-        <w:spacing w:after="0"/>
-      </w:pPr>
-      <w:r>
-        <w:t xml:space="preserve">  - Estimated cost now includes approved CO cost impact</w:t>
-      </w:r>
-    </w:p>
-    <w:p>
-      <w:pPr>
-        <w:spacing w:after="0"/>
-      </w:pPr>
-      <w:r>
-        <w:t xml:space="preserve">  - New </w:t>
-      </w:r>
-      <w:proofErr w:type="spellStart"/>
-      <w:r>
-        <w:t>change_orders</w:t>
-      </w:r>
-      <w:proofErr w:type="spellEnd"/>
-      <w:r>
-        <w:t xml:space="preserve"> section in response</w:t>
-      </w:r>
-    </w:p>
-    <w:p>
-      <w:pPr>
-        <w:spacing w:after="0"/>
-      </w:pPr>
-      <w:r>
-        <w:t xml:space="preserve">  - New retainage section (receivable + payable + net position)</w:t>
-      </w:r>
-    </w:p>
-    <w:p>
-      <w:pPr>
-        <w:spacing w:after="0"/>
-      </w:pPr>
-      <w:r>
-        <w:t xml:space="preserve">  - Risk alerts for retainage accumulation and pending CO exposure</w:t>
-      </w:r>
-    </w:p>
-    <w:p>
-      <w:pPr>
-        <w:spacing w:after="0"/>
-      </w:pPr>
-    </w:p>
-    <w:p>
-      <w:pPr>
-        <w:spacing w:after="0"/>
-      </w:pPr>
-      <w:r>
-        <w:t xml:space="preserve">  2.3 Over/Under Billing Enhancement</w:t>
-      </w:r>
-    </w:p>
-    <w:p>
-      <w:pPr>
-        <w:spacing w:after="0"/>
-      </w:pPr>
-    </w:p>
-    <w:p>
-      <w:pPr>
-        <w:spacing w:after="0"/>
-      </w:pPr>
-      <w:r>
-        <w:t xml:space="preserve">  WIP Report API updated:</w:t>
-      </w:r>
-    </w:p>
-    <w:p>
-      <w:pPr>
-        <w:spacing w:after="0"/>
-      </w:pPr>
-      <w:r>
-        <w:t xml:space="preserve">  - Now uses revised contract values (incorporating change orders)</w:t>
-      </w:r>
-    </w:p>
-    <w:p>
-      <w:pPr>
-        <w:spacing w:after="0"/>
-      </w:pPr>
-      <w:r>
-        <w:t xml:space="preserve">  - Added </w:t>
-      </w:r>
-      <w:proofErr w:type="spellStart"/>
-      <w:r>
-        <w:t>billing_trend</w:t>
-      </w:r>
-      <w:proofErr w:type="spellEnd"/>
-      <w:r>
-        <w:t xml:space="preserve"> field per job (improving/stable/worsening)</w:t>
-      </w:r>
-    </w:p>
-    <w:p>
-      <w:pPr>
-        <w:spacing w:after="0"/>
-      </w:pPr>
-      <w:r>
-        <w:t xml:space="preserve">  - Added retainage receivable/payable per job</w:t>
-      </w:r>
-    </w:p>
-    <w:p>
-      <w:pPr>
-        <w:spacing w:after="0"/>
-      </w:pPr>
-      <w:r>
-        <w:t xml:space="preserve">  - Added change order counts per job</w:t>
-      </w:r>
-    </w:p>
-    <w:p>
-      <w:pPr>
-        <w:spacing w:after="0"/>
-      </w:pPr>
-      <w:r>
-        <w:t xml:space="preserve">  - Enhanced summary with </w:t>
-      </w:r>
-      <w:proofErr w:type="spellStart"/>
-      <w:r>
-        <w:t>jobs_overbilled</w:t>
-      </w:r>
-      <w:proofErr w:type="spellEnd"/>
+      <w:r>
+        <w:t>4.2 API Routes</w:t>
+      </w:r>
       <w:r>
         <w:t xml:space="preserve">, </w:t>
       </w:r>
-      <w:proofErr w:type="spellStart"/>
-      <w:r>
-        <w:t>jobs_underbilled</w:t>
-      </w:r>
-      <w:proofErr w:type="spellEnd"/>
+      <w:r>
+        <w:t>4.3 User Roles</w:t>
+      </w:r>
       <w:r>
         <w:t xml:space="preserve">, </w:t>
       </w:r>
-      <w:proofErr w:type="spellStart"/>
-      <w:r>
-        <w:t>jobs_worsening</w:t>
-      </w:r>
-      <w:proofErr w:type="spellEnd"/>
-      <w:r>
-        <w:t xml:space="preserve"> counts</w:t>
-      </w:r>
-    </w:p>
-    <w:p>
-      <w:pPr>
-        <w:spacing w:after="0"/>
-      </w:pPr>
-      <w:r>
-        <w:t xml:space="preserve">  - Added </w:t>
-      </w:r>
-      <w:proofErr w:type="spellStart"/>
-      <w:r>
-        <w:t>total_retainage_receivable</w:t>
-      </w:r>
-      <w:proofErr w:type="spellEnd"/>
-      <w:r>
-        <w:t xml:space="preserve"> and </w:t>
-      </w:r>
-      <w:proofErr w:type="spellStart"/>
-      <w:r>
-        <w:t>total_retainage_payable</w:t>
-      </w:r>
-      <w:proofErr w:type="spellEnd"/>
-      <w:r>
-        <w:t xml:space="preserve"> to summary</w:t>
-      </w:r>
-    </w:p>
-    <w:p>
-      <w:pPr>
-        <w:spacing w:after="0"/>
-      </w:pPr>
-    </w:p>
-    <w:p>
-      <w:pPr>
-        <w:spacing w:after="0"/>
-      </w:pPr>
-      <w:r>
-        <w:t xml:space="preserve">  Reports index updated with Retainage Aging report under Job Costing category.</w:t>
-      </w:r>
-    </w:p>
-    <w:p>
-      <w:pPr>
-        <w:spacing w:after="0"/>
-      </w:pPr>
-    </w:p>
-    <w:p>
-      <w:pPr>
-        <w:spacing w:after="0"/>
-      </w:pPr>
-      <w:r>
-        <w:t xml:space="preserve">  Job detail page updated with Change Orders button and retainage/CO sections in Financial tab.</w:t>
-      </w:r>
+      <w:r>
+        <w:t>4.4 Entity Switcher UI</w:t>
+      </w:r>
+      <w:r>
+        <w:t xml:space="preserve">, </w:t>
+      </w:r>
+      <w:r>
+        <w:t xml:space="preserve">  4.5 Management Pages</w:t>
+      </w:r>
+      <w:r>
+        <w:t xml:space="preserve">, </w:t>
+      </w:r>
+      <w:r>
+        <w:t>4.6 Infrastructure</w:t>
+      </w:r>
+      <w:r>
+        <w:t xml:space="preserve">, </w:t>
+      </w:r>
+      <w:r>
+        <w:t>6 collapsible categories with chevron animation</w:t>
+      </w:r>
+      <w:r>
+        <w:t xml:space="preserve"> </w:t>
+      </w:r>
+      <w:r>
+        <w:t>- Auto-expands category matching current route</w:t>
+      </w:r>
+    </w:p>
+    <w:p>
+      <w:pPr>
+        <w:spacing w:after="0"/>
+      </w:pPr>
+      <w:r>
+        <w:t xml:space="preserve">  - Dashboard pinned at top, Entities + Settings pinned at bottom</w:t>
+      </w:r>
+    </w:p>
+    <w:p>
+      <w:pPr>
+        <w:spacing w:after="0"/>
+      </w:pPr>
     </w:p>
     <w:p>
       <w:pPr>
@@ -3484,7 +4427,7 @@
   <w:style w:type="paragraph" w:default="1" w:styleId="Normal">
     <w:name w:val="Normal"/>
     <w:qFormat/>
-    <w:rsid w:val="00695E10"/>
+    <w:rsid w:val="00A321B2"/>
   </w:style>
   <w:style w:type="paragraph" w:styleId="Heading1">
     <w:name w:val="heading 1"/>

</xml_diff>

<commit_message>
debugg login issues fixed
</commit_message>
<xml_diff>
--- a/3-7-26 Books Made Easy changes.docx
+++ b/3-7-26 Books Made Easy changes.docx
@@ -118,7 +118,39 @@
         <w:spacing w:after="0"/>
       </w:pPr>
       <w:r>
-        <w:t xml:space="preserve">  │ WIP Calculation Engine     │ DONE               │ Just built — reports/wip/route.ts + reports/wip/page.tsx      │</w:t>
+        <w:t xml:space="preserve">  │ WIP Calculation Engine     │ DONE               │ Just built — reports/</w:t>
+      </w:r>
+      <w:proofErr w:type="spellStart"/>
+      <w:r>
+        <w:t>wip</w:t>
+      </w:r>
+      <w:proofErr w:type="spellEnd"/>
+      <w:r>
+        <w:t>/</w:t>
+      </w:r>
+      <w:proofErr w:type="spellStart"/>
+      <w:r>
+        <w:t>route.ts</w:t>
+      </w:r>
+      <w:proofErr w:type="spellEnd"/>
+      <w:r>
+        <w:t xml:space="preserve"> + reports/</w:t>
+      </w:r>
+      <w:proofErr w:type="spellStart"/>
+      <w:r>
+        <w:t>wip</w:t>
+      </w:r>
+      <w:proofErr w:type="spellEnd"/>
+      <w:r>
+        <w:t>/</w:t>
+      </w:r>
+      <w:proofErr w:type="spellStart"/>
+      <w:r>
+        <w:t>page.tsx</w:t>
+      </w:r>
+      <w:proofErr w:type="spellEnd"/>
+      <w:r>
+        <w:t xml:space="preserve">      │</w:t>
       </w:r>
     </w:p>
     <w:p>
@@ -242,15 +274,39 @@
         <w:spacing w:after="0"/>
       </w:pPr>
       <w:r>
-        <w:t xml:space="preserve">  │ Cost Codes (CSI)           │ EXISTS in          │ cost_codes table, CRUD API, UI page                           │</w:t>
-      </w:r>
-    </w:p>
-    <w:p>
-      <w:pPr>
-        <w:spacing w:after="0"/>
-      </w:pPr>
-      <w:r>
-        <w:t xml:space="preserve">  │                            │ SiteSense          │                                                               │</w:t>
+        <w:t xml:space="preserve">  │ Cost Codes (</w:t>
+      </w:r>
+      <w:proofErr w:type="gramStart"/>
+      <w:r>
+        <w:t xml:space="preserve">CSI)   </w:t>
+      </w:r>
+      <w:proofErr w:type="gramEnd"/>
+      <w:r>
+        <w:t xml:space="preserve">        │ EXISTS in          │ </w:t>
+      </w:r>
+      <w:proofErr w:type="spellStart"/>
+      <w:r>
+        <w:t>cost_codes</w:t>
+      </w:r>
+      <w:proofErr w:type="spellEnd"/>
+      <w:r>
+        <w:t xml:space="preserve"> table, CRUD API, UI page                           │</w:t>
+      </w:r>
+    </w:p>
+    <w:p>
+      <w:pPr>
+        <w:spacing w:after="0"/>
+      </w:pPr>
+      <w:r>
+        <w:t xml:space="preserve">  │                            │ </w:t>
+      </w:r>
+      <w:proofErr w:type="spellStart"/>
+      <w:r>
+        <w:t>SiteSense</w:t>
+      </w:r>
+      <w:proofErr w:type="spellEnd"/>
+      <w:r>
+        <w:t xml:space="preserve">          │                                                               │</w:t>
       </w:r>
     </w:p>
     <w:p>
@@ -308,15 +364,31 @@
         <w:spacing w:after="0"/>
       </w:pPr>
       <w:r>
-        <w:t xml:space="preserve">  │ Schedule of Values (SOV)   │ EXISTS in          │ Full CRUD with line items, % complete, balance to finish      │</w:t>
-      </w:r>
-    </w:p>
-    <w:p>
-      <w:pPr>
-        <w:spacing w:after="0"/>
-      </w:pPr>
-      <w:r>
-        <w:t xml:space="preserve">  │                            │ SiteSense          │                                                               │</w:t>
+        <w:t xml:space="preserve">  │ Schedule of Values (</w:t>
+      </w:r>
+      <w:proofErr w:type="gramStart"/>
+      <w:r>
+        <w:t xml:space="preserve">SOV)   </w:t>
+      </w:r>
+      <w:proofErr w:type="gramEnd"/>
+      <w:r>
+        <w:t>│ EXISTS in          │ Full CRUD with line items, % complete, balance to finish      │</w:t>
+      </w:r>
+    </w:p>
+    <w:p>
+      <w:pPr>
+        <w:spacing w:after="0"/>
+      </w:pPr>
+      <w:r>
+        <w:t xml:space="preserve">  │                            │ </w:t>
+      </w:r>
+      <w:proofErr w:type="spellStart"/>
+      <w:r>
+        <w:t>SiteSense</w:t>
+      </w:r>
+      <w:proofErr w:type="spellEnd"/>
+      <w:r>
+        <w:t xml:space="preserve">          │                                                               │</w:t>
       </w:r>
     </w:p>
     <w:p>
@@ -374,15 +446,47 @@
         <w:spacing w:after="0"/>
       </w:pPr>
       <w:r>
-        <w:t xml:space="preserve">  │ Retainage Tracking         │ SCHEMA ONLY in     │ sov_line_items.retainage_percent + retainage_held fields      │</w:t>
-      </w:r>
-    </w:p>
-    <w:p>
-      <w:pPr>
-        <w:spacing w:after="0"/>
-      </w:pPr>
-      <w:r>
-        <w:t xml:space="preserve">  │                            │ SiteSense          │ exist, but no API/UI                                          │</w:t>
+        <w:t xml:space="preserve">  │ Retainage Tracking         │ SCHEMA ONLY in     │ </w:t>
+      </w:r>
+      <w:proofErr w:type="spellStart"/>
+      <w:r>
+        <w:t>sov_line_</w:t>
+      </w:r>
+      <w:proofErr w:type="gramStart"/>
+      <w:r>
+        <w:t>items.retainage</w:t>
+      </w:r>
+      <w:proofErr w:type="gramEnd"/>
+      <w:r>
+        <w:t>_percent</w:t>
+      </w:r>
+      <w:proofErr w:type="spellEnd"/>
+      <w:r>
+        <w:t xml:space="preserve"> + </w:t>
+      </w:r>
+      <w:proofErr w:type="spellStart"/>
+      <w:r>
+        <w:t>retainage_held</w:t>
+      </w:r>
+      <w:proofErr w:type="spellEnd"/>
+      <w:r>
+        <w:t xml:space="preserve"> fields      │</w:t>
+      </w:r>
+    </w:p>
+    <w:p>
+      <w:pPr>
+        <w:spacing w:after="0"/>
+      </w:pPr>
+      <w:r>
+        <w:t xml:space="preserve">  │                            │ </w:t>
+      </w:r>
+      <w:proofErr w:type="spellStart"/>
+      <w:r>
+        <w:t>SiteSense</w:t>
+      </w:r>
+      <w:proofErr w:type="spellEnd"/>
+      <w:r>
+        <w:t xml:space="preserve">          │ exist, but no API/UI                                          │</w:t>
       </w:r>
     </w:p>
     <w:p>
@@ -440,15 +544,31 @@
         <w:spacing w:after="0"/>
       </w:pPr>
       <w:r>
-        <w:t xml:space="preserve">  │ Change Orders              │ SCHEMA ONLY in     │ change_orders table exists, no API routes or pages            │</w:t>
-      </w:r>
-    </w:p>
-    <w:p>
-      <w:pPr>
-        <w:spacing w:after="0"/>
-      </w:pPr>
-      <w:r>
-        <w:t xml:space="preserve">  │                            │ SiteSense          │                                                               │</w:t>
+        <w:t xml:space="preserve">  │ Change Orders              │ SCHEMA ONLY in     │ </w:t>
+      </w:r>
+      <w:proofErr w:type="spellStart"/>
+      <w:r>
+        <w:t>change_orders</w:t>
+      </w:r>
+      <w:proofErr w:type="spellEnd"/>
+      <w:r>
+        <w:t xml:space="preserve"> table exists, no API routes or pages            │</w:t>
+      </w:r>
+    </w:p>
+    <w:p>
+      <w:pPr>
+        <w:spacing w:after="0"/>
+      </w:pPr>
+      <w:r>
+        <w:t xml:space="preserve">  │                            │ </w:t>
+      </w:r>
+      <w:proofErr w:type="spellStart"/>
+      <w:r>
+        <w:t>SiteSense</w:t>
+      </w:r>
+      <w:proofErr w:type="spellEnd"/>
+      <w:r>
+        <w:t xml:space="preserve">          │                                                               │</w:t>
       </w:r>
     </w:p>
     <w:p>
@@ -506,7 +626,23 @@
         <w:spacing w:after="0"/>
       </w:pPr>
       <w:r>
-        <w:t xml:space="preserve">  │ Burn Rate / Spending       │ PARTIAL            │ forecasting.ts + analytics.ts in Books Your Way — daily       │</w:t>
+        <w:t xml:space="preserve">  │ Burn Rate / Spending       │ PARTIAL            │ </w:t>
+      </w:r>
+      <w:proofErr w:type="spellStart"/>
+      <w:r>
+        <w:t>forecasting.ts</w:t>
+      </w:r>
+      <w:proofErr w:type="spellEnd"/>
+      <w:r>
+        <w:t xml:space="preserve"> + </w:t>
+      </w:r>
+      <w:proofErr w:type="spellStart"/>
+      <w:r>
+        <w:t>analytics.ts</w:t>
+      </w:r>
+      <w:proofErr w:type="spellEnd"/>
+      <w:r>
+        <w:t xml:space="preserve"> in Books Your Way — daily       │</w:t>
       </w:r>
     </w:p>
     <w:p>
@@ -572,7 +708,15 @@
         <w:spacing w:after="0"/>
       </w:pPr>
       <w:r>
-        <w:t xml:space="preserve">  │ Risk Alerts                │ PARTIAL            │ PredictiveAlerts.tsx — budget warnings, spending spikes       │</w:t>
+        <w:t xml:space="preserve">  │ Risk Alerts                │ PARTIAL            │ </w:t>
+      </w:r>
+      <w:proofErr w:type="spellStart"/>
+      <w:r>
+        <w:t>PredictiveAlerts.tsx</w:t>
+      </w:r>
+      <w:proofErr w:type="spellEnd"/>
+      <w:r>
+        <w:t xml:space="preserve"> — budget warnings, spending spikes       │</w:t>
       </w:r>
     </w:p>
     <w:p>
@@ -630,7 +774,15 @@
         <w:spacing w:after="0"/>
       </w:pPr>
       <w:r>
-        <w:t xml:space="preserve">  │ Budgets                    │ EXISTS (basic)     │ Category-based in both apps, but not per cost code            │</w:t>
+        <w:t xml:space="preserve">  │ Budgets                    │ EXISTS (</w:t>
+      </w:r>
+      <w:proofErr w:type="gramStart"/>
+      <w:r>
+        <w:t xml:space="preserve">basic)   </w:t>
+      </w:r>
+      <w:proofErr w:type="gramEnd"/>
+      <w:r>
+        <w:t xml:space="preserve">  │ Category-based in both apps, but not per cost code            │</w:t>
       </w:r>
     </w:p>
     <w:p>
@@ -688,7 +840,15 @@
         <w:spacing w:after="0"/>
       </w:pPr>
       <w:r>
-        <w:t xml:space="preserve">  │ Retainage Engine (full)    │ NEEDS BUILD        │ Per-invoice retainage %, withheld/released, AR/AP aging       │</w:t>
+        <w:t xml:space="preserve">  │ Retainage Engine (</w:t>
+      </w:r>
+      <w:proofErr w:type="gramStart"/>
+      <w:r>
+        <w:t xml:space="preserve">full)   </w:t>
+      </w:r>
+      <w:proofErr w:type="gramEnd"/>
+      <w:r>
+        <w:t xml:space="preserve"> │ NEEDS BUILD        │ Per-invoice retainage %, withheld/released, AR/AP aging       │</w:t>
       </w:r>
     </w:p>
     <w:p>
@@ -813,7 +973,15 @@
         <w:spacing w:after="0"/>
       </w:pPr>
       <w:r>
-        <w:t xml:space="preserve">  │ Cost Code Variance Engine  │ NEEDS BUILD        │ Budget vs actual vs variance per cost code, trend direction   │</w:t>
+        <w:t xml:space="preserve">  │ Cost Code Variance </w:t>
+      </w:r>
+      <w:proofErr w:type="gramStart"/>
+      <w:r>
+        <w:t>Engine  │</w:t>
+      </w:r>
+      <w:proofErr w:type="gramEnd"/>
+      <w:r>
+        <w:t xml:space="preserve"> NEEDS BUILD        │ Budget vs actual vs variance per cost code, trend direction   │</w:t>
       </w:r>
     </w:p>
     <w:p>
@@ -937,7 +1105,15 @@
         <w:spacing w:after="0"/>
       </w:pPr>
       <w:r>
-        <w:t xml:space="preserve">  │ Project Financial Summary  │ NEEDS BUILD        │ Consolidated financial view per project                       │</w:t>
+        <w:t xml:space="preserve">  │ Project Financial </w:t>
+      </w:r>
+      <w:proofErr w:type="gramStart"/>
+      <w:r>
+        <w:t>Summary  │</w:t>
+      </w:r>
+      <w:proofErr w:type="gramEnd"/>
+      <w:r>
+        <w:t xml:space="preserve"> NEEDS BUILD        │ Consolidated financial view per project                       │</w:t>
       </w:r>
     </w:p>
     <w:p>
@@ -1061,7 +1237,15 @@
         <w:spacing w:after="0"/>
       </w:pPr>
       <w:r>
-        <w:t xml:space="preserve">  │ Margin Forecasting Engine  │ NEEDS BUILD        │ Projected margin based on cost trends                         │</w:t>
+        <w:t xml:space="preserve">  │ Margin Forecasting </w:t>
+      </w:r>
+      <w:proofErr w:type="gramStart"/>
+      <w:r>
+        <w:t>Engine  │</w:t>
+      </w:r>
+      <w:proofErr w:type="gramEnd"/>
+      <w:r>
+        <w:t xml:space="preserve"> NEEDS BUILD        │ Projected margin based on cost trends                         │</w:t>
       </w:r>
     </w:p>
     <w:p>
@@ -1127,20 +1311,36 @@
         <w:spacing w:after="0"/>
       </w:pPr>
       <w:r>
-        <w:t xml:space="preserve">  Follow your phased approach, but adjust for what exists:</w:t>
-      </w:r>
-    </w:p>
-    <w:p>
-      <w:pPr>
-        <w:spacing w:after="0"/>
-      </w:pPr>
-    </w:p>
-    <w:p>
-      <w:pPr>
-        <w:spacing w:after="0"/>
-      </w:pPr>
-      <w:r>
-        <w:t xml:space="preserve">  Phase 1 (Critical Foundation) — Build in Books Your Way:</w:t>
+        <w:t xml:space="preserve">  Follow your phased approach, but adjust </w:t>
+      </w:r>
+      <w:proofErr w:type="gramStart"/>
+      <w:r>
+        <w:t>for</w:t>
+      </w:r>
+      <w:proofErr w:type="gramEnd"/>
+      <w:r>
+        <w:t xml:space="preserve"> what exists:</w:t>
+      </w:r>
+    </w:p>
+    <w:p>
+      <w:pPr>
+        <w:spacing w:after="0"/>
+      </w:pPr>
+    </w:p>
+    <w:p>
+      <w:pPr>
+        <w:spacing w:after="0"/>
+      </w:pPr>
+      <w:r>
+        <w:t xml:space="preserve">  Phase 1 (Critical </w:t>
+      </w:r>
+      <w:proofErr w:type="gramStart"/>
+      <w:r>
+        <w:t>Foundation) —</w:t>
+      </w:r>
+      <w:proofErr w:type="gramEnd"/>
+      <w:r>
+        <w:t xml:space="preserve"> Build in Books Your Way:</w:t>
       </w:r>
     </w:p>
     <w:p>
@@ -1164,7 +1364,15 @@
         <w:spacing w:after="0"/>
       </w:pPr>
       <w:r>
-        <w:t xml:space="preserve">  2. Cost Code Variance Engine — Leverage SiteSense's existing CSI cost codes, add budget-vs-actual tracking with</w:t>
+        <w:t xml:space="preserve">  2. Cost Code Variance Engine — Leverage </w:t>
+      </w:r>
+      <w:proofErr w:type="spellStart"/>
+      <w:r>
+        <w:t>SiteSense's</w:t>
+      </w:r>
+      <w:proofErr w:type="spellEnd"/>
+      <w:r>
+        <w:t xml:space="preserve"> existing CSI cost codes, add budget-vs-actual tracking with</w:t>
       </w:r>
     </w:p>
     <w:p>
@@ -1201,15 +1409,39 @@
         <w:spacing w:after="0"/>
       </w:pPr>
       <w:r>
-        <w:t xml:space="preserve">  Phase 2 (Construction-Grade) — WIP is done, so focus on:</w:t>
-      </w:r>
-    </w:p>
-    <w:p>
-      <w:pPr>
-        <w:spacing w:after="0"/>
-      </w:pPr>
-      <w:r>
-        <w:t xml:space="preserve">  1. Retainage Engine — Build the full lifecycle (SiteSense already has the schema fields, need API + UI + aging reports</w:t>
+        <w:t xml:space="preserve">  Phase 2 (Construction-</w:t>
+      </w:r>
+      <w:proofErr w:type="gramStart"/>
+      <w:r>
+        <w:t>Grade) —</w:t>
+      </w:r>
+      <w:proofErr w:type="gramEnd"/>
+      <w:r>
+        <w:t xml:space="preserve"> WIP is done, so focus on:</w:t>
+      </w:r>
+    </w:p>
+    <w:p>
+      <w:pPr>
+        <w:spacing w:after="0"/>
+      </w:pPr>
+      <w:r>
+        <w:t xml:space="preserve">  1. Retainage Engine — Build the </w:t>
+      </w:r>
+      <w:proofErr w:type="gramStart"/>
+      <w:r>
+        <w:t>full lifecycle</w:t>
+      </w:r>
+      <w:proofErr w:type="gramEnd"/>
+      <w:r>
+        <w:t xml:space="preserve"> (</w:t>
+      </w:r>
+      <w:proofErr w:type="spellStart"/>
+      <w:r>
+        <w:t>SiteSense</w:t>
+      </w:r>
+      <w:proofErr w:type="spellEnd"/>
+      <w:r>
+        <w:t xml:space="preserve"> already has the schema fields, need API + UI + aging reports</w:t>
       </w:r>
     </w:p>
     <w:p>
@@ -1226,15 +1458,39 @@
       </w:pPr>
       <w:r>
         <w:lastRenderedPageBreak/>
-        <w:t xml:space="preserve">  2. Change Order Financial Impact — Build API routes for SiteSense's existing change_orders table, then model the</w:t>
-      </w:r>
-    </w:p>
-    <w:p>
-      <w:pPr>
-        <w:spacing w:after="0"/>
-      </w:pPr>
-      <w:r>
-        <w:t xml:space="preserve">  financial impact in Books Your Way</w:t>
+        <w:t xml:space="preserve">  2. Change Order Financial Impact — Build API routes for </w:t>
+      </w:r>
+      <w:proofErr w:type="spellStart"/>
+      <w:r>
+        <w:t>SiteSense's</w:t>
+      </w:r>
+      <w:proofErr w:type="spellEnd"/>
+      <w:r>
+        <w:t xml:space="preserve"> existing </w:t>
+      </w:r>
+      <w:proofErr w:type="spellStart"/>
+      <w:r>
+        <w:t>change_orders</w:t>
+      </w:r>
+      <w:proofErr w:type="spellEnd"/>
+      <w:r>
+        <w:t xml:space="preserve"> table, then model the</w:t>
+      </w:r>
+    </w:p>
+    <w:p>
+      <w:pPr>
+        <w:spacing w:after="0"/>
+      </w:pPr>
+      <w:r>
+        <w:t xml:space="preserve">  financial impact </w:t>
+      </w:r>
+      <w:proofErr w:type="gramStart"/>
+      <w:r>
+        <w:t>in</w:t>
+      </w:r>
+      <w:proofErr w:type="gramEnd"/>
+      <w:r>
+        <w:t xml:space="preserve"> Books Your Way</w:t>
       </w:r>
     </w:p>
     <w:p>
@@ -1263,15 +1519,31 @@
         <w:spacing w:after="0"/>
       </w:pPr>
       <w:r>
-        <w:t xml:space="preserve">  2. Burn Rate Modeling — Extend your existing forecasting.ts to per-project level</w:t>
-      </w:r>
-    </w:p>
-    <w:p>
-      <w:pPr>
-        <w:spacing w:after="0"/>
-      </w:pPr>
-      <w:r>
-        <w:t xml:space="preserve">  3. Risk Alerts — Extend existing PredictiveAlerts.tsx with construction-specific triggers (retainage thresholds, CO</w:t>
+        <w:t xml:space="preserve">  2. Burn Rate Modeling — Extend your existing </w:t>
+      </w:r>
+      <w:proofErr w:type="spellStart"/>
+      <w:r>
+        <w:t>forecasting.ts</w:t>
+      </w:r>
+      <w:proofErr w:type="spellEnd"/>
+      <w:r>
+        <w:t xml:space="preserve"> to per-project level</w:t>
+      </w:r>
+    </w:p>
+    <w:p>
+      <w:pPr>
+        <w:spacing w:after="0"/>
+      </w:pPr>
+      <w:r>
+        <w:t xml:space="preserve">  3. Risk Alerts — Extend existing </w:t>
+      </w:r>
+      <w:proofErr w:type="spellStart"/>
+      <w:r>
+        <w:t>PredictiveAlerts.tsx</w:t>
+      </w:r>
+      <w:proofErr w:type="spellEnd"/>
+      <w:r>
+        <w:t xml:space="preserve"> with construction-specific triggers (retainage thresholds, CO</w:t>
       </w:r>
     </w:p>
     <w:p>
@@ -1305,15 +1577,31 @@
         <w:spacing w:after="0"/>
       </w:pPr>
       <w:r>
-        <w:t xml:space="preserve">  Since SiteSense already has cost codes, SOV, change orders, and retainage schema — the smart play is to build the</w:t>
-      </w:r>
-    </w:p>
-    <w:p>
-      <w:pPr>
-        <w:spacing w:after="0"/>
-      </w:pPr>
-      <w:r>
-        <w:t xml:space="preserve">  financial calculation engines in Books Your Way while keeping the operational data in SiteSense. The sync layer</w:t>
+        <w:t xml:space="preserve">  Since </w:t>
+      </w:r>
+      <w:proofErr w:type="spellStart"/>
+      <w:r>
+        <w:t>SiteSense</w:t>
+      </w:r>
+      <w:proofErr w:type="spellEnd"/>
+      <w:r>
+        <w:t xml:space="preserve"> already has cost codes, SOV, change orders, and retainage schema — the smart play is to build the</w:t>
+      </w:r>
+    </w:p>
+    <w:p>
+      <w:pPr>
+        <w:spacing w:after="0"/>
+      </w:pPr>
+      <w:r>
+        <w:t xml:space="preserve">  financial calculation engines in Books Your Way while keeping the operational data in </w:t>
+      </w:r>
+      <w:proofErr w:type="spellStart"/>
+      <w:r>
+        <w:t>SiteSense</w:t>
+      </w:r>
+      <w:proofErr w:type="spellEnd"/>
+      <w:r>
+        <w:t>. The sync layer</w:t>
       </w:r>
     </w:p>
     <w:p>
@@ -1383,20 +1671,48 @@
         <w:t>, added d</w:t>
       </w:r>
       <w:r>
-        <w:t>isplays: risk alerts, summary cards, billing position panel, cost breakdown, profitability analysis,burn rate,completion progress bars</w:t>
-      </w:r>
-    </w:p>
-    <w:p>
-      <w:pPr>
-        <w:spacing w:after="0"/>
-      </w:pPr>
-    </w:p>
-    <w:p>
-      <w:pPr>
-        <w:spacing w:after="0"/>
-      </w:pPr>
-      <w:r>
-        <w:t>That's a pre-existing WSL2 file permission issue with .next cache, not related to our code. The important part is</w:t>
+        <w:t xml:space="preserve">isplays: risk alerts, summary cards, billing position panel, cost breakdown, profitability </w:t>
+      </w:r>
+      <w:proofErr w:type="spellStart"/>
+      <w:proofErr w:type="gramStart"/>
+      <w:r>
+        <w:t>analysis,burn</w:t>
+      </w:r>
+      <w:proofErr w:type="spellEnd"/>
+      <w:proofErr w:type="gramEnd"/>
+      <w:r>
+        <w:t xml:space="preserve"> </w:t>
+      </w:r>
+      <w:proofErr w:type="spellStart"/>
+      <w:proofErr w:type="gramStart"/>
+      <w:r>
+        <w:t>rate,completion</w:t>
+      </w:r>
+      <w:proofErr w:type="spellEnd"/>
+      <w:proofErr w:type="gramEnd"/>
+      <w:r>
+        <w:t xml:space="preserve"> progress bars</w:t>
+      </w:r>
+    </w:p>
+    <w:p>
+      <w:pPr>
+        <w:spacing w:after="0"/>
+      </w:pPr>
+    </w:p>
+    <w:p>
+      <w:pPr>
+        <w:spacing w:after="0"/>
+      </w:pPr>
+      <w:r>
+        <w:t xml:space="preserve">That's a pre-existing WSL2 file permission issue </w:t>
+      </w:r>
+      <w:proofErr w:type="gramStart"/>
+      <w:r>
+        <w:t>with .next</w:t>
+      </w:r>
+      <w:proofErr w:type="gramEnd"/>
+      <w:r>
+        <w:t xml:space="preserve"> cache, not related to our code. The important part is</w:t>
       </w:r>
     </w:p>
     <w:p>
@@ -1441,28 +1757,68 @@
         <w:spacing w:after="0"/>
       </w:pPr>
       <w:r>
-        <w:t xml:space="preserve">  Database Migration (turso/migrations/004_cost_codes.sql)</w:t>
-      </w:r>
-    </w:p>
-    <w:p>
-      <w:pPr>
-        <w:spacing w:after="0"/>
-      </w:pPr>
-    </w:p>
-    <w:p>
-      <w:pPr>
-        <w:spacing w:after="0"/>
-      </w:pPr>
-      <w:r>
-        <w:t xml:space="preserve">  - cost_codes table — CSI MasterFormat compatible, supports default divisions + custom user codes</w:t>
-      </w:r>
-    </w:p>
-    <w:p>
-      <w:pPr>
-        <w:spacing w:after="0"/>
-      </w:pPr>
-      <w:r>
-        <w:t xml:space="preserve">  - cost_code_budgets table — per-job, per-cost-code budget assignments (unique constraint on job+code)</w:t>
+        <w:t xml:space="preserve">  Database Migration (</w:t>
+      </w:r>
+      <w:proofErr w:type="spellStart"/>
+      <w:r>
+        <w:t>turso</w:t>
+      </w:r>
+      <w:proofErr w:type="spellEnd"/>
+      <w:r>
+        <w:t>/migrations/004_cost_codes.sql)</w:t>
+      </w:r>
+    </w:p>
+    <w:p>
+      <w:pPr>
+        <w:spacing w:after="0"/>
+      </w:pPr>
+    </w:p>
+    <w:p>
+      <w:pPr>
+        <w:spacing w:after="0"/>
+      </w:pPr>
+      <w:r>
+        <w:t xml:space="preserve">  - </w:t>
+      </w:r>
+      <w:proofErr w:type="spellStart"/>
+      <w:r>
+        <w:t>cost_codes</w:t>
+      </w:r>
+      <w:proofErr w:type="spellEnd"/>
+      <w:r>
+        <w:t xml:space="preserve"> table — CSI </w:t>
+      </w:r>
+      <w:proofErr w:type="spellStart"/>
+      <w:r>
+        <w:t>MasterFormat</w:t>
+      </w:r>
+      <w:proofErr w:type="spellEnd"/>
+      <w:r>
+        <w:t xml:space="preserve"> compatible, supports default divisions + custom user codes</w:t>
+      </w:r>
+    </w:p>
+    <w:p>
+      <w:pPr>
+        <w:spacing w:after="0"/>
+      </w:pPr>
+      <w:r>
+        <w:t xml:space="preserve">  - </w:t>
+      </w:r>
+      <w:proofErr w:type="spellStart"/>
+      <w:r>
+        <w:t>cost_code_budgets</w:t>
+      </w:r>
+      <w:proofErr w:type="spellEnd"/>
+      <w:r>
+        <w:t xml:space="preserve"> table — per-job, per-cost-code budget assignments (unique constraint on </w:t>
+      </w:r>
+      <w:proofErr w:type="spellStart"/>
+      <w:r>
+        <w:t>job+code</w:t>
+      </w:r>
+      <w:proofErr w:type="spellEnd"/>
+      <w:r>
+        <w:t>)</w:t>
       </w:r>
     </w:p>
     <w:p>
@@ -1471,7 +1827,23 @@
       </w:pPr>
       <w:r>
         <w:lastRenderedPageBreak/>
-        <w:t xml:space="preserve">  - Added cost_code_id column to bills, bill_items, and expenses so costs can be tagged with cost codes</w:t>
+        <w:t xml:space="preserve">  - Added </w:t>
+      </w:r>
+      <w:proofErr w:type="spellStart"/>
+      <w:r>
+        <w:t>cost_code_id</w:t>
+      </w:r>
+      <w:proofErr w:type="spellEnd"/>
+      <w:r>
+        <w:t xml:space="preserve"> column to bills, </w:t>
+      </w:r>
+      <w:proofErr w:type="spellStart"/>
+      <w:r>
+        <w:t>bill_items</w:t>
+      </w:r>
+      <w:proofErr w:type="spellEnd"/>
+      <w:r>
+        <w:t>, and expenses so costs can be tagged with cost codes</w:t>
       </w:r>
     </w:p>
     <w:p>
@@ -1497,7 +1869,23 @@
         <w:spacing w:after="0"/>
       </w:pPr>
       <w:r>
-        <w:t xml:space="preserve">  1. /api/cost-codes (CRUD + seed) — Full cost code management with 23 CSI MasterFormat divisions built in. Supports</w:t>
+        <w:t xml:space="preserve">  1. /</w:t>
+      </w:r>
+      <w:proofErr w:type="spellStart"/>
+      <w:r>
+        <w:t>api</w:t>
+      </w:r>
+      <w:proofErr w:type="spellEnd"/>
+      <w:r>
+        <w:t xml:space="preserve">/cost-codes (CRUD + seed) — Full cost code management with 23 CSI </w:t>
+      </w:r>
+      <w:proofErr w:type="spellStart"/>
+      <w:r>
+        <w:t>MasterFormat</w:t>
+      </w:r>
+      <w:proofErr w:type="spellEnd"/>
+      <w:r>
+        <w:t xml:space="preserve"> divisions built in. Supports</w:t>
       </w:r>
     </w:p>
     <w:p>
@@ -1513,7 +1901,31 @@
         <w:spacing w:after="0"/>
       </w:pPr>
       <w:r>
-        <w:t xml:space="preserve">  2. /api/cost-codes/budgets (CRUD) — Assign and manage budgets per cost code per job. Supports upsert (update if</w:t>
+        <w:t xml:space="preserve">  2. /</w:t>
+      </w:r>
+      <w:proofErr w:type="spellStart"/>
+      <w:r>
+        <w:t>api</w:t>
+      </w:r>
+      <w:proofErr w:type="spellEnd"/>
+      <w:r>
+        <w:t>/cost-codes/budgets (</w:t>
+      </w:r>
+      <w:proofErr w:type="gramStart"/>
+      <w:r>
+        <w:t>CRUD) —</w:t>
+      </w:r>
+      <w:proofErr w:type="gramEnd"/>
+      <w:r>
+        <w:t xml:space="preserve"> Assign and manage budgets per cost code per job. Supports </w:t>
+      </w:r>
+      <w:proofErr w:type="spellStart"/>
+      <w:r>
+        <w:t>upsert</w:t>
+      </w:r>
+      <w:proofErr w:type="spellEnd"/>
+      <w:r>
+        <w:t xml:space="preserve"> (update if</w:t>
       </w:r>
     </w:p>
     <w:p>
@@ -1529,7 +1941,15 @@
         <w:spacing w:after="0"/>
       </w:pPr>
       <w:r>
-        <w:t xml:space="preserve">  3. /api/reports/cost-code-variance — The variance engine:</w:t>
+        <w:t xml:space="preserve">  3. /</w:t>
+      </w:r>
+      <w:proofErr w:type="spellStart"/>
+      <w:r>
+        <w:t>api</w:t>
+      </w:r>
+      <w:proofErr w:type="spellEnd"/>
+      <w:r>
+        <w:t>/reports/cost-code-variance — The variance engine:</w:t>
       </w:r>
     </w:p>
     <w:p>
@@ -1561,7 +1981,15 @@
         <w:spacing w:after="0"/>
       </w:pPr>
       <w:r>
-        <w:t xml:space="preserve">    - Trend: under (&lt;50%), on_track (50-90%), over (90%+), critical (exceeded)</w:t>
+        <w:t xml:space="preserve">    - Trend: under (&lt;50%), </w:t>
+      </w:r>
+      <w:proofErr w:type="spellStart"/>
+      <w:r>
+        <w:t>on_track</w:t>
+      </w:r>
+      <w:proofErr w:type="spellEnd"/>
+      <w:r>
+        <w:t xml:space="preserve"> (50-90%), over (90%+), critical (exceeded)</w:t>
       </w:r>
     </w:p>
     <w:p>
@@ -1590,7 +2018,15 @@
         <w:spacing w:after="0"/>
       </w:pPr>
       <w:r>
-        <w:t xml:space="preserve">  Report Page (/dashboard/reports/cost-code-variance)</w:t>
+        <w:t xml:space="preserve">  Report Page (/dashboard/reports/</w:t>
+      </w:r>
+      <w:proofErr w:type="gramStart"/>
+      <w:r>
+        <w:t>cost</w:t>
+      </w:r>
+      <w:proofErr w:type="gramEnd"/>
+      <w:r>
+        <w:t>-code-variance)</w:t>
       </w:r>
     </w:p>
     <w:p>
@@ -1674,7 +2110,15 @@
         <w:spacing w:after="0"/>
       </w:pPr>
       <w:r>
-        <w:t xml:space="preserve">  This is ready for your commit. Want me to move on to Phase 1.3: Cost-to-Complete Logic next?</w:t>
+        <w:t xml:space="preserve">  This is ready for your </w:t>
+      </w:r>
+      <w:proofErr w:type="gramStart"/>
+      <w:r>
+        <w:t>commit</w:t>
+      </w:r>
+      <w:proofErr w:type="gramEnd"/>
+      <w:r>
+        <w:t>. Want me to move on to Phase 1.3: Cost-to-Complete Logic next?</w:t>
       </w:r>
     </w:p>
     <w:p>
@@ -1723,7 +2167,23 @@
         <w:spacing w:after="0"/>
       </w:pPr>
       <w:r>
-        <w:t>● Builds confirmed clean. Ready for your commit on the Cost Code Variance Engine.</w:t>
+        <w:t xml:space="preserve">● Builds confirmed clean. Ready for your </w:t>
+      </w:r>
+      <w:proofErr w:type="gramStart"/>
+      <w:r>
+        <w:t>commit</w:t>
+      </w:r>
+      <w:proofErr w:type="gramEnd"/>
+      <w:r>
+        <w:t xml:space="preserve"> </w:t>
+      </w:r>
+      <w:proofErr w:type="gramStart"/>
+      <w:r>
+        <w:t>on</w:t>
+      </w:r>
+      <w:proofErr w:type="gramEnd"/>
+      <w:r>
+        <w:t xml:space="preserve"> the Cost Code Variance Engine.</w:t>
       </w:r>
     </w:p>
     <w:p>
@@ -1749,10 +2209,18 @@
         <w:spacing w:after="0"/>
       </w:pPr>
       <w:r>
-        <w:t>Mainf4715b8:</w:t>
-      </w:r>
-      <w:r>
-        <w:t>Phase 1.2:</w:t>
+        <w:t>Mainf4715b</w:t>
+      </w:r>
+      <w:proofErr w:type="gramStart"/>
+      <w:r>
+        <w:t>8:</w:t>
+      </w:r>
+      <w:r>
+        <w:t>Phase</w:t>
+      </w:r>
+      <w:proofErr w:type="gramEnd"/>
+      <w:r>
+        <w:t xml:space="preserve"> 1.2:</w:t>
       </w:r>
       <w:r>
         <w:t xml:space="preserve"> C</w:t>
@@ -1798,7 +2266,15 @@
         <w:spacing w:after="0"/>
       </w:pPr>
       <w:r>
-        <w:t>update the Financial tab on the job detail page to show the full forecast detail</w:t>
+        <w:t xml:space="preserve">update the </w:t>
+      </w:r>
+      <w:proofErr w:type="gramStart"/>
+      <w:r>
+        <w:t>Financial</w:t>
+      </w:r>
+      <w:proofErr w:type="gramEnd"/>
+      <w:r>
+        <w:t xml:space="preserve"> tab on the job detail page to show the full forecast detail</w:t>
       </w:r>
       <w:r>
         <w:t xml:space="preserve"> </w:t>
@@ -1838,7 +2314,23 @@
         <w:spacing w:after="0"/>
       </w:pPr>
       <w:r>
-        <w:t xml:space="preserve">  - src/lib/jobForecasting.ts — Core forecasting engine with 3 EAC methods (budget, CPI-performance, trend) + weighted</w:t>
+        <w:t xml:space="preserve">  - </w:t>
+      </w:r>
+      <w:proofErr w:type="spellStart"/>
+      <w:r>
+        <w:t>src</w:t>
+      </w:r>
+      <w:proofErr w:type="spellEnd"/>
+      <w:r>
+        <w:t>/lib/</w:t>
+      </w:r>
+      <w:proofErr w:type="spellStart"/>
+      <w:r>
+        <w:t>jobForecasting.ts</w:t>
+      </w:r>
+      <w:proofErr w:type="spellEnd"/>
+      <w:r>
+        <w:t xml:space="preserve"> — Core forecasting engine with 3 EAC methods (budget, CPI-performance, trend) + weighted</w:t>
       </w:r>
     </w:p>
     <w:p>
@@ -1854,15 +2346,55 @@
         <w:spacing w:after="0"/>
       </w:pPr>
       <w:r>
-        <w:t xml:space="preserve">  - src/app/api/reports/margin-forecast/route.ts — Cross-job margin forecast API with portfolio-level summary</w:t>
-      </w:r>
-    </w:p>
-    <w:p>
-      <w:pPr>
-        <w:spacing w:after="0"/>
-      </w:pPr>
-      <w:r>
-        <w:t xml:space="preserve">  - src/app/dashboard/reports/margin-forecast/page.tsx — Margin forecast report page with sortable table, expandable</w:t>
+        <w:t xml:space="preserve">  - </w:t>
+      </w:r>
+      <w:proofErr w:type="spellStart"/>
+      <w:r>
+        <w:t>src</w:t>
+      </w:r>
+      <w:proofErr w:type="spellEnd"/>
+      <w:r>
+        <w:t>/app/</w:t>
+      </w:r>
+      <w:proofErr w:type="spellStart"/>
+      <w:r>
+        <w:t>api</w:t>
+      </w:r>
+      <w:proofErr w:type="spellEnd"/>
+      <w:r>
+        <w:t>/reports/margin-forecast/</w:t>
+      </w:r>
+      <w:proofErr w:type="spellStart"/>
+      <w:r>
+        <w:t>route.ts</w:t>
+      </w:r>
+      <w:proofErr w:type="spellEnd"/>
+      <w:r>
+        <w:t xml:space="preserve"> — Cross-job margin forecast API with portfolio-level summary</w:t>
+      </w:r>
+    </w:p>
+    <w:p>
+      <w:pPr>
+        <w:spacing w:after="0"/>
+      </w:pPr>
+      <w:r>
+        <w:t xml:space="preserve">  - </w:t>
+      </w:r>
+      <w:proofErr w:type="spellStart"/>
+      <w:r>
+        <w:t>src</w:t>
+      </w:r>
+      <w:proofErr w:type="spellEnd"/>
+      <w:r>
+        <w:t>/app/dashboard/reports/margin-forecast/</w:t>
+      </w:r>
+      <w:proofErr w:type="spellStart"/>
+      <w:r>
+        <w:t>page.tsx</w:t>
+      </w:r>
+      <w:proofErr w:type="spellEnd"/>
+      <w:r>
+        <w:t xml:space="preserve"> — Margin forecast report page with sortable table, expandable</w:t>
       </w:r>
     </w:p>
     <w:p>
@@ -1891,7 +2423,31 @@
         <w:spacing w:after="0"/>
       </w:pPr>
       <w:r>
-        <w:t xml:space="preserve">  - src/app/api/jobs/[id]/financial-summary/route.ts — Integrated forecasting engine, added forecast section to response</w:t>
+        <w:t xml:space="preserve">  - </w:t>
+      </w:r>
+      <w:proofErr w:type="spellStart"/>
+      <w:r>
+        <w:t>src</w:t>
+      </w:r>
+      <w:proofErr w:type="spellEnd"/>
+      <w:r>
+        <w:t>/app/</w:t>
+      </w:r>
+      <w:proofErr w:type="spellStart"/>
+      <w:r>
+        <w:t>api</w:t>
+      </w:r>
+      <w:proofErr w:type="spellEnd"/>
+      <w:r>
+        <w:t>/jobs/[id]/financial-summary/</w:t>
+      </w:r>
+      <w:proofErr w:type="spellStart"/>
+      <w:r>
+        <w:t>route.ts</w:t>
+      </w:r>
+      <w:proofErr w:type="spellEnd"/>
+      <w:r>
+        <w:t xml:space="preserve"> — Integrated forecasting engine, added forecast section to response</w:t>
       </w:r>
     </w:p>
     <w:p>
@@ -1907,7 +2463,31 @@
         <w:spacing w:after="0"/>
       </w:pPr>
       <w:r>
-        <w:t xml:space="preserve">  - src/app/dashboard/jobs/[id]/page.tsx — Added Forecast Detail table to Financial tab showing all 3 methods</w:t>
+        <w:t xml:space="preserve">  - </w:t>
+      </w:r>
+      <w:proofErr w:type="spellStart"/>
+      <w:r>
+        <w:t>src</w:t>
+      </w:r>
+      <w:proofErr w:type="spellEnd"/>
+      <w:r>
+        <w:t>/app/dashboard/jobs/[id]/</w:t>
+      </w:r>
+      <w:proofErr w:type="spellStart"/>
+      <w:r>
+        <w:t>page.tsx</w:t>
+      </w:r>
+      <w:proofErr w:type="spellEnd"/>
+      <w:r>
+        <w:t xml:space="preserve"> — Added Forecast Detail table to </w:t>
+      </w:r>
+      <w:proofErr w:type="gramStart"/>
+      <w:r>
+        <w:t>Financial</w:t>
+      </w:r>
+      <w:proofErr w:type="gramEnd"/>
+      <w:r>
+        <w:t xml:space="preserve"> tab showing all 3 methods</w:t>
       </w:r>
     </w:p>
     <w:p>
@@ -1923,20 +2503,44 @@
         <w:spacing w:after="0"/>
       </w:pPr>
       <w:r>
-        <w:t xml:space="preserve">  - src/app/dashboard/reports/page.tsx — Added "Margin Forecast" to reports index under Job Costing category</w:t>
-      </w:r>
-    </w:p>
-    <w:p>
-      <w:pPr>
-        <w:spacing w:after="0"/>
-      </w:pPr>
-    </w:p>
-    <w:p>
-      <w:pPr>
-        <w:spacing w:after="0"/>
-      </w:pPr>
-      <w:r>
-        <w:t xml:space="preserve">  This is ready for your commit. The next phase would be Phase 2 (Retainage Engine, Change Order Financial Impact,</w:t>
+        <w:t xml:space="preserve">  - </w:t>
+      </w:r>
+      <w:proofErr w:type="spellStart"/>
+      <w:r>
+        <w:t>src</w:t>
+      </w:r>
+      <w:proofErr w:type="spellEnd"/>
+      <w:r>
+        <w:t>/app/dashboard/reports/</w:t>
+      </w:r>
+      <w:proofErr w:type="spellStart"/>
+      <w:r>
+        <w:t>page.tsx</w:t>
+      </w:r>
+      <w:proofErr w:type="spellEnd"/>
+      <w:r>
+        <w:t xml:space="preserve"> — Added "Margin Forecast" to reports index under Job Costing category</w:t>
+      </w:r>
+    </w:p>
+    <w:p>
+      <w:pPr>
+        <w:spacing w:after="0"/>
+      </w:pPr>
+    </w:p>
+    <w:p>
+      <w:pPr>
+        <w:spacing w:after="0"/>
+      </w:pPr>
+      <w:r>
+        <w:t xml:space="preserve">  This is ready for your </w:t>
+      </w:r>
+      <w:proofErr w:type="gramStart"/>
+      <w:r>
+        <w:t>commit</w:t>
+      </w:r>
+      <w:proofErr w:type="gramEnd"/>
+      <w:r>
+        <w:t>. The next phase would be Phase 2 (Retainage Engine, Change Order Financial Impact,</w:t>
       </w:r>
     </w:p>
     <w:p>
@@ -1957,7 +2561,15 @@
         <w:spacing w:after="0"/>
       </w:pPr>
       <w:r>
-        <w:t>Added Forecast Detail table to Financial tab showing all 3 methods</w:t>
+        <w:t xml:space="preserve">Added Forecast Detail table to </w:t>
+      </w:r>
+      <w:proofErr w:type="gramStart"/>
+      <w:r>
+        <w:t>Financial</w:t>
+      </w:r>
+      <w:proofErr w:type="gramEnd"/>
+      <w:r>
+        <w:t xml:space="preserve"> tab showing all 3 methods</w:t>
       </w:r>
       <w:r>
         <w:t xml:space="preserve"> </w:t>
@@ -1990,15 +2602,36 @@
       </w:pPr>
       <w:r>
         <w:lastRenderedPageBreak/>
-        <w:t>All 61 pages compiled successfully and generated. The only error is the pre-existing WSL2 EPERM copyfile issue — not</w:t>
-      </w:r>
-    </w:p>
-    <w:p>
-      <w:pPr>
-        <w:spacing w:after="0"/>
-      </w:pPr>
-      <w:r>
-        <w:t xml:space="preserve">  code-related.</w:t>
+        <w:t xml:space="preserve">All 61 pages compiled successfully and generated. The only error is the pre-existing WSL2 EPERM </w:t>
+      </w:r>
+      <w:proofErr w:type="spellStart"/>
+      <w:r>
+        <w:t>copyfile</w:t>
+      </w:r>
+      <w:proofErr w:type="spellEnd"/>
+      <w:r>
+        <w:t xml:space="preserve"> </w:t>
+      </w:r>
+      <w:proofErr w:type="gramStart"/>
+      <w:r>
+        <w:t>issue — not</w:t>
+      </w:r>
+      <w:proofErr w:type="gramEnd"/>
+    </w:p>
+    <w:p>
+      <w:pPr>
+        <w:spacing w:after="0"/>
+      </w:pPr>
+      <w:r>
+        <w:t xml:space="preserve">  </w:t>
+      </w:r>
+      <w:proofErr w:type="gramStart"/>
+      <w:r>
+        <w:t>code-related</w:t>
+      </w:r>
+      <w:proofErr w:type="gramEnd"/>
+      <w:r>
+        <w:t>.</w:t>
       </w:r>
     </w:p>
     <w:p>
@@ -2032,15 +2665,36 @@
         <w:spacing w:after="0"/>
       </w:pPr>
       <w:r>
-        <w:t xml:space="preserve">   All 61 pages compiled successfully and generated. The only error is the pre-existing WSL2 EPERM copyfile issue — not</w:t>
-      </w:r>
-    </w:p>
-    <w:p>
-      <w:pPr>
-        <w:spacing w:after="0"/>
-      </w:pPr>
-      <w:r>
-        <w:t xml:space="preserve">  code-related.</w:t>
+        <w:t xml:space="preserve">   All 61 pages compiled successfully and generated. The only error is the pre-existing WSL2 EPERM </w:t>
+      </w:r>
+      <w:proofErr w:type="spellStart"/>
+      <w:r>
+        <w:t>copyfile</w:t>
+      </w:r>
+      <w:proofErr w:type="spellEnd"/>
+      <w:r>
+        <w:t xml:space="preserve"> </w:t>
+      </w:r>
+      <w:proofErr w:type="gramStart"/>
+      <w:r>
+        <w:t>issue — not</w:t>
+      </w:r>
+      <w:proofErr w:type="gramEnd"/>
+    </w:p>
+    <w:p>
+      <w:pPr>
+        <w:spacing w:after="0"/>
+      </w:pPr>
+      <w:r>
+        <w:t xml:space="preserve">  </w:t>
+      </w:r>
+      <w:proofErr w:type="gramStart"/>
+      <w:r>
+        <w:t>code-related</w:t>
+      </w:r>
+      <w:proofErr w:type="gramEnd"/>
+      <w:r>
+        <w:t>.</w:t>
       </w:r>
     </w:p>
     <w:p>
@@ -2082,37 +2736,98 @@
         <w:spacing w:after="0"/>
       </w:pPr>
       <w:r>
-        <w:t xml:space="preserve">  Migration: turso/migrations/005_retainage_change_orders.sql</w:t>
-      </w:r>
-    </w:p>
-    <w:p>
-      <w:pPr>
-        <w:spacing w:after="0"/>
-      </w:pPr>
-      <w:r>
-        <w:t xml:space="preserve">  - Added retainage_percent, retainage_amount, retainage_released to invoices and bills</w:t>
-      </w:r>
-    </w:p>
-    <w:p>
-      <w:pPr>
-        <w:spacing w:after="0"/>
-      </w:pPr>
-      <w:r>
-        <w:t xml:space="preserve">  - Added retainage_percent (default 10%) to jobs</w:t>
-      </w:r>
-    </w:p>
-    <w:p>
-      <w:pPr>
-        <w:spacing w:after="0"/>
-      </w:pPr>
-    </w:p>
-    <w:p>
-      <w:pPr>
-        <w:spacing w:after="0"/>
-      </w:pPr>
-      <w:r>
-        <w:t xml:space="preserve">  API: src/app/api/reports/retainage/route.ts</w:t>
-      </w:r>
+        <w:t xml:space="preserve">  Migration: </w:t>
+      </w:r>
+      <w:proofErr w:type="spellStart"/>
+      <w:r>
+        <w:t>turso</w:t>
+      </w:r>
+      <w:proofErr w:type="spellEnd"/>
+      <w:r>
+        <w:t>/migrations/005_retainage_change_orders.sql</w:t>
+      </w:r>
+    </w:p>
+    <w:p>
+      <w:pPr>
+        <w:spacing w:after="0"/>
+      </w:pPr>
+      <w:r>
+        <w:t xml:space="preserve">  - Added </w:t>
+      </w:r>
+      <w:proofErr w:type="spellStart"/>
+      <w:r>
+        <w:t>retainage_percent</w:t>
+      </w:r>
+      <w:proofErr w:type="spellEnd"/>
+      <w:r>
+        <w:t xml:space="preserve">, </w:t>
+      </w:r>
+      <w:proofErr w:type="spellStart"/>
+      <w:r>
+        <w:t>retainage_amount</w:t>
+      </w:r>
+      <w:proofErr w:type="spellEnd"/>
+      <w:r>
+        <w:t xml:space="preserve">, </w:t>
+      </w:r>
+      <w:proofErr w:type="spellStart"/>
+      <w:r>
+        <w:t>retainage_released</w:t>
+      </w:r>
+      <w:proofErr w:type="spellEnd"/>
+      <w:r>
+        <w:t xml:space="preserve"> to invoices and bills</w:t>
+      </w:r>
+    </w:p>
+    <w:p>
+      <w:pPr>
+        <w:spacing w:after="0"/>
+      </w:pPr>
+      <w:r>
+        <w:t xml:space="preserve">  - Added </w:t>
+      </w:r>
+      <w:proofErr w:type="spellStart"/>
+      <w:r>
+        <w:t>retainage_percent</w:t>
+      </w:r>
+      <w:proofErr w:type="spellEnd"/>
+      <w:r>
+        <w:t xml:space="preserve"> (default 10%) to jobs</w:t>
+      </w:r>
+    </w:p>
+    <w:p>
+      <w:pPr>
+        <w:spacing w:after="0"/>
+      </w:pPr>
+    </w:p>
+    <w:p>
+      <w:pPr>
+        <w:spacing w:after="0"/>
+      </w:pPr>
+      <w:r>
+        <w:t xml:space="preserve">  API: </w:t>
+      </w:r>
+      <w:proofErr w:type="spellStart"/>
+      <w:r>
+        <w:t>src</w:t>
+      </w:r>
+      <w:proofErr w:type="spellEnd"/>
+      <w:r>
+        <w:t>/app/</w:t>
+      </w:r>
+      <w:proofErr w:type="spellStart"/>
+      <w:r>
+        <w:t>api</w:t>
+      </w:r>
+      <w:proofErr w:type="spellEnd"/>
+      <w:r>
+        <w:t>/reports/retainage/</w:t>
+      </w:r>
+      <w:proofErr w:type="spellStart"/>
+      <w:r>
+        <w:t>route.ts</w:t>
+      </w:r>
+      <w:proofErr w:type="spellEnd"/>
     </w:p>
     <w:p>
       <w:pPr>
@@ -2156,8 +2871,21 @@
         <w:spacing w:after="0"/>
       </w:pPr>
       <w:r>
-        <w:t xml:space="preserve">  UI: src/app/dashboard/reports/retainage/page.tsx</w:t>
-      </w:r>
+        <w:t xml:space="preserve">  UI: </w:t>
+      </w:r>
+      <w:proofErr w:type="spellStart"/>
+      <w:r>
+        <w:t>src</w:t>
+      </w:r>
+      <w:proofErr w:type="spellEnd"/>
+      <w:r>
+        <w:t>/app/dashboard/reports/retainage/</w:t>
+      </w:r>
+      <w:proofErr w:type="spellStart"/>
+      <w:r>
+        <w:t>page.tsx</w:t>
+      </w:r>
+      <w:proofErr w:type="spellEnd"/>
     </w:p>
     <w:p>
       <w:pPr>
@@ -2196,7 +2924,15 @@
         <w:spacing w:after="0"/>
       </w:pPr>
       <w:r>
-        <w:t xml:space="preserve">  - Detail table with all retainage line items</w:t>
+        <w:t xml:space="preserve">  - Detail table with all </w:t>
+      </w:r>
+      <w:proofErr w:type="gramStart"/>
+      <w:r>
+        <w:t>retainage</w:t>
+      </w:r>
+      <w:proofErr w:type="gramEnd"/>
+      <w:r>
+        <w:t xml:space="preserve"> line items</w:t>
       </w:r>
     </w:p>
     <w:p>
@@ -2235,21 +2971,50 @@
         <w:spacing w:after="0"/>
       </w:pPr>
       <w:r>
-        <w:t xml:space="preserve">  Migration: change_orders table with status workflow (draft → pending → approved/rejected)</w:t>
-      </w:r>
-    </w:p>
-    <w:p>
-      <w:pPr>
-        <w:spacing w:after="0"/>
-      </w:pPr>
-    </w:p>
-    <w:p>
-      <w:pPr>
-        <w:spacing w:after="0"/>
-      </w:pPr>
-      <w:r>
-        <w:t xml:space="preserve">  API: src/app/api/change-orders/route.ts</w:t>
-      </w:r>
+        <w:t xml:space="preserve">  Migration: </w:t>
+      </w:r>
+      <w:proofErr w:type="spellStart"/>
+      <w:r>
+        <w:t>change_orders</w:t>
+      </w:r>
+      <w:proofErr w:type="spellEnd"/>
+      <w:r>
+        <w:t xml:space="preserve"> table with status workflow (draft → pending → approved/rejected)</w:t>
+      </w:r>
+    </w:p>
+    <w:p>
+      <w:pPr>
+        <w:spacing w:after="0"/>
+      </w:pPr>
+    </w:p>
+    <w:p>
+      <w:pPr>
+        <w:spacing w:after="0"/>
+      </w:pPr>
+      <w:r>
+        <w:t xml:space="preserve">  API: </w:t>
+      </w:r>
+      <w:proofErr w:type="spellStart"/>
+      <w:r>
+        <w:t>src</w:t>
+      </w:r>
+      <w:proofErr w:type="spellEnd"/>
+      <w:r>
+        <w:t>/app/</w:t>
+      </w:r>
+      <w:proofErr w:type="spellStart"/>
+      <w:r>
+        <w:t>api</w:t>
+      </w:r>
+      <w:proofErr w:type="spellEnd"/>
+      <w:r>
+        <w:t>/change-orders/</w:t>
+      </w:r>
+      <w:proofErr w:type="spellStart"/>
+      <w:r>
+        <w:t>route.ts</w:t>
+      </w:r>
+      <w:proofErr w:type="spellEnd"/>
     </w:p>
     <w:p>
       <w:pPr>
@@ -2277,8 +3042,21 @@
         <w:spacing w:after="0"/>
       </w:pPr>
       <w:r>
-        <w:t xml:space="preserve">  UI: src/app/dashboard/jobs/[id]/change-orders/page.tsx</w:t>
-      </w:r>
+        <w:t xml:space="preserve">  UI: </w:t>
+      </w:r>
+      <w:proofErr w:type="spellStart"/>
+      <w:r>
+        <w:t>src</w:t>
+      </w:r>
+      <w:proofErr w:type="spellEnd"/>
+      <w:r>
+        <w:t>/app/dashboard/jobs/[id]/change-orders/</w:t>
+      </w:r>
+      <w:proofErr w:type="spellStart"/>
+      <w:r>
+        <w:t>page.tsx</w:t>
+      </w:r>
+      <w:proofErr w:type="spellEnd"/>
     </w:p>
     <w:p>
       <w:pPr>
@@ -2346,7 +3124,15 @@
         <w:spacing w:after="0"/>
       </w:pPr>
       <w:r>
-        <w:t xml:space="preserve">  - New change_orders section in response</w:t>
+        <w:t xml:space="preserve">  - New </w:t>
+      </w:r>
+      <w:proofErr w:type="spellStart"/>
+      <w:r>
+        <w:t>change_orders</w:t>
+      </w:r>
+      <w:proofErr w:type="spellEnd"/>
+      <w:r>
+        <w:t xml:space="preserve"> section in response</w:t>
       </w:r>
     </w:p>
     <w:p>
@@ -2404,7 +3190,15 @@
         <w:spacing w:after="0"/>
       </w:pPr>
       <w:r>
-        <w:t xml:space="preserve">  - Added billing_trend field per job (improving/stable/worsening)</w:t>
+        <w:t xml:space="preserve">  - Added </w:t>
+      </w:r>
+      <w:proofErr w:type="spellStart"/>
+      <w:r>
+        <w:t>billing_trend</w:t>
+      </w:r>
+      <w:proofErr w:type="spellEnd"/>
+      <w:r>
+        <w:t xml:space="preserve"> field per job (improving/stable/worsening)</w:t>
       </w:r>
     </w:p>
     <w:p>
@@ -2428,41 +3222,97 @@
         <w:spacing w:after="0"/>
       </w:pPr>
       <w:r>
-        <w:t xml:space="preserve">  - Enhanced summary with jobs_overbilled, jobs_underbilled, jobs_worsening counts</w:t>
-      </w:r>
-    </w:p>
-    <w:p>
-      <w:pPr>
-        <w:spacing w:after="0"/>
-      </w:pPr>
-      <w:r>
-        <w:t xml:space="preserve">  - Added total_retainage_receivable and total_retainage_payable to summary</w:t>
-      </w:r>
-    </w:p>
-    <w:p>
-      <w:pPr>
-        <w:spacing w:after="0"/>
-      </w:pPr>
-    </w:p>
-    <w:p>
-      <w:pPr>
-        <w:spacing w:after="0"/>
-      </w:pPr>
-      <w:r>
-        <w:t xml:space="preserve">  Reports index updated with Retainage Aging report under Job Costing category.</w:t>
-      </w:r>
-    </w:p>
-    <w:p>
-      <w:pPr>
-        <w:spacing w:after="0"/>
-      </w:pPr>
-    </w:p>
-    <w:p>
-      <w:pPr>
-        <w:spacing w:after="0"/>
-      </w:pPr>
-      <w:r>
-        <w:t xml:space="preserve">  Job detail page updated with Change Orders button and retainage/CO sections in Financial tab.</w:t>
+        <w:t xml:space="preserve">  - Enhanced summary with </w:t>
+      </w:r>
+      <w:proofErr w:type="spellStart"/>
+      <w:r>
+        <w:t>jobs_overbilled</w:t>
+      </w:r>
+      <w:proofErr w:type="spellEnd"/>
+      <w:r>
+        <w:t xml:space="preserve">, </w:t>
+      </w:r>
+      <w:proofErr w:type="spellStart"/>
+      <w:r>
+        <w:t>jobs_underbilled</w:t>
+      </w:r>
+      <w:proofErr w:type="spellEnd"/>
+      <w:r>
+        <w:t xml:space="preserve">, </w:t>
+      </w:r>
+      <w:proofErr w:type="spellStart"/>
+      <w:r>
+        <w:t>jobs_worsening</w:t>
+      </w:r>
+      <w:proofErr w:type="spellEnd"/>
+      <w:r>
+        <w:t xml:space="preserve"> counts</w:t>
+      </w:r>
+    </w:p>
+    <w:p>
+      <w:pPr>
+        <w:spacing w:after="0"/>
+      </w:pPr>
+      <w:r>
+        <w:t xml:space="preserve">  - Added </w:t>
+      </w:r>
+      <w:proofErr w:type="spellStart"/>
+      <w:r>
+        <w:t>total_retainage_receivable</w:t>
+      </w:r>
+      <w:proofErr w:type="spellEnd"/>
+      <w:r>
+        <w:t xml:space="preserve"> and </w:t>
+      </w:r>
+      <w:proofErr w:type="spellStart"/>
+      <w:r>
+        <w:t>total_retainage_payable</w:t>
+      </w:r>
+      <w:proofErr w:type="spellEnd"/>
+      <w:r>
+        <w:t xml:space="preserve"> to summary</w:t>
+      </w:r>
+    </w:p>
+    <w:p>
+      <w:pPr>
+        <w:spacing w:after="0"/>
+      </w:pPr>
+    </w:p>
+    <w:p>
+      <w:pPr>
+        <w:spacing w:after="0"/>
+      </w:pPr>
+      <w:r>
+        <w:t xml:space="preserve">  </w:t>
+      </w:r>
+      <w:proofErr w:type="gramStart"/>
+      <w:r>
+        <w:t>Reports index</w:t>
+      </w:r>
+      <w:proofErr w:type="gramEnd"/>
+      <w:r>
+        <w:t xml:space="preserve"> updated with Retainage Aging report under Job Costing category.</w:t>
+      </w:r>
+    </w:p>
+    <w:p>
+      <w:pPr>
+        <w:spacing w:after="0"/>
+      </w:pPr>
+    </w:p>
+    <w:p>
+      <w:pPr>
+        <w:spacing w:after="0"/>
+      </w:pPr>
+      <w:r>
+        <w:t xml:space="preserve">  Job detail page updated with Change Orders button and retainage/CO sections in </w:t>
+      </w:r>
+      <w:proofErr w:type="gramStart"/>
+      <w:r>
+        <w:t>Financial</w:t>
+      </w:r>
+      <w:proofErr w:type="gramEnd"/>
+      <w:r>
+        <w:t xml:space="preserve"> tab.</w:t>
       </w:r>
     </w:p>
     <w:p>
@@ -2471,7 +3321,15 @@
       </w:pPr>
       <w:r>
         <w:lastRenderedPageBreak/>
-        <w:t>All 62 pages compiled and generated successfully. Only the pre-existing WSL2 EPERM copyfile issue at the very end.</w:t>
+        <w:t xml:space="preserve">All 62 pages compiled and generated successfully. Only the pre-existing WSL2 EPERM </w:t>
+      </w:r>
+      <w:proofErr w:type="spellStart"/>
+      <w:r>
+        <w:t>copyfile</w:t>
+      </w:r>
+      <w:proofErr w:type="spellEnd"/>
+      <w:r>
+        <w:t xml:space="preserve"> issue at the very end.</w:t>
       </w:r>
     </w:p>
     <w:p>
@@ -2513,8 +3371,29 @@
         <w:spacing w:after="0"/>
       </w:pPr>
       <w:r>
-        <w:t xml:space="preserve">  API: src/app/api/reports/cash-flow-forecast/route.ts</w:t>
-      </w:r>
+        <w:t xml:space="preserve">  API: </w:t>
+      </w:r>
+      <w:proofErr w:type="spellStart"/>
+      <w:r>
+        <w:t>src</w:t>
+      </w:r>
+      <w:proofErr w:type="spellEnd"/>
+      <w:r>
+        <w:t>/app/</w:t>
+      </w:r>
+      <w:proofErr w:type="spellStart"/>
+      <w:r>
+        <w:t>api</w:t>
+      </w:r>
+      <w:proofErr w:type="spellEnd"/>
+      <w:r>
+        <w:t>/reports/cash-flow-forecast/</w:t>
+      </w:r>
+      <w:proofErr w:type="spellStart"/>
+      <w:r>
+        <w:t>route.ts</w:t>
+      </w:r>
+      <w:proofErr w:type="spellEnd"/>
     </w:p>
     <w:p>
       <w:pPr>
@@ -2582,8 +3461,21 @@
         <w:spacing w:after="0"/>
       </w:pPr>
       <w:r>
-        <w:t xml:space="preserve">  UI: src/app/dashboard/reports/cash-flow-forecast/page.tsx</w:t>
-      </w:r>
+        <w:t xml:space="preserve">  UI: </w:t>
+      </w:r>
+      <w:proofErr w:type="spellStart"/>
+      <w:r>
+        <w:t>src</w:t>
+      </w:r>
+      <w:proofErr w:type="spellEnd"/>
+      <w:r>
+        <w:t>/app/dashboard/reports/cash-flow-forecast/</w:t>
+      </w:r>
+      <w:proofErr w:type="spellStart"/>
+      <w:r>
+        <w:t>page.tsx</w:t>
+      </w:r>
+      <w:proofErr w:type="spellEnd"/>
     </w:p>
     <w:p>
       <w:pPr>
@@ -2722,8 +3614,29 @@
         <w:spacing w:after="0"/>
       </w:pPr>
       <w:r>
-        <w:t xml:space="preserve">  API: src/app/api/alerts/construction/route.ts</w:t>
-      </w:r>
+        <w:t xml:space="preserve">  API: </w:t>
+      </w:r>
+      <w:proofErr w:type="spellStart"/>
+      <w:r>
+        <w:t>src</w:t>
+      </w:r>
+      <w:proofErr w:type="spellEnd"/>
+      <w:r>
+        <w:t>/app/</w:t>
+      </w:r>
+      <w:proofErr w:type="spellStart"/>
+      <w:r>
+        <w:t>api</w:t>
+      </w:r>
+      <w:proofErr w:type="spellEnd"/>
+      <w:r>
+        <w:t>/alerts/construction/</w:t>
+      </w:r>
+      <w:proofErr w:type="spellStart"/>
+      <w:r>
+        <w:t>route.ts</w:t>
+      </w:r>
+      <w:proofErr w:type="spellEnd"/>
     </w:p>
     <w:p>
       <w:pPr>
@@ -2802,7 +3715,15 @@
         <w:spacing w:after="0"/>
       </w:pPr>
       <w:r>
-        <w:t xml:space="preserve">    i. Collection Risk — outstanding AR &gt; 50% of billings</w:t>
+        <w:t xml:space="preserve">    </w:t>
+      </w:r>
+      <w:proofErr w:type="spellStart"/>
+      <w:r>
+        <w:t>i</w:t>
+      </w:r>
+      <w:proofErr w:type="spellEnd"/>
+      <w:r>
+        <w:t>. Collection Risk — outstanding AR &gt; 50% of billings</w:t>
       </w:r>
     </w:p>
     <w:p>
@@ -2818,28 +3739,57 @@
         <w:spacing w:after="0"/>
       </w:pPr>
       <w:r>
-        <w:t xml:space="preserve">  - Summary with counts and affected jobs</w:t>
-      </w:r>
-    </w:p>
-    <w:p>
-      <w:pPr>
-        <w:spacing w:after="0"/>
-      </w:pPr>
-    </w:p>
-    <w:p>
-      <w:pPr>
-        <w:spacing w:after="0"/>
-      </w:pPr>
-      <w:r>
-        <w:t xml:space="preserve">  Component: src/components/ConstructionAlerts.tsx</w:t>
-      </w:r>
-    </w:p>
-    <w:p>
-      <w:pPr>
-        <w:spacing w:after="0"/>
-      </w:pPr>
-      <w:r>
-        <w:t xml:space="preserve">  - Dismissable alert cards with severity-colored left borders</w:t>
+        <w:t xml:space="preserve">  - Summary </w:t>
+      </w:r>
+      <w:proofErr w:type="gramStart"/>
+      <w:r>
+        <w:t>with</w:t>
+      </w:r>
+      <w:proofErr w:type="gramEnd"/>
+      <w:r>
+        <w:t xml:space="preserve"> counts and affected jobs</w:t>
+      </w:r>
+    </w:p>
+    <w:p>
+      <w:pPr>
+        <w:spacing w:after="0"/>
+      </w:pPr>
+    </w:p>
+    <w:p>
+      <w:pPr>
+        <w:spacing w:after="0"/>
+      </w:pPr>
+      <w:r>
+        <w:t xml:space="preserve">  Component: </w:t>
+      </w:r>
+      <w:proofErr w:type="spellStart"/>
+      <w:r>
+        <w:t>src</w:t>
+      </w:r>
+      <w:proofErr w:type="spellEnd"/>
+      <w:r>
+        <w:t>/components/</w:t>
+      </w:r>
+      <w:proofErr w:type="spellStart"/>
+      <w:r>
+        <w:t>ConstructionAlerts.tsx</w:t>
+      </w:r>
+      <w:proofErr w:type="spellEnd"/>
+    </w:p>
+    <w:p>
+      <w:pPr>
+        <w:spacing w:after="0"/>
+      </w:pPr>
+      <w:r>
+        <w:t xml:space="preserve">  - </w:t>
+      </w:r>
+      <w:proofErr w:type="spellStart"/>
+      <w:r>
+        <w:t>Dismissable</w:t>
+      </w:r>
+      <w:proofErr w:type="spellEnd"/>
+      <w:r>
+        <w:t xml:space="preserve"> alert cards with severity-colored left borders</w:t>
       </w:r>
     </w:p>
     <w:p>
@@ -2892,7 +3842,15 @@
         <w:spacing w:after="0"/>
       </w:pPr>
       <w:r>
-        <w:t xml:space="preserve">  Dashboard integration: Added ConstructionAlerts component to the main dashboard page between the stats grid and recent</w:t>
+        <w:t xml:space="preserve">  Dashboard integration: Added </w:t>
+      </w:r>
+      <w:proofErr w:type="spellStart"/>
+      <w:r>
+        <w:t>ConstructionAlerts</w:t>
+      </w:r>
+      <w:proofErr w:type="spellEnd"/>
+      <w:r>
+        <w:t xml:space="preserve"> component to the main dashboard page between the stats grid and recent</w:t>
       </w:r>
     </w:p>
     <w:p>
@@ -2913,7 +3871,15 @@
         <w:spacing w:after="0"/>
       </w:pPr>
       <w:r>
-        <w:t xml:space="preserve">  Reports index updated with Cash Flow Forecast under Job Costing.</w:t>
+        <w:t xml:space="preserve">  </w:t>
+      </w:r>
+      <w:proofErr w:type="gramStart"/>
+      <w:r>
+        <w:t>Reports index</w:t>
+      </w:r>
+      <w:proofErr w:type="gramEnd"/>
+      <w:r>
+        <w:t xml:space="preserve"> updated with Cash Flow Forecast under Job Costing.</w:t>
       </w:r>
     </w:p>
     <w:p>
@@ -3058,20 +4024,36 @@
         <w:spacing w:after="0"/>
       </w:pPr>
       <w:r>
-        <w:t xml:space="preserve">  - Entities + Settings (always visible bottom)</w:t>
-      </w:r>
-    </w:p>
-    <w:p>
-      <w:pPr>
-        <w:spacing w:after="0"/>
-      </w:pPr>
-    </w:p>
-    <w:p>
-      <w:pPr>
-        <w:spacing w:after="0"/>
-      </w:pPr>
-      <w:r>
-        <w:t xml:space="preserve">  Categories auto-expand when the current route matches a child item.</w:t>
+        <w:t xml:space="preserve">  - Entities + Settings (always </w:t>
+      </w:r>
+      <w:proofErr w:type="gramStart"/>
+      <w:r>
+        <w:t>visible</w:t>
+      </w:r>
+      <w:proofErr w:type="gramEnd"/>
+      <w:r>
+        <w:t xml:space="preserve"> bottom)</w:t>
+      </w:r>
+    </w:p>
+    <w:p>
+      <w:pPr>
+        <w:spacing w:after="0"/>
+      </w:pPr>
+    </w:p>
+    <w:p>
+      <w:pPr>
+        <w:spacing w:after="0"/>
+      </w:pPr>
+      <w:r>
+        <w:t xml:space="preserve">  Categories auto-expand when the current route matches a </w:t>
+      </w:r>
+      <w:proofErr w:type="gramStart"/>
+      <w:r>
+        <w:t>child</w:t>
+      </w:r>
+      <w:proofErr w:type="gramEnd"/>
+      <w:r>
+        <w:t xml:space="preserve"> item.</w:t>
       </w:r>
     </w:p>
     <w:p>
@@ -3097,7 +4079,15 @@
         <w:spacing w:after="0"/>
       </w:pPr>
       <w:r>
-        <w:t xml:space="preserve">  4.1 Database Schema (turso/migrations/006_multi_entity.sql)</w:t>
+        <w:t xml:space="preserve">  4.1 Database Schema (</w:t>
+      </w:r>
+      <w:proofErr w:type="spellStart"/>
+      <w:r>
+        <w:t>turso</w:t>
+      </w:r>
+      <w:proofErr w:type="spellEnd"/>
+      <w:r>
+        <w:t>/migrations/006_multi_entity.sql)</w:t>
       </w:r>
     </w:p>
     <w:p>
@@ -3126,39 +4116,87 @@
         <w:spacing w:after="0"/>
       </w:pPr>
       <w:r>
-        <w:t xml:space="preserve">  - locations - physical locations per entity (office, warehouse, jobsite, etc.)</w:t>
-      </w:r>
-    </w:p>
-    <w:p>
-      <w:pPr>
-        <w:spacing w:after="0"/>
-      </w:pPr>
-      <w:r>
-        <w:t xml:space="preserve">  - user_entity_roles - RBAC per entity (owner/admin/manager/accountant/viewer)</w:t>
-      </w:r>
-    </w:p>
-    <w:p>
-      <w:pPr>
-        <w:spacing w:after="0"/>
-      </w:pPr>
-      <w:r>
-        <w:t xml:space="preserve">  - intercompany_transactions - transfers between entities</w:t>
-      </w:r>
-    </w:p>
-    <w:p>
-      <w:pPr>
-        <w:spacing w:after="0"/>
-      </w:pPr>
-      <w:r>
-        <w:t xml:space="preserve">  - Added entity_id column to 11 existing tables (jobs, invoices, bills, expenses, accounts, customers, vendors,</w:t>
-      </w:r>
-    </w:p>
-    <w:p>
-      <w:pPr>
-        <w:spacing w:after="0"/>
-      </w:pPr>
-      <w:r>
-        <w:t xml:space="preserve">  payments, bank_accounts, journal_entries)</w:t>
+        <w:t xml:space="preserve">  - locations - physical locations per entity (office, warehouse, </w:t>
+      </w:r>
+      <w:proofErr w:type="gramStart"/>
+      <w:r>
+        <w:t>jobsite</w:t>
+      </w:r>
+      <w:proofErr w:type="gramEnd"/>
+      <w:r>
+        <w:t>, etc.)</w:t>
+      </w:r>
+    </w:p>
+    <w:p>
+      <w:pPr>
+        <w:spacing w:after="0"/>
+      </w:pPr>
+      <w:r>
+        <w:t xml:space="preserve">  - </w:t>
+      </w:r>
+      <w:proofErr w:type="spellStart"/>
+      <w:r>
+        <w:t>user_entity_roles</w:t>
+      </w:r>
+      <w:proofErr w:type="spellEnd"/>
+      <w:r>
+        <w:t xml:space="preserve"> - RBAC per entity (owner/admin/manager/accountant/viewer)</w:t>
+      </w:r>
+    </w:p>
+    <w:p>
+      <w:pPr>
+        <w:spacing w:after="0"/>
+      </w:pPr>
+      <w:r>
+        <w:t xml:space="preserve">  - </w:t>
+      </w:r>
+      <w:proofErr w:type="spellStart"/>
+      <w:r>
+        <w:t>intercompany_transactions</w:t>
+      </w:r>
+      <w:proofErr w:type="spellEnd"/>
+      <w:r>
+        <w:t xml:space="preserve"> - transfers between entities</w:t>
+      </w:r>
+    </w:p>
+    <w:p>
+      <w:pPr>
+        <w:spacing w:after="0"/>
+      </w:pPr>
+      <w:r>
+        <w:t xml:space="preserve">  - Added </w:t>
+      </w:r>
+      <w:proofErr w:type="spellStart"/>
+      <w:r>
+        <w:t>entity_id</w:t>
+      </w:r>
+      <w:proofErr w:type="spellEnd"/>
+      <w:r>
+        <w:t xml:space="preserve"> column to 11 existing tables (jobs, invoices, bills, expenses, accounts, customers, vendors,</w:t>
+      </w:r>
+    </w:p>
+    <w:p>
+      <w:pPr>
+        <w:spacing w:after="0"/>
+      </w:pPr>
+      <w:r>
+        <w:t xml:space="preserve">  payments, </w:t>
+      </w:r>
+      <w:proofErr w:type="spellStart"/>
+      <w:r>
+        <w:t>bank_accounts</w:t>
+      </w:r>
+      <w:proofErr w:type="spellEnd"/>
+      <w:r>
+        <w:t xml:space="preserve">, </w:t>
+      </w:r>
+      <w:proofErr w:type="spellStart"/>
+      <w:r>
+        <w:t>journal_entries</w:t>
+      </w:r>
+      <w:proofErr w:type="spellEnd"/>
+      <w:r>
+        <w:t>)</w:t>
       </w:r>
     </w:p>
     <w:p>
@@ -3184,7 +4222,15 @@
         <w:spacing w:after="0"/>
       </w:pPr>
       <w:r>
-        <w:t xml:space="preserve">  - /api/organizations - CRUD with auto-entity + owner role creation</w:t>
+        <w:t xml:space="preserve">  - /</w:t>
+      </w:r>
+      <w:proofErr w:type="spellStart"/>
+      <w:r>
+        <w:t>api</w:t>
+      </w:r>
+      <w:proofErr w:type="spellEnd"/>
+      <w:r>
+        <w:t>/organizations - CRUD with auto-entity + owner role creation</w:t>
       </w:r>
     </w:p>
     <w:p>
@@ -3193,31 +4239,63 @@
       </w:pPr>
       <w:r>
         <w:lastRenderedPageBreak/>
-        <w:t xml:space="preserve">  - /api/entities - CRUD with permission checks, prevents deleting last entity</w:t>
-      </w:r>
-    </w:p>
-    <w:p>
-      <w:pPr>
-        <w:spacing w:after="0"/>
-      </w:pPr>
-      <w:r>
-        <w:t xml:space="preserve">  - /api/locations - CRUD for physical locations</w:t>
-      </w:r>
-    </w:p>
-    <w:p>
-      <w:pPr>
-        <w:spacing w:after="0"/>
-      </w:pPr>
-      <w:r>
-        <w:t xml:space="preserve">  - /api/intercompany - Create/approve/post/void inter-company transactions</w:t>
-      </w:r>
-    </w:p>
-    <w:p>
-      <w:pPr>
-        <w:spacing w:after="0"/>
-      </w:pPr>
-      <w:r>
-        <w:t xml:space="preserve">  - /api/reports/consolidated - Cross-entity P&amp;L comparison</w:t>
+        <w:t xml:space="preserve">  - /</w:t>
+      </w:r>
+      <w:proofErr w:type="spellStart"/>
+      <w:r>
+        <w:t>api</w:t>
+      </w:r>
+      <w:proofErr w:type="spellEnd"/>
+      <w:r>
+        <w:t>/entities - CRUD with permission checks, prevents deleting last entity</w:t>
+      </w:r>
+    </w:p>
+    <w:p>
+      <w:pPr>
+        <w:spacing w:after="0"/>
+      </w:pPr>
+      <w:r>
+        <w:t xml:space="preserve">  - /</w:t>
+      </w:r>
+      <w:proofErr w:type="spellStart"/>
+      <w:r>
+        <w:t>api</w:t>
+      </w:r>
+      <w:proofErr w:type="spellEnd"/>
+      <w:r>
+        <w:t>/locations - CRUD for physical locations</w:t>
+      </w:r>
+    </w:p>
+    <w:p>
+      <w:pPr>
+        <w:spacing w:after="0"/>
+      </w:pPr>
+      <w:r>
+        <w:t xml:space="preserve">  - /</w:t>
+      </w:r>
+      <w:proofErr w:type="spellStart"/>
+      <w:r>
+        <w:t>api</w:t>
+      </w:r>
+      <w:proofErr w:type="spellEnd"/>
+      <w:r>
+        <w:t>/intercompany - Create/approve/post/void inter-company transactions</w:t>
+      </w:r>
+    </w:p>
+    <w:p>
+      <w:pPr>
+        <w:spacing w:after="0"/>
+      </w:pPr>
+      <w:r>
+        <w:t xml:space="preserve">  - /</w:t>
+      </w:r>
+      <w:proofErr w:type="spellStart"/>
+      <w:r>
+        <w:t>api</w:t>
+      </w:r>
+      <w:proofErr w:type="spellEnd"/>
+      <w:r>
+        <w:t>/reports/consolidated - Cross-entity P&amp;L comparison</w:t>
       </w:r>
     </w:p>
     <w:p>
@@ -3285,24 +4363,58 @@
         <w:spacing w:after="0"/>
       </w:pPr>
       <w:r>
-        <w:t xml:space="preserve">  - EntityContext provider with useEntity() hook</w:t>
-      </w:r>
-    </w:p>
-    <w:p>
-      <w:pPr>
-        <w:spacing w:after="0"/>
-      </w:pPr>
-      <w:r>
-        <w:t xml:space="preserve">  - EntitySwitcher component in sidebar (below logo)</w:t>
-      </w:r>
-    </w:p>
-    <w:p>
-      <w:pPr>
-        <w:spacing w:after="0"/>
-      </w:pPr>
-      <w:r>
-        <w:t xml:space="preserve">  - Persists selection in localStorage</w:t>
-      </w:r>
+        <w:t xml:space="preserve">  - </w:t>
+      </w:r>
+      <w:proofErr w:type="spellStart"/>
+      <w:r>
+        <w:t>EntityContext</w:t>
+      </w:r>
+      <w:proofErr w:type="spellEnd"/>
+      <w:r>
+        <w:t xml:space="preserve"> provider with </w:t>
+      </w:r>
+      <w:proofErr w:type="spellStart"/>
+      <w:proofErr w:type="gramStart"/>
+      <w:r>
+        <w:t>useEntity</w:t>
+      </w:r>
+      <w:proofErr w:type="spellEnd"/>
+      <w:r>
+        <w:t>(</w:t>
+      </w:r>
+      <w:proofErr w:type="gramEnd"/>
+      <w:r>
+        <w:t>) hook</w:t>
+      </w:r>
+    </w:p>
+    <w:p>
+      <w:pPr>
+        <w:spacing w:after="0"/>
+      </w:pPr>
+      <w:r>
+        <w:t xml:space="preserve">  - </w:t>
+      </w:r>
+      <w:proofErr w:type="spellStart"/>
+      <w:r>
+        <w:t>EntitySwitcher</w:t>
+      </w:r>
+      <w:proofErr w:type="spellEnd"/>
+      <w:r>
+        <w:t xml:space="preserve"> component in sidebar (below logo)</w:t>
+      </w:r>
+    </w:p>
+    <w:p>
+      <w:pPr>
+        <w:spacing w:after="0"/>
+      </w:pPr>
+      <w:r>
+        <w:t xml:space="preserve">  - Persists selection in </w:t>
+      </w:r>
+      <w:proofErr w:type="spellStart"/>
+      <w:r>
+        <w:t>localStorage</w:t>
+      </w:r>
+      <w:proofErr w:type="spellEnd"/>
     </w:p>
     <w:p>
       <w:pPr>
@@ -3377,15 +4489,31 @@
         <w:spacing w:after="0"/>
       </w:pPr>
       <w:r>
-        <w:t xml:space="preserve">  - Updated tursoAdmin.ts relation map for new tables</w:t>
-      </w:r>
-    </w:p>
-    <w:p>
-      <w:pPr>
-        <w:spacing w:after="0"/>
-      </w:pPr>
-      <w:r>
-        <w:t xml:space="preserve">  - Added EntityProvider to app Providers</w:t>
+        <w:t xml:space="preserve">  - Updated </w:t>
+      </w:r>
+      <w:proofErr w:type="spellStart"/>
+      <w:r>
+        <w:t>tursoAdmin.ts</w:t>
+      </w:r>
+      <w:proofErr w:type="spellEnd"/>
+      <w:r>
+        <w:t xml:space="preserve"> relation map for new tables</w:t>
+      </w:r>
+    </w:p>
+    <w:p>
+      <w:pPr>
+        <w:spacing w:after="0"/>
+      </w:pPr>
+      <w:r>
+        <w:t xml:space="preserve">  - Added </w:t>
+      </w:r>
+      <w:proofErr w:type="spellStart"/>
+      <w:r>
+        <w:t>EntityProvider</w:t>
+      </w:r>
+      <w:proofErr w:type="spellEnd"/>
+      <w:r>
+        <w:t xml:space="preserve"> to app Providers</w:t>
       </w:r>
     </w:p>
     <w:p>
@@ -3466,7 +4594,36 @@
         <w:spacing w:after="0"/>
       </w:pPr>
       <w:r>
-        <w:t xml:space="preserve">                                                                                                                        ● Bash(npx tsc --noEmit --pretty 2&gt;&amp;1 | head -10)</w:t>
+        <w:t xml:space="preserve">                                                                                                                        ● </w:t>
+      </w:r>
+      <w:proofErr w:type="gramStart"/>
+      <w:r>
+        <w:t>Bash(</w:t>
+      </w:r>
+      <w:proofErr w:type="spellStart"/>
+      <w:proofErr w:type="gramEnd"/>
+      <w:r>
+        <w:t>npx</w:t>
+      </w:r>
+      <w:proofErr w:type="spellEnd"/>
+      <w:r>
+        <w:t xml:space="preserve"> </w:t>
+      </w:r>
+      <w:proofErr w:type="spellStart"/>
+      <w:r>
+        <w:t>tsc</w:t>
+      </w:r>
+      <w:proofErr w:type="spellEnd"/>
+      <w:r>
+        <w:t xml:space="preserve"> --</w:t>
+      </w:r>
+      <w:proofErr w:type="spellStart"/>
+      <w:r>
+        <w:t>noEmit</w:t>
+      </w:r>
+      <w:proofErr w:type="spellEnd"/>
+      <w:r>
+        <w:t xml:space="preserve"> --pretty 2&gt;&amp;1 | head -10)</w:t>
       </w:r>
     </w:p>
     <w:p>
@@ -3476,6 +4633,7 @@
       <w:r>
         <w:t xml:space="preserve">  </w:t>
       </w:r>
+      <w:proofErr w:type="gramStart"/>
       <w:r>
         <w:rPr>
           <w:rFonts w:ascii="Cambria Math" w:hAnsi="Cambria Math" w:cs="Cambria Math"/>
@@ -3492,7 +4650,11 @@
         <w:t> </w:t>
       </w:r>
       <w:r>
-        <w:t>(No output)</w:t>
+        <w:t>(</w:t>
+      </w:r>
+      <w:proofErr w:type="gramEnd"/>
+      <w:r>
+        <w:t>No output)</w:t>
       </w:r>
     </w:p>
     <w:p>
@@ -3502,6 +4664,7 @@
       <w:r>
         <w:t xml:space="preserve">  </w:t>
       </w:r>
+      <w:proofErr w:type="gramStart"/>
       <w:r>
         <w:rPr>
           <w:rFonts w:ascii="Cambria Math" w:hAnsi="Cambria Math" w:cs="Cambria Math"/>
@@ -3518,7 +4681,11 @@
         <w:t> </w:t>
       </w:r>
       <w:r>
-        <w:t>(timeout 2m)</w:t>
+        <w:t>(</w:t>
+      </w:r>
+      <w:proofErr w:type="gramEnd"/>
+      <w:r>
+        <w:t>timeout 2m)</w:t>
       </w:r>
     </w:p>
     <w:p>
@@ -3660,8 +4827,29 @@
         <w:spacing w:after="0"/>
       </w:pPr>
       <w:r>
-        <w:t xml:space="preserve">  │ Migration      │ turso/migrations/006_multi_entity.sql — 5 new tables + entity_id on 11 existing tables  │</w:t>
-      </w:r>
+        <w:t xml:space="preserve">  │ Migration      │ </w:t>
+      </w:r>
+      <w:proofErr w:type="spellStart"/>
+      <w:r>
+        <w:t>turso</w:t>
+      </w:r>
+      <w:proofErr w:type="spellEnd"/>
+      <w:r>
+        <w:t xml:space="preserve">/migrations/006_multi_entity.sql — 5 new tables + </w:t>
+      </w:r>
+      <w:proofErr w:type="spellStart"/>
+      <w:r>
+        <w:t>entity_id</w:t>
+      </w:r>
+      <w:proofErr w:type="spellEnd"/>
+      <w:r>
+        <w:t xml:space="preserve"> on 11 existing </w:t>
+      </w:r>
+      <w:proofErr w:type="gramStart"/>
+      <w:r>
+        <w:t>tables  │</w:t>
+      </w:r>
+      <w:proofErr w:type="gramEnd"/>
     </w:p>
     <w:p>
       <w:pPr>
@@ -3752,7 +4940,36 @@
         <w:spacing w:after="0"/>
       </w:pPr>
       <w:r>
-        <w:t xml:space="preserve">  │ Context        │ EntityContext.tsx — provider + useEntity() hook with localStorage persistence           │</w:t>
+        <w:t xml:space="preserve">  │ Context        │ </w:t>
+      </w:r>
+      <w:proofErr w:type="spellStart"/>
+      <w:r>
+        <w:t>EntityContext.tsx</w:t>
+      </w:r>
+      <w:proofErr w:type="spellEnd"/>
+      <w:r>
+        <w:t xml:space="preserve"> — provider + </w:t>
+      </w:r>
+      <w:proofErr w:type="spellStart"/>
+      <w:proofErr w:type="gramStart"/>
+      <w:r>
+        <w:t>useEntity</w:t>
+      </w:r>
+      <w:proofErr w:type="spellEnd"/>
+      <w:r>
+        <w:t>(</w:t>
+      </w:r>
+      <w:proofErr w:type="gramEnd"/>
+      <w:r>
+        <w:t xml:space="preserve">) hook with </w:t>
+      </w:r>
+      <w:proofErr w:type="spellStart"/>
+      <w:r>
+        <w:t>localStorage</w:t>
+      </w:r>
+      <w:proofErr w:type="spellEnd"/>
+      <w:r>
+        <w:t xml:space="preserve"> persistence           │</w:t>
       </w:r>
     </w:p>
     <w:p>
@@ -3798,7 +5015,15 @@
         <w:spacing w:after="0"/>
       </w:pPr>
       <w:r>
-        <w:t xml:space="preserve">  │ Sidebar        │ EntitySwitcher.tsx — dropdown below logo, "All Entities" consolidated view              │</w:t>
+        <w:t xml:space="preserve">  │ Sidebar        │ </w:t>
+      </w:r>
+      <w:proofErr w:type="spellStart"/>
+      <w:r>
+        <w:t>EntitySwitcher.tsx</w:t>
+      </w:r>
+      <w:proofErr w:type="spellEnd"/>
+      <w:r>
+        <w:t xml:space="preserve"> — dropdown below logo, "All Entities" consolidated view              │</w:t>
       </w:r>
     </w:p>
     <w:p>
@@ -3890,7 +5115,31 @@
         <w:spacing w:after="0"/>
       </w:pPr>
       <w:r>
-        <w:t xml:space="preserve">  │ Infrastructure │ Updated tursoAdmin.ts relation map, Providers.tsx, DashboardLayout.tsx, reports listing │</w:t>
+        <w:t xml:space="preserve">  │ Infrastructure │ Updated </w:t>
+      </w:r>
+      <w:proofErr w:type="spellStart"/>
+      <w:r>
+        <w:t>tursoAdmin.ts</w:t>
+      </w:r>
+      <w:proofErr w:type="spellEnd"/>
+      <w:r>
+        <w:t xml:space="preserve"> relation map, </w:t>
+      </w:r>
+      <w:proofErr w:type="spellStart"/>
+      <w:r>
+        <w:t>Providers.tsx</w:t>
+      </w:r>
+      <w:proofErr w:type="spellEnd"/>
+      <w:r>
+        <w:t xml:space="preserve">, </w:t>
+      </w:r>
+      <w:proofErr w:type="spellStart"/>
+      <w:r>
+        <w:t>DashboardLayout.tsx</w:t>
+      </w:r>
+      <w:proofErr w:type="spellEnd"/>
+      <w:r>
+        <w:t>, reports listing │</w:t>
       </w:r>
     </w:p>
     <w:p>
@@ -3954,7 +5203,15 @@
         <w:t xml:space="preserve">, </w:t>
       </w:r>
       <w:r>
-        <w:t>4.1 Database Schema (turso/migrations/006_multi_entity.sql)</w:t>
+        <w:t>4.1 Database Schema (</w:t>
+      </w:r>
+      <w:proofErr w:type="spellStart"/>
+      <w:r>
+        <w:t>turso</w:t>
+      </w:r>
+      <w:proofErr w:type="spellEnd"/>
+      <w:r>
+        <w:t>/migrations/006_multi_entity.sql)</w:t>
       </w:r>
       <w:r>
         <w:t xml:space="preserve">, </w:t>
@@ -3972,13 +5229,21 @@
         <w:t xml:space="preserve">, </w:t>
       </w:r>
       <w:r>
-        <w:t>4.4 Entity Switcher UI</w:t>
+        <w:t xml:space="preserve">4.4 Entity Switcher </w:t>
+      </w:r>
+      <w:proofErr w:type="gramStart"/>
+      <w:r>
+        <w:t>UI</w:t>
       </w:r>
       <w:r>
         <w:t xml:space="preserve">, </w:t>
       </w:r>
       <w:r>
-        <w:t xml:space="preserve">  4.5 Management Pages</w:t>
+        <w:t xml:space="preserve">  </w:t>
+      </w:r>
+      <w:proofErr w:type="gramEnd"/>
+      <w:r>
+        <w:t>4.5 Management Pages</w:t>
       </w:r>
       <w:r>
         <w:t xml:space="preserve">, </w:t>

</xml_diff>